<commit_message>
doc: Atualização para nova regra de negocio, contato para serviços urgentes - Casos de usos _ Diagrama entidade relacionamento: adicionado uma nova entidade urgencia - atualização dos slides
</commit_message>
<xml_diff>
--- a/docs/ApêndiceB-Requisitos/PID_RequisitosFuncionais.docx
+++ b/docs/ApêndiceB-Requisitos/PID_RequisitosFuncionais.docx
@@ -613,7 +613,25 @@
           <w:sz w:val="24"/>
           <w:szCs w:val="24"/>
         </w:rPr>
-        <w:t xml:space="preserve"> (X) essencial ( ) importante ( ) desejável</w:t>
+        <w:t xml:space="preserve"> (X) essencial </w:t>
+      </w:r>
+      <w:proofErr w:type="gramStart"/>
+      <w:r>
+        <w:rPr>
+          <w:rFonts w:ascii="Times New Roman" w:eastAsia="Times New Roman" w:hAnsi="Times New Roman" w:cs="Times New Roman"/>
+          <w:sz w:val="24"/>
+          <w:szCs w:val="24"/>
+        </w:rPr>
+        <w:t>( )</w:t>
+      </w:r>
+      <w:proofErr w:type="gramEnd"/>
+      <w:r>
+        <w:rPr>
+          <w:rFonts w:ascii="Times New Roman" w:eastAsia="Times New Roman" w:hAnsi="Times New Roman" w:cs="Times New Roman"/>
+          <w:sz w:val="24"/>
+          <w:szCs w:val="24"/>
+        </w:rPr>
+        <w:t xml:space="preserve"> importante ( ) desejável</w:t>
       </w:r>
     </w:p>
     <w:p>
@@ -941,7 +959,25 @@
           <w:sz w:val="24"/>
           <w:szCs w:val="24"/>
         </w:rPr>
-        <w:t xml:space="preserve"> (X) essencial ( ) importante ( ) desejável</w:t>
+        <w:t xml:space="preserve"> (X) essencial </w:t>
+      </w:r>
+      <w:proofErr w:type="gramStart"/>
+      <w:r>
+        <w:rPr>
+          <w:rFonts w:ascii="Times New Roman" w:eastAsia="Times New Roman" w:hAnsi="Times New Roman" w:cs="Times New Roman"/>
+          <w:sz w:val="24"/>
+          <w:szCs w:val="24"/>
+        </w:rPr>
+        <w:t>( )</w:t>
+      </w:r>
+      <w:proofErr w:type="gramEnd"/>
+      <w:r>
+        <w:rPr>
+          <w:rFonts w:ascii="Times New Roman" w:eastAsia="Times New Roman" w:hAnsi="Times New Roman" w:cs="Times New Roman"/>
+          <w:sz w:val="24"/>
+          <w:szCs w:val="24"/>
+        </w:rPr>
+        <w:t xml:space="preserve"> importante ( ) desejável</w:t>
       </w:r>
     </w:p>
     <w:p>
@@ -1268,7 +1304,25 @@
           <w:sz w:val="24"/>
           <w:szCs w:val="24"/>
         </w:rPr>
-        <w:t xml:space="preserve"> (X) essencial ( ) importante ( ) desejável</w:t>
+        <w:t xml:space="preserve"> (X) essencial </w:t>
+      </w:r>
+      <w:proofErr w:type="gramStart"/>
+      <w:r>
+        <w:rPr>
+          <w:rFonts w:ascii="Times New Roman" w:eastAsia="Times New Roman" w:hAnsi="Times New Roman" w:cs="Times New Roman"/>
+          <w:sz w:val="24"/>
+          <w:szCs w:val="24"/>
+        </w:rPr>
+        <w:t>( )</w:t>
+      </w:r>
+      <w:proofErr w:type="gramEnd"/>
+      <w:r>
+        <w:rPr>
+          <w:rFonts w:ascii="Times New Roman" w:eastAsia="Times New Roman" w:hAnsi="Times New Roman" w:cs="Times New Roman"/>
+          <w:sz w:val="24"/>
+          <w:szCs w:val="24"/>
+        </w:rPr>
+        <w:t xml:space="preserve"> importante ( ) desejável</w:t>
       </w:r>
     </w:p>
     <w:p>
@@ -1529,7 +1583,25 @@
           <w:sz w:val="24"/>
           <w:szCs w:val="24"/>
         </w:rPr>
-        <w:t xml:space="preserve"> (X) essencial ( ) importante ( ) desejável</w:t>
+        <w:t xml:space="preserve"> (X) essencial </w:t>
+      </w:r>
+      <w:proofErr w:type="gramStart"/>
+      <w:r>
+        <w:rPr>
+          <w:rFonts w:ascii="Times New Roman" w:eastAsia="Times New Roman" w:hAnsi="Times New Roman" w:cs="Times New Roman"/>
+          <w:sz w:val="24"/>
+          <w:szCs w:val="24"/>
+        </w:rPr>
+        <w:t>( )</w:t>
+      </w:r>
+      <w:proofErr w:type="gramEnd"/>
+      <w:r>
+        <w:rPr>
+          <w:rFonts w:ascii="Times New Roman" w:eastAsia="Times New Roman" w:hAnsi="Times New Roman" w:cs="Times New Roman"/>
+          <w:sz w:val="24"/>
+          <w:szCs w:val="24"/>
+        </w:rPr>
+        <w:t xml:space="preserve"> importante ( ) desejável</w:t>
       </w:r>
     </w:p>
     <w:p>
@@ -1820,7 +1892,25 @@
           <w:sz w:val="24"/>
           <w:szCs w:val="24"/>
         </w:rPr>
-        <w:t xml:space="preserve"> (X) essencial ( ) importante ( ) desejável</w:t>
+        <w:t xml:space="preserve"> (X) essencial </w:t>
+      </w:r>
+      <w:proofErr w:type="gramStart"/>
+      <w:r>
+        <w:rPr>
+          <w:rFonts w:ascii="Times New Roman" w:eastAsia="Times New Roman" w:hAnsi="Times New Roman" w:cs="Times New Roman"/>
+          <w:sz w:val="24"/>
+          <w:szCs w:val="24"/>
+        </w:rPr>
+        <w:t>( )</w:t>
+      </w:r>
+      <w:proofErr w:type="gramEnd"/>
+      <w:r>
+        <w:rPr>
+          <w:rFonts w:ascii="Times New Roman" w:eastAsia="Times New Roman" w:hAnsi="Times New Roman" w:cs="Times New Roman"/>
+          <w:sz w:val="24"/>
+          <w:szCs w:val="24"/>
+        </w:rPr>
+        <w:t xml:space="preserve"> importante ( ) desejável</w:t>
       </w:r>
     </w:p>
     <w:p>
@@ -2042,7 +2132,25 @@
           <w:sz w:val="24"/>
           <w:szCs w:val="24"/>
         </w:rPr>
-        <w:t xml:space="preserve"> (X) essencial ( ) importante ( ) desejável</w:t>
+        <w:t xml:space="preserve"> (X) essencial </w:t>
+      </w:r>
+      <w:proofErr w:type="gramStart"/>
+      <w:r>
+        <w:rPr>
+          <w:rFonts w:ascii="Times New Roman" w:eastAsia="Times New Roman" w:hAnsi="Times New Roman" w:cs="Times New Roman"/>
+          <w:sz w:val="24"/>
+          <w:szCs w:val="24"/>
+        </w:rPr>
+        <w:t>( )</w:t>
+      </w:r>
+      <w:proofErr w:type="gramEnd"/>
+      <w:r>
+        <w:rPr>
+          <w:rFonts w:ascii="Times New Roman" w:eastAsia="Times New Roman" w:hAnsi="Times New Roman" w:cs="Times New Roman"/>
+          <w:sz w:val="24"/>
+          <w:szCs w:val="24"/>
+        </w:rPr>
+        <w:t xml:space="preserve"> importante ( ) desejável</w:t>
       </w:r>
     </w:p>
     <w:p>
@@ -2397,7 +2505,25 @@
           <w:sz w:val="24"/>
           <w:szCs w:val="24"/>
         </w:rPr>
-        <w:t xml:space="preserve"> (X) essencial ( ) importante ( ) desejável</w:t>
+        <w:t xml:space="preserve"> (X) essencial </w:t>
+      </w:r>
+      <w:proofErr w:type="gramStart"/>
+      <w:r>
+        <w:rPr>
+          <w:rFonts w:ascii="Times New Roman" w:eastAsia="Times New Roman" w:hAnsi="Times New Roman" w:cs="Times New Roman"/>
+          <w:sz w:val="24"/>
+          <w:szCs w:val="24"/>
+        </w:rPr>
+        <w:t>( )</w:t>
+      </w:r>
+      <w:proofErr w:type="gramEnd"/>
+      <w:r>
+        <w:rPr>
+          <w:rFonts w:ascii="Times New Roman" w:eastAsia="Times New Roman" w:hAnsi="Times New Roman" w:cs="Times New Roman"/>
+          <w:sz w:val="24"/>
+          <w:szCs w:val="24"/>
+        </w:rPr>
+        <w:t xml:space="preserve"> importante ( ) desejável</w:t>
       </w:r>
     </w:p>
     <w:p>
@@ -2633,7 +2759,25 @@
           <w:sz w:val="24"/>
           <w:szCs w:val="24"/>
         </w:rPr>
-        <w:t xml:space="preserve"> (X) essencial ( ) importante ( ) desejável</w:t>
+        <w:t xml:space="preserve"> (X) essencial </w:t>
+      </w:r>
+      <w:proofErr w:type="gramStart"/>
+      <w:r>
+        <w:rPr>
+          <w:rFonts w:ascii="Times New Roman" w:eastAsia="Times New Roman" w:hAnsi="Times New Roman" w:cs="Times New Roman"/>
+          <w:sz w:val="24"/>
+          <w:szCs w:val="24"/>
+        </w:rPr>
+        <w:t>( )</w:t>
+      </w:r>
+      <w:proofErr w:type="gramEnd"/>
+      <w:r>
+        <w:rPr>
+          <w:rFonts w:ascii="Times New Roman" w:eastAsia="Times New Roman" w:hAnsi="Times New Roman" w:cs="Times New Roman"/>
+          <w:sz w:val="24"/>
+          <w:szCs w:val="24"/>
+        </w:rPr>
+        <w:t xml:space="preserve"> importante ( ) desejável</w:t>
       </w:r>
     </w:p>
     <w:p>
@@ -2924,7 +3068,25 @@
           <w:sz w:val="24"/>
           <w:szCs w:val="24"/>
         </w:rPr>
-        <w:t xml:space="preserve"> ( ) essencial (X) importante ( ) desejável</w:t>
+        <w:t xml:space="preserve"> </w:t>
+      </w:r>
+      <w:proofErr w:type="gramStart"/>
+      <w:r>
+        <w:rPr>
+          <w:rFonts w:ascii="Times New Roman" w:eastAsia="Times New Roman" w:hAnsi="Times New Roman" w:cs="Times New Roman"/>
+          <w:sz w:val="24"/>
+          <w:szCs w:val="24"/>
+        </w:rPr>
+        <w:t>( )</w:t>
+      </w:r>
+      <w:proofErr w:type="gramEnd"/>
+      <w:r>
+        <w:rPr>
+          <w:rFonts w:ascii="Times New Roman" w:eastAsia="Times New Roman" w:hAnsi="Times New Roman" w:cs="Times New Roman"/>
+          <w:sz w:val="24"/>
+          <w:szCs w:val="24"/>
+        </w:rPr>
+        <w:t xml:space="preserve"> essencial (X) importante ( ) desejável</w:t>
       </w:r>
     </w:p>
     <w:p>
@@ -3192,8 +3354,939 @@
           <w:sz w:val="24"/>
           <w:szCs w:val="24"/>
         </w:rPr>
-        <w:t xml:space="preserve"> ( ) essencial (X) importante ( ) desejável</w:t>
-      </w:r>
+        <w:t xml:space="preserve"> </w:t>
+      </w:r>
+      <w:proofErr w:type="gramStart"/>
+      <w:r>
+        <w:rPr>
+          <w:rFonts w:ascii="Times New Roman" w:eastAsia="Times New Roman" w:hAnsi="Times New Roman" w:cs="Times New Roman"/>
+          <w:sz w:val="24"/>
+          <w:szCs w:val="24"/>
+        </w:rPr>
+        <w:t>( )</w:t>
+      </w:r>
+      <w:proofErr w:type="gramEnd"/>
+      <w:r>
+        <w:rPr>
+          <w:rFonts w:ascii="Times New Roman" w:eastAsia="Times New Roman" w:hAnsi="Times New Roman" w:cs="Times New Roman"/>
+          <w:sz w:val="24"/>
+          <w:szCs w:val="24"/>
+        </w:rPr>
+        <w:t xml:space="preserve"> essencial (X) importante ( ) desejável</w:t>
+      </w:r>
+    </w:p>
+    <w:p>
+      <w:pPr>
+        <w:spacing w:before="240" w:after="240"/>
+        <w:rPr>
+          <w:rFonts w:ascii="Times New Roman" w:eastAsia="Times New Roman" w:hAnsi="Times New Roman" w:cs="Times New Roman"/>
+          <w:b/>
+          <w:bCs/>
+          <w:sz w:val="24"/>
+          <w:szCs w:val="24"/>
+        </w:rPr>
+      </w:pPr>
+      <w:r>
+        <w:rPr>
+          <w:rFonts w:ascii="Times New Roman" w:eastAsia="Times New Roman" w:hAnsi="Times New Roman" w:cs="Times New Roman"/>
+          <w:sz w:val="24"/>
+          <w:szCs w:val="24"/>
+        </w:rPr>
+        <w:lastRenderedPageBreak/>
+        <w:br/>
+      </w:r>
+      <w:r>
+        <w:rPr>
+          <w:rFonts w:ascii="Times New Roman" w:eastAsia="Times New Roman" w:hAnsi="Times New Roman" w:cs="Times New Roman"/>
+          <w:sz w:val="24"/>
+          <w:szCs w:val="24"/>
+        </w:rPr>
+        <w:br/>
+      </w:r>
+      <w:r>
+        <w:rPr>
+          <w:rFonts w:ascii="Times New Roman" w:eastAsia="Times New Roman" w:hAnsi="Times New Roman" w:cs="Times New Roman"/>
+          <w:b/>
+          <w:bCs/>
+          <w:sz w:val="24"/>
+          <w:szCs w:val="24"/>
+        </w:rPr>
+        <w:t>RF 11 – Configurar Modo Urgente</w:t>
+      </w:r>
+    </w:p>
+    <w:p>
+      <w:pPr>
+        <w:spacing w:before="240" w:after="240"/>
+        <w:rPr>
+          <w:rFonts w:ascii="Times New Roman" w:eastAsia="Times New Roman" w:hAnsi="Times New Roman" w:cs="Times New Roman"/>
+          <w:sz w:val="24"/>
+          <w:szCs w:val="24"/>
+        </w:rPr>
+      </w:pPr>
+      <w:r>
+        <w:rPr>
+          <w:rFonts w:ascii="Times New Roman" w:eastAsia="Times New Roman" w:hAnsi="Times New Roman" w:cs="Times New Roman"/>
+          <w:sz w:val="24"/>
+          <w:szCs w:val="24"/>
+        </w:rPr>
+        <w:t>Descrição: O sistema deve permitir que usuários prestadores ativem ou desativem o Modo Urgente e definam sua disponibilidade para atendimentos emergenciais.</w:t>
+      </w:r>
+    </w:p>
+    <w:p>
+      <w:pPr>
+        <w:spacing w:before="240" w:after="240"/>
+        <w:rPr>
+          <w:rFonts w:ascii="Times New Roman" w:eastAsia="Times New Roman" w:hAnsi="Times New Roman" w:cs="Times New Roman"/>
+          <w:sz w:val="24"/>
+          <w:szCs w:val="24"/>
+        </w:rPr>
+      </w:pPr>
+      <w:r>
+        <w:rPr>
+          <w:rFonts w:ascii="Times New Roman" w:eastAsia="Times New Roman" w:hAnsi="Times New Roman" w:cs="Times New Roman"/>
+          <w:sz w:val="24"/>
+          <w:szCs w:val="24"/>
+        </w:rPr>
+        <w:t>Dados utilizados:</w:t>
+      </w:r>
+    </w:p>
+    <w:p>
+      <w:pPr>
+        <w:numPr>
+          <w:ilvl w:val="0"/>
+          <w:numId w:val="40"/>
+        </w:numPr>
+        <w:spacing w:before="240" w:after="240"/>
+        <w:rPr>
+          <w:rFonts w:ascii="Times New Roman" w:eastAsia="Times New Roman" w:hAnsi="Times New Roman" w:cs="Times New Roman"/>
+          <w:sz w:val="24"/>
+          <w:szCs w:val="24"/>
+        </w:rPr>
+      </w:pPr>
+      <w:r>
+        <w:rPr>
+          <w:rFonts w:ascii="Times New Roman" w:eastAsia="Times New Roman" w:hAnsi="Times New Roman" w:cs="Times New Roman"/>
+          <w:sz w:val="24"/>
+          <w:szCs w:val="24"/>
+        </w:rPr>
+        <w:t>Status do modo urgente (ativado/desativado)</w:t>
+      </w:r>
+    </w:p>
+    <w:p>
+      <w:pPr>
+        <w:numPr>
+          <w:ilvl w:val="0"/>
+          <w:numId w:val="40"/>
+        </w:numPr>
+        <w:spacing w:before="240" w:after="240"/>
+        <w:rPr>
+          <w:rFonts w:ascii="Times New Roman" w:eastAsia="Times New Roman" w:hAnsi="Times New Roman" w:cs="Times New Roman"/>
+          <w:sz w:val="24"/>
+          <w:szCs w:val="24"/>
+        </w:rPr>
+      </w:pPr>
+      <w:r>
+        <w:rPr>
+          <w:rFonts w:ascii="Times New Roman" w:eastAsia="Times New Roman" w:hAnsi="Times New Roman" w:cs="Times New Roman"/>
+          <w:sz w:val="24"/>
+          <w:szCs w:val="24"/>
+        </w:rPr>
+        <w:t>Dias disponíveis</w:t>
+      </w:r>
+    </w:p>
+    <w:p>
+      <w:pPr>
+        <w:numPr>
+          <w:ilvl w:val="0"/>
+          <w:numId w:val="40"/>
+        </w:numPr>
+        <w:spacing w:before="240" w:after="240"/>
+        <w:rPr>
+          <w:rFonts w:ascii="Times New Roman" w:eastAsia="Times New Roman" w:hAnsi="Times New Roman" w:cs="Times New Roman"/>
+          <w:sz w:val="24"/>
+          <w:szCs w:val="24"/>
+        </w:rPr>
+      </w:pPr>
+      <w:r>
+        <w:rPr>
+          <w:rFonts w:ascii="Times New Roman" w:eastAsia="Times New Roman" w:hAnsi="Times New Roman" w:cs="Times New Roman"/>
+          <w:sz w:val="24"/>
+          <w:szCs w:val="24"/>
+        </w:rPr>
+        <w:t>Horários disponíveis</w:t>
+      </w:r>
+    </w:p>
+    <w:p>
+      <w:pPr>
+        <w:numPr>
+          <w:ilvl w:val="0"/>
+          <w:numId w:val="40"/>
+        </w:numPr>
+        <w:spacing w:before="240" w:after="240"/>
+        <w:rPr>
+          <w:rFonts w:ascii="Times New Roman" w:eastAsia="Times New Roman" w:hAnsi="Times New Roman" w:cs="Times New Roman"/>
+          <w:sz w:val="24"/>
+          <w:szCs w:val="24"/>
+        </w:rPr>
+      </w:pPr>
+      <w:r>
+        <w:rPr>
+          <w:rFonts w:ascii="Times New Roman" w:eastAsia="Times New Roman" w:hAnsi="Times New Roman" w:cs="Times New Roman"/>
+          <w:sz w:val="24"/>
+          <w:szCs w:val="24"/>
+        </w:rPr>
+        <w:t>Taxa mínima de urgência</w:t>
+      </w:r>
+    </w:p>
+    <w:p>
+      <w:pPr>
+        <w:numPr>
+          <w:ilvl w:val="0"/>
+          <w:numId w:val="40"/>
+        </w:numPr>
+        <w:spacing w:before="240" w:after="240"/>
+        <w:rPr>
+          <w:rFonts w:ascii="Times New Roman" w:eastAsia="Times New Roman" w:hAnsi="Times New Roman" w:cs="Times New Roman"/>
+          <w:sz w:val="24"/>
+          <w:szCs w:val="24"/>
+        </w:rPr>
+      </w:pPr>
+      <w:r>
+        <w:rPr>
+          <w:rFonts w:ascii="Times New Roman" w:eastAsia="Times New Roman" w:hAnsi="Times New Roman" w:cs="Times New Roman"/>
+          <w:sz w:val="24"/>
+          <w:szCs w:val="24"/>
+        </w:rPr>
+        <w:t>Valor de visita</w:t>
+      </w:r>
+      <w:r>
+        <w:rPr>
+          <w:rFonts w:ascii="Times New Roman" w:eastAsia="Times New Roman" w:hAnsi="Times New Roman" w:cs="Times New Roman"/>
+          <w:sz w:val="24"/>
+          <w:szCs w:val="24"/>
+        </w:rPr>
+        <w:t xml:space="preserve"> aproximado</w:t>
+      </w:r>
+    </w:p>
+    <w:p>
+      <w:pPr>
+        <w:numPr>
+          <w:ilvl w:val="0"/>
+          <w:numId w:val="40"/>
+        </w:numPr>
+        <w:spacing w:before="240" w:after="240"/>
+        <w:rPr>
+          <w:rFonts w:ascii="Times New Roman" w:eastAsia="Times New Roman" w:hAnsi="Times New Roman" w:cs="Times New Roman"/>
+          <w:sz w:val="24"/>
+          <w:szCs w:val="24"/>
+        </w:rPr>
+      </w:pPr>
+      <w:r>
+        <w:rPr>
+          <w:rFonts w:ascii="Times New Roman" w:eastAsia="Times New Roman" w:hAnsi="Times New Roman" w:cs="Times New Roman"/>
+          <w:sz w:val="24"/>
+          <w:szCs w:val="24"/>
+        </w:rPr>
+        <w:t>Canais de notificação permitidos</w:t>
+      </w:r>
+    </w:p>
+    <w:p>
+      <w:pPr>
+        <w:spacing w:before="240" w:after="240"/>
+        <w:rPr>
+          <w:rFonts w:ascii="Times New Roman" w:eastAsia="Times New Roman" w:hAnsi="Times New Roman" w:cs="Times New Roman"/>
+          <w:sz w:val="24"/>
+          <w:szCs w:val="24"/>
+          <w:u w:val="single"/>
+        </w:rPr>
+      </w:pPr>
+      <w:r>
+        <w:rPr>
+          <w:rFonts w:ascii="Times New Roman" w:eastAsia="Times New Roman" w:hAnsi="Times New Roman" w:cs="Times New Roman"/>
+          <w:sz w:val="24"/>
+          <w:szCs w:val="24"/>
+        </w:rPr>
+        <w:t>Restrições:</w:t>
+      </w:r>
+    </w:p>
+    <w:p>
+      <w:pPr>
+        <w:numPr>
+          <w:ilvl w:val="0"/>
+          <w:numId w:val="41"/>
+        </w:numPr>
+        <w:spacing w:before="240" w:after="240"/>
+        <w:rPr>
+          <w:rFonts w:ascii="Times New Roman" w:eastAsia="Times New Roman" w:hAnsi="Times New Roman" w:cs="Times New Roman"/>
+          <w:sz w:val="24"/>
+          <w:szCs w:val="24"/>
+        </w:rPr>
+      </w:pPr>
+      <w:r>
+        <w:rPr>
+          <w:rFonts w:ascii="Times New Roman" w:eastAsia="Times New Roman" w:hAnsi="Times New Roman" w:cs="Times New Roman"/>
+          <w:sz w:val="24"/>
+          <w:szCs w:val="24"/>
+        </w:rPr>
+        <w:t>Usuário deve estar autenticado</w:t>
+      </w:r>
+    </w:p>
+    <w:p>
+      <w:pPr>
+        <w:numPr>
+          <w:ilvl w:val="0"/>
+          <w:numId w:val="41"/>
+        </w:numPr>
+        <w:spacing w:before="240" w:after="240"/>
+        <w:rPr>
+          <w:rFonts w:ascii="Times New Roman" w:eastAsia="Times New Roman" w:hAnsi="Times New Roman" w:cs="Times New Roman"/>
+          <w:sz w:val="24"/>
+          <w:szCs w:val="24"/>
+        </w:rPr>
+      </w:pPr>
+      <w:r>
+        <w:rPr>
+          <w:rFonts w:ascii="Times New Roman" w:eastAsia="Times New Roman" w:hAnsi="Times New Roman" w:cs="Times New Roman"/>
+          <w:sz w:val="24"/>
+          <w:szCs w:val="24"/>
+        </w:rPr>
+        <w:t>Usuário deve possuir ao menos uma profissão cadastrada</w:t>
+      </w:r>
+    </w:p>
+    <w:p>
+      <w:pPr>
+        <w:numPr>
+          <w:ilvl w:val="0"/>
+          <w:numId w:val="41"/>
+        </w:numPr>
+        <w:spacing w:before="240" w:after="240"/>
+        <w:rPr>
+          <w:rFonts w:ascii="Times New Roman" w:eastAsia="Times New Roman" w:hAnsi="Times New Roman" w:cs="Times New Roman"/>
+          <w:sz w:val="24"/>
+          <w:szCs w:val="24"/>
+        </w:rPr>
+      </w:pPr>
+      <w:r>
+        <w:rPr>
+          <w:rFonts w:ascii="Times New Roman" w:eastAsia="Times New Roman" w:hAnsi="Times New Roman" w:cs="Times New Roman"/>
+          <w:sz w:val="24"/>
+          <w:szCs w:val="24"/>
+        </w:rPr>
+        <w:t>Horários de disponibilidade devem ser válidos</w:t>
+      </w:r>
+    </w:p>
+    <w:p>
+      <w:pPr>
+        <w:spacing w:before="240" w:after="240"/>
+        <w:rPr>
+          <w:rFonts w:ascii="Times New Roman" w:eastAsia="Times New Roman" w:hAnsi="Times New Roman" w:cs="Times New Roman"/>
+          <w:sz w:val="24"/>
+          <w:szCs w:val="24"/>
+        </w:rPr>
+      </w:pPr>
+      <w:r>
+        <w:rPr>
+          <w:rFonts w:ascii="Times New Roman" w:eastAsia="Times New Roman" w:hAnsi="Times New Roman" w:cs="Times New Roman"/>
+          <w:sz w:val="24"/>
+          <w:szCs w:val="24"/>
+        </w:rPr>
+        <w:t>Exceções:</w:t>
+      </w:r>
+    </w:p>
+    <w:p>
+      <w:pPr>
+        <w:numPr>
+          <w:ilvl w:val="0"/>
+          <w:numId w:val="42"/>
+        </w:numPr>
+        <w:spacing w:before="240" w:after="240"/>
+        <w:rPr>
+          <w:rFonts w:ascii="Times New Roman" w:eastAsia="Times New Roman" w:hAnsi="Times New Roman" w:cs="Times New Roman"/>
+          <w:sz w:val="24"/>
+          <w:szCs w:val="24"/>
+        </w:rPr>
+      </w:pPr>
+      <w:r>
+        <w:rPr>
+          <w:rFonts w:ascii="Times New Roman" w:eastAsia="Times New Roman" w:hAnsi="Times New Roman" w:cs="Times New Roman"/>
+          <w:sz w:val="24"/>
+          <w:szCs w:val="24"/>
+        </w:rPr>
+        <w:t>Profissão não cadastrada</w:t>
+      </w:r>
+    </w:p>
+    <w:p>
+      <w:pPr>
+        <w:numPr>
+          <w:ilvl w:val="0"/>
+          <w:numId w:val="42"/>
+        </w:numPr>
+        <w:spacing w:before="240" w:after="240"/>
+        <w:rPr>
+          <w:rFonts w:ascii="Times New Roman" w:eastAsia="Times New Roman" w:hAnsi="Times New Roman" w:cs="Times New Roman"/>
+          <w:sz w:val="24"/>
+          <w:szCs w:val="24"/>
+        </w:rPr>
+      </w:pPr>
+      <w:r>
+        <w:rPr>
+          <w:rFonts w:ascii="Times New Roman" w:eastAsia="Times New Roman" w:hAnsi="Times New Roman" w:cs="Times New Roman"/>
+          <w:sz w:val="24"/>
+          <w:szCs w:val="24"/>
+        </w:rPr>
+        <w:t>Horários inválidos</w:t>
+      </w:r>
+    </w:p>
+    <w:p>
+      <w:pPr>
+        <w:spacing w:before="240" w:after="240"/>
+        <w:rPr>
+          <w:rFonts w:ascii="Times New Roman" w:eastAsia="Times New Roman" w:hAnsi="Times New Roman" w:cs="Times New Roman"/>
+          <w:sz w:val="24"/>
+          <w:szCs w:val="24"/>
+        </w:rPr>
+      </w:pPr>
+      <w:r>
+        <w:rPr>
+          <w:rFonts w:ascii="Times New Roman" w:eastAsia="Times New Roman" w:hAnsi="Times New Roman" w:cs="Times New Roman"/>
+          <w:sz w:val="24"/>
+          <w:szCs w:val="24"/>
+        </w:rPr>
+        <w:t>Saída:</w:t>
+      </w:r>
+    </w:p>
+    <w:p>
+      <w:pPr>
+        <w:numPr>
+          <w:ilvl w:val="0"/>
+          <w:numId w:val="43"/>
+        </w:numPr>
+        <w:spacing w:before="240" w:after="240"/>
+        <w:rPr>
+          <w:rFonts w:ascii="Times New Roman" w:eastAsia="Times New Roman" w:hAnsi="Times New Roman" w:cs="Times New Roman"/>
+          <w:sz w:val="24"/>
+          <w:szCs w:val="24"/>
+        </w:rPr>
+      </w:pPr>
+      <w:r>
+        <w:rPr>
+          <w:rFonts w:ascii="Times New Roman" w:eastAsia="Times New Roman" w:hAnsi="Times New Roman" w:cs="Times New Roman"/>
+          <w:sz w:val="24"/>
+          <w:szCs w:val="24"/>
+        </w:rPr>
+        <w:t>Configuração do modo urgente salva com sucesso</w:t>
+      </w:r>
+    </w:p>
+    <w:p>
+      <w:pPr>
+        <w:numPr>
+          <w:ilvl w:val="0"/>
+          <w:numId w:val="43"/>
+        </w:numPr>
+        <w:spacing w:before="240" w:after="240"/>
+        <w:rPr>
+          <w:rFonts w:ascii="Times New Roman" w:eastAsia="Times New Roman" w:hAnsi="Times New Roman" w:cs="Times New Roman"/>
+          <w:sz w:val="24"/>
+          <w:szCs w:val="24"/>
+        </w:rPr>
+      </w:pPr>
+      <w:r>
+        <w:rPr>
+          <w:rFonts w:ascii="Times New Roman" w:eastAsia="Times New Roman" w:hAnsi="Times New Roman" w:cs="Times New Roman"/>
+          <w:sz w:val="24"/>
+          <w:szCs w:val="24"/>
+        </w:rPr>
+        <w:t>Mensagem de erro em caso de falha</w:t>
+      </w:r>
+    </w:p>
+    <w:p>
+      <w:pPr>
+        <w:spacing w:before="240" w:after="240"/>
+        <w:rPr>
+          <w:rFonts w:ascii="Times New Roman" w:eastAsia="Times New Roman" w:hAnsi="Times New Roman" w:cs="Times New Roman"/>
+          <w:sz w:val="24"/>
+          <w:szCs w:val="24"/>
+        </w:rPr>
+      </w:pPr>
+      <w:r>
+        <w:rPr>
+          <w:rFonts w:ascii="Times New Roman" w:eastAsia="Times New Roman" w:hAnsi="Times New Roman" w:cs="Times New Roman"/>
+          <w:sz w:val="24"/>
+          <w:szCs w:val="24"/>
+        </w:rPr>
+        <w:t xml:space="preserve">Prioridade: </w:t>
+      </w:r>
+      <w:proofErr w:type="gramStart"/>
+      <w:r>
+        <w:rPr>
+          <w:rFonts w:ascii="Times New Roman" w:eastAsia="Times New Roman" w:hAnsi="Times New Roman" w:cs="Times New Roman"/>
+          <w:sz w:val="24"/>
+          <w:szCs w:val="24"/>
+        </w:rPr>
+        <w:t>( )</w:t>
+      </w:r>
+      <w:proofErr w:type="gramEnd"/>
+      <w:r>
+        <w:rPr>
+          <w:rFonts w:ascii="Times New Roman" w:eastAsia="Times New Roman" w:hAnsi="Times New Roman" w:cs="Times New Roman"/>
+          <w:sz w:val="24"/>
+          <w:szCs w:val="24"/>
+        </w:rPr>
+        <w:t xml:space="preserve"> essencial (X) importante ( ) desejável</w:t>
+      </w:r>
+    </w:p>
+    <w:p>
+      <w:pPr>
+        <w:spacing w:before="240" w:after="240"/>
+        <w:rPr>
+          <w:rFonts w:ascii="Times New Roman" w:eastAsia="Times New Roman" w:hAnsi="Times New Roman" w:cs="Times New Roman"/>
+          <w:b/>
+          <w:bCs/>
+          <w:sz w:val="24"/>
+          <w:szCs w:val="24"/>
+        </w:rPr>
+      </w:pPr>
+      <w:r>
+        <w:rPr>
+          <w:rFonts w:ascii="Times New Roman" w:eastAsia="Times New Roman" w:hAnsi="Times New Roman" w:cs="Times New Roman"/>
+          <w:b/>
+          <w:bCs/>
+          <w:sz w:val="24"/>
+          <w:szCs w:val="24"/>
+        </w:rPr>
+        <w:t>RF 12 – Criar ticket urgente e localizar prestadores disponíveis</w:t>
+      </w:r>
+    </w:p>
+    <w:p>
+      <w:pPr>
+        <w:spacing w:before="240" w:after="240"/>
+        <w:rPr>
+          <w:rFonts w:ascii="Times New Roman" w:eastAsia="Times New Roman" w:hAnsi="Times New Roman" w:cs="Times New Roman"/>
+          <w:sz w:val="24"/>
+          <w:szCs w:val="24"/>
+        </w:rPr>
+      </w:pPr>
+      <w:r>
+        <w:rPr>
+          <w:rFonts w:ascii="Times New Roman" w:eastAsia="Times New Roman" w:hAnsi="Times New Roman" w:cs="Times New Roman"/>
+          <w:sz w:val="24"/>
+          <w:szCs w:val="24"/>
+        </w:rPr>
+        <w:t>Descrição: O sistema deve permitir que usuários criem um ticket urgente e visualizem prestadores que estejam com o Modo Urgente ativo para atendimento imediato.</w:t>
+      </w:r>
+      <w:r>
+        <w:rPr>
+          <w:rFonts w:ascii="Times New Roman" w:eastAsia="Times New Roman" w:hAnsi="Times New Roman" w:cs="Times New Roman"/>
+          <w:sz w:val="24"/>
+          <w:szCs w:val="24"/>
+        </w:rPr>
+        <w:t xml:space="preserve"> O sistema deve permitir que clientes abram um contato de emergência para serviços que necessitam de atendimento o mais breve possível, com esse tipo de contato não é </w:t>
+      </w:r>
+      <w:r>
+        <w:rPr>
+          <w:rFonts w:ascii="Times New Roman" w:eastAsia="Times New Roman" w:hAnsi="Times New Roman" w:cs="Times New Roman"/>
+          <w:sz w:val="24"/>
+          <w:szCs w:val="24"/>
+        </w:rPr>
+        <w:lastRenderedPageBreak/>
+        <w:t xml:space="preserve">necessário a criação de uma proposta, e somente é possível fazer com profissionais que aceitaram ter a </w:t>
+      </w:r>
+      <w:proofErr w:type="spellStart"/>
+      <w:r>
+        <w:rPr>
+          <w:rFonts w:ascii="Times New Roman" w:eastAsia="Times New Roman" w:hAnsi="Times New Roman" w:cs="Times New Roman"/>
+          <w:sz w:val="24"/>
+          <w:szCs w:val="24"/>
+        </w:rPr>
+        <w:t>tag</w:t>
+      </w:r>
+      <w:proofErr w:type="spellEnd"/>
+      <w:r>
+        <w:rPr>
+          <w:rFonts w:ascii="Times New Roman" w:eastAsia="Times New Roman" w:hAnsi="Times New Roman" w:cs="Times New Roman"/>
+          <w:sz w:val="24"/>
+          <w:szCs w:val="24"/>
+        </w:rPr>
+        <w:t xml:space="preserve"> de serviços de emergência. Essa </w:t>
+      </w:r>
+      <w:proofErr w:type="spellStart"/>
+      <w:r>
+        <w:rPr>
+          <w:rFonts w:ascii="Times New Roman" w:eastAsia="Times New Roman" w:hAnsi="Times New Roman" w:cs="Times New Roman"/>
+          <w:sz w:val="24"/>
+          <w:szCs w:val="24"/>
+        </w:rPr>
+        <w:t>tag</w:t>
+      </w:r>
+      <w:proofErr w:type="spellEnd"/>
+      <w:r>
+        <w:rPr>
+          <w:rFonts w:ascii="Times New Roman" w:eastAsia="Times New Roman" w:hAnsi="Times New Roman" w:cs="Times New Roman"/>
+          <w:sz w:val="24"/>
+          <w:szCs w:val="24"/>
+        </w:rPr>
+        <w:t xml:space="preserve"> permite que o cliente que queira um serviço de emergência possa ter acesso ao telefone, e-mail ou outro tipo de contato do prestador sem precisar abrir um serviço(ticket).</w:t>
+      </w:r>
+    </w:p>
+    <w:p>
+      <w:pPr>
+        <w:spacing w:before="240" w:after="240"/>
+        <w:rPr>
+          <w:rFonts w:ascii="Times New Roman" w:eastAsia="Times New Roman" w:hAnsi="Times New Roman" w:cs="Times New Roman"/>
+          <w:sz w:val="24"/>
+          <w:szCs w:val="24"/>
+        </w:rPr>
+      </w:pPr>
+      <w:r>
+        <w:rPr>
+          <w:rFonts w:ascii="Times New Roman" w:eastAsia="Times New Roman" w:hAnsi="Times New Roman" w:cs="Times New Roman"/>
+          <w:sz w:val="24"/>
+          <w:szCs w:val="24"/>
+        </w:rPr>
+        <w:t>Dados utilizados:</w:t>
+      </w:r>
+    </w:p>
+    <w:p>
+      <w:pPr>
+        <w:numPr>
+          <w:ilvl w:val="0"/>
+          <w:numId w:val="44"/>
+        </w:numPr>
+        <w:spacing w:before="240" w:after="240"/>
+        <w:rPr>
+          <w:rFonts w:ascii="Times New Roman" w:eastAsia="Times New Roman" w:hAnsi="Times New Roman" w:cs="Times New Roman"/>
+          <w:sz w:val="24"/>
+          <w:szCs w:val="24"/>
+        </w:rPr>
+      </w:pPr>
+      <w:r>
+        <w:rPr>
+          <w:rFonts w:ascii="Times New Roman" w:eastAsia="Times New Roman" w:hAnsi="Times New Roman" w:cs="Times New Roman"/>
+          <w:sz w:val="24"/>
+          <w:szCs w:val="24"/>
+        </w:rPr>
+        <w:t>Categoria do serviço</w:t>
+      </w:r>
+    </w:p>
+    <w:p>
+      <w:pPr>
+        <w:numPr>
+          <w:ilvl w:val="0"/>
+          <w:numId w:val="44"/>
+        </w:numPr>
+        <w:spacing w:before="240" w:after="240"/>
+        <w:rPr>
+          <w:rFonts w:ascii="Times New Roman" w:eastAsia="Times New Roman" w:hAnsi="Times New Roman" w:cs="Times New Roman"/>
+          <w:sz w:val="24"/>
+          <w:szCs w:val="24"/>
+        </w:rPr>
+      </w:pPr>
+      <w:r>
+        <w:rPr>
+          <w:rFonts w:ascii="Times New Roman" w:eastAsia="Times New Roman" w:hAnsi="Times New Roman" w:cs="Times New Roman"/>
+          <w:sz w:val="24"/>
+          <w:szCs w:val="24"/>
+        </w:rPr>
+        <w:t>Cidade/Bairro</w:t>
+      </w:r>
+    </w:p>
+    <w:p>
+      <w:pPr>
+        <w:numPr>
+          <w:ilvl w:val="0"/>
+          <w:numId w:val="44"/>
+        </w:numPr>
+        <w:spacing w:before="240" w:after="240"/>
+        <w:rPr>
+          <w:rFonts w:ascii="Times New Roman" w:eastAsia="Times New Roman" w:hAnsi="Times New Roman" w:cs="Times New Roman"/>
+          <w:sz w:val="24"/>
+          <w:szCs w:val="24"/>
+        </w:rPr>
+      </w:pPr>
+      <w:r>
+        <w:rPr>
+          <w:rFonts w:ascii="Times New Roman" w:eastAsia="Times New Roman" w:hAnsi="Times New Roman" w:cs="Times New Roman"/>
+          <w:sz w:val="24"/>
+          <w:szCs w:val="24"/>
+        </w:rPr>
+        <w:t>Descrição do problema</w:t>
+      </w:r>
+    </w:p>
+    <w:p>
+      <w:pPr>
+        <w:numPr>
+          <w:ilvl w:val="0"/>
+          <w:numId w:val="44"/>
+        </w:numPr>
+        <w:spacing w:before="240" w:after="240"/>
+        <w:rPr>
+          <w:rFonts w:ascii="Times New Roman" w:eastAsia="Times New Roman" w:hAnsi="Times New Roman" w:cs="Times New Roman"/>
+          <w:sz w:val="24"/>
+          <w:szCs w:val="24"/>
+        </w:rPr>
+      </w:pPr>
+      <w:r>
+        <w:rPr>
+          <w:rFonts w:ascii="Times New Roman" w:eastAsia="Times New Roman" w:hAnsi="Times New Roman" w:cs="Times New Roman"/>
+          <w:sz w:val="24"/>
+          <w:szCs w:val="24"/>
+        </w:rPr>
+        <w:t>Prestadores com Modo Urgente ativo</w:t>
+      </w:r>
+    </w:p>
+    <w:p>
+      <w:pPr>
+        <w:spacing w:before="240" w:after="240"/>
+        <w:rPr>
+          <w:rFonts w:ascii="Times New Roman" w:eastAsia="Times New Roman" w:hAnsi="Times New Roman" w:cs="Times New Roman"/>
+          <w:sz w:val="24"/>
+          <w:szCs w:val="24"/>
+        </w:rPr>
+      </w:pPr>
+      <w:r>
+        <w:rPr>
+          <w:rFonts w:ascii="Times New Roman" w:eastAsia="Times New Roman" w:hAnsi="Times New Roman" w:cs="Times New Roman"/>
+          <w:sz w:val="24"/>
+          <w:szCs w:val="24"/>
+        </w:rPr>
+        <w:t>Restrições:</w:t>
+      </w:r>
+    </w:p>
+    <w:p>
+      <w:pPr>
+        <w:numPr>
+          <w:ilvl w:val="0"/>
+          <w:numId w:val="45"/>
+        </w:numPr>
+        <w:spacing w:before="240" w:after="240"/>
+        <w:rPr>
+          <w:rFonts w:ascii="Times New Roman" w:eastAsia="Times New Roman" w:hAnsi="Times New Roman" w:cs="Times New Roman"/>
+          <w:sz w:val="24"/>
+          <w:szCs w:val="24"/>
+        </w:rPr>
+      </w:pPr>
+      <w:r>
+        <w:rPr>
+          <w:rFonts w:ascii="Times New Roman" w:eastAsia="Times New Roman" w:hAnsi="Times New Roman" w:cs="Times New Roman"/>
+          <w:sz w:val="24"/>
+          <w:szCs w:val="24"/>
+        </w:rPr>
+        <w:t>Usuário deve estar autenticado</w:t>
+      </w:r>
+    </w:p>
+    <w:p>
+      <w:pPr>
+        <w:numPr>
+          <w:ilvl w:val="0"/>
+          <w:numId w:val="45"/>
+        </w:numPr>
+        <w:spacing w:before="240" w:after="240"/>
+        <w:rPr>
+          <w:rFonts w:ascii="Times New Roman" w:eastAsia="Times New Roman" w:hAnsi="Times New Roman" w:cs="Times New Roman"/>
+          <w:sz w:val="24"/>
+          <w:szCs w:val="24"/>
+        </w:rPr>
+      </w:pPr>
+      <w:r>
+        <w:rPr>
+          <w:rFonts w:ascii="Times New Roman" w:eastAsia="Times New Roman" w:hAnsi="Times New Roman" w:cs="Times New Roman"/>
+          <w:sz w:val="24"/>
+          <w:szCs w:val="24"/>
+        </w:rPr>
+        <w:t>Somente prestadores com Modo Urgente ativo podem ser exibidos</w:t>
+      </w:r>
+    </w:p>
+    <w:p>
+      <w:pPr>
+        <w:spacing w:before="240" w:after="240"/>
+        <w:rPr>
+          <w:rFonts w:ascii="Times New Roman" w:eastAsia="Times New Roman" w:hAnsi="Times New Roman" w:cs="Times New Roman"/>
+          <w:sz w:val="24"/>
+          <w:szCs w:val="24"/>
+        </w:rPr>
+      </w:pPr>
+      <w:r>
+        <w:rPr>
+          <w:rFonts w:ascii="Times New Roman" w:eastAsia="Times New Roman" w:hAnsi="Times New Roman" w:cs="Times New Roman"/>
+          <w:sz w:val="24"/>
+          <w:szCs w:val="24"/>
+        </w:rPr>
+        <w:t>Exceções:</w:t>
+      </w:r>
+    </w:p>
+    <w:p>
+      <w:pPr>
+        <w:numPr>
+          <w:ilvl w:val="0"/>
+          <w:numId w:val="46"/>
+        </w:numPr>
+        <w:spacing w:before="240" w:after="240"/>
+        <w:rPr>
+          <w:rFonts w:ascii="Times New Roman" w:eastAsia="Times New Roman" w:hAnsi="Times New Roman" w:cs="Times New Roman"/>
+          <w:sz w:val="24"/>
+          <w:szCs w:val="24"/>
+        </w:rPr>
+      </w:pPr>
+      <w:r>
+        <w:rPr>
+          <w:rFonts w:ascii="Times New Roman" w:eastAsia="Times New Roman" w:hAnsi="Times New Roman" w:cs="Times New Roman"/>
+          <w:sz w:val="24"/>
+          <w:szCs w:val="24"/>
+        </w:rPr>
+        <w:t>Nenhum prestador disponível na categoria/região</w:t>
+      </w:r>
+    </w:p>
+    <w:p>
+      <w:pPr>
+        <w:numPr>
+          <w:ilvl w:val="0"/>
+          <w:numId w:val="46"/>
+        </w:numPr>
+        <w:spacing w:before="240" w:after="240"/>
+        <w:rPr>
+          <w:rFonts w:ascii="Times New Roman" w:eastAsia="Times New Roman" w:hAnsi="Times New Roman" w:cs="Times New Roman"/>
+          <w:sz w:val="24"/>
+          <w:szCs w:val="24"/>
+        </w:rPr>
+      </w:pPr>
+      <w:r>
+        <w:rPr>
+          <w:rFonts w:ascii="Times New Roman" w:eastAsia="Times New Roman" w:hAnsi="Times New Roman" w:cs="Times New Roman"/>
+          <w:sz w:val="24"/>
+          <w:szCs w:val="24"/>
+        </w:rPr>
+        <w:t>Categoria inválida</w:t>
+      </w:r>
+    </w:p>
+    <w:p>
+      <w:pPr>
+        <w:spacing w:before="240" w:after="240"/>
+        <w:rPr>
+          <w:rFonts w:ascii="Times New Roman" w:eastAsia="Times New Roman" w:hAnsi="Times New Roman" w:cs="Times New Roman"/>
+          <w:sz w:val="24"/>
+          <w:szCs w:val="24"/>
+        </w:rPr>
+      </w:pPr>
+      <w:r>
+        <w:rPr>
+          <w:rFonts w:ascii="Times New Roman" w:eastAsia="Times New Roman" w:hAnsi="Times New Roman" w:cs="Times New Roman"/>
+          <w:sz w:val="24"/>
+          <w:szCs w:val="24"/>
+        </w:rPr>
+        <w:t>Saída:</w:t>
+      </w:r>
+    </w:p>
+    <w:p>
+      <w:pPr>
+        <w:numPr>
+          <w:ilvl w:val="0"/>
+          <w:numId w:val="47"/>
+        </w:numPr>
+        <w:spacing w:before="240" w:after="240"/>
+        <w:rPr>
+          <w:rFonts w:ascii="Times New Roman" w:eastAsia="Times New Roman" w:hAnsi="Times New Roman" w:cs="Times New Roman"/>
+          <w:sz w:val="24"/>
+          <w:szCs w:val="24"/>
+        </w:rPr>
+      </w:pPr>
+      <w:r>
+        <w:rPr>
+          <w:rFonts w:ascii="Times New Roman" w:eastAsia="Times New Roman" w:hAnsi="Times New Roman" w:cs="Times New Roman"/>
+          <w:sz w:val="24"/>
+          <w:szCs w:val="24"/>
+        </w:rPr>
+        <w:t>Lista de prestadores disponíveis</w:t>
+      </w:r>
+    </w:p>
+    <w:p>
+      <w:pPr>
+        <w:numPr>
+          <w:ilvl w:val="0"/>
+          <w:numId w:val="47"/>
+        </w:numPr>
+        <w:spacing w:before="240" w:after="240"/>
+        <w:rPr>
+          <w:rFonts w:ascii="Times New Roman" w:eastAsia="Times New Roman" w:hAnsi="Times New Roman" w:cs="Times New Roman"/>
+          <w:sz w:val="24"/>
+          <w:szCs w:val="24"/>
+        </w:rPr>
+      </w:pPr>
+      <w:r>
+        <w:rPr>
+          <w:rFonts w:ascii="Times New Roman" w:eastAsia="Times New Roman" w:hAnsi="Times New Roman" w:cs="Times New Roman"/>
+          <w:sz w:val="24"/>
+          <w:szCs w:val="24"/>
+        </w:rPr>
+        <w:t>Criação do ticket urgente</w:t>
+      </w:r>
+    </w:p>
+    <w:p>
+      <w:pPr>
+        <w:numPr>
+          <w:ilvl w:val="0"/>
+          <w:numId w:val="47"/>
+        </w:numPr>
+        <w:spacing w:before="240" w:after="240"/>
+        <w:rPr>
+          <w:rFonts w:ascii="Times New Roman" w:eastAsia="Times New Roman" w:hAnsi="Times New Roman" w:cs="Times New Roman"/>
+          <w:sz w:val="24"/>
+          <w:szCs w:val="24"/>
+        </w:rPr>
+      </w:pPr>
+      <w:r>
+        <w:rPr>
+          <w:rFonts w:ascii="Times New Roman" w:eastAsia="Times New Roman" w:hAnsi="Times New Roman" w:cs="Times New Roman"/>
+          <w:sz w:val="24"/>
+          <w:szCs w:val="24"/>
+        </w:rPr>
+        <w:t>Abertura de chat interno com o prestador selecionado</w:t>
+      </w:r>
+    </w:p>
+    <w:p>
+      <w:pPr>
+        <w:spacing w:before="240" w:after="240"/>
+        <w:rPr>
+          <w:rFonts w:ascii="Times New Roman" w:eastAsia="Times New Roman" w:hAnsi="Times New Roman" w:cs="Times New Roman"/>
+          <w:sz w:val="24"/>
+          <w:szCs w:val="24"/>
+        </w:rPr>
+      </w:pPr>
+      <w:r>
+        <w:rPr>
+          <w:rFonts w:ascii="Times New Roman" w:eastAsia="Times New Roman" w:hAnsi="Times New Roman" w:cs="Times New Roman"/>
+          <w:sz w:val="24"/>
+          <w:szCs w:val="24"/>
+        </w:rPr>
+        <w:t xml:space="preserve">Prioridade: (X) essencial </w:t>
+      </w:r>
+      <w:proofErr w:type="gramStart"/>
+      <w:r>
+        <w:rPr>
+          <w:rFonts w:ascii="Times New Roman" w:eastAsia="Times New Roman" w:hAnsi="Times New Roman" w:cs="Times New Roman"/>
+          <w:sz w:val="24"/>
+          <w:szCs w:val="24"/>
+        </w:rPr>
+        <w:t>( )</w:t>
+      </w:r>
+      <w:proofErr w:type="gramEnd"/>
+      <w:r>
+        <w:rPr>
+          <w:rFonts w:ascii="Times New Roman" w:eastAsia="Times New Roman" w:hAnsi="Times New Roman" w:cs="Times New Roman"/>
+          <w:sz w:val="24"/>
+          <w:szCs w:val="24"/>
+        </w:rPr>
+        <w:t xml:space="preserve"> importante ( ) desejável</w:t>
+      </w:r>
+    </w:p>
+    <w:p>
+      <w:pPr>
+        <w:spacing w:before="240" w:after="240"/>
+        <w:rPr>
+          <w:rFonts w:ascii="Times New Roman" w:eastAsia="Times New Roman" w:hAnsi="Times New Roman" w:cs="Times New Roman"/>
+          <w:sz w:val="24"/>
+          <w:szCs w:val="24"/>
+        </w:rPr>
+      </w:pPr>
     </w:p>
     <w:p>
       <w:pPr>
@@ -3842,6 +4935,304 @@
     </w:lvl>
   </w:abstractNum>
   <w:abstractNum w:abstractNumId="2" w15:restartNumberingAfterBreak="0">
+    <w:nsid w:val="0896212F"/>
+    <w:multiLevelType w:val="multilevel"/>
+    <w:tmpl w:val="9C46CE7C"/>
+    <w:lvl w:ilvl="0">
+      <w:start w:val="1"/>
+      <w:numFmt w:val="bullet"/>
+      <w:lvlText w:val=""/>
+      <w:lvlJc w:val="left"/>
+      <w:pPr>
+        <w:tabs>
+          <w:tab w:val="num" w:pos="720"/>
+        </w:tabs>
+        <w:ind w:left="720" w:hanging="360"/>
+      </w:pPr>
+      <w:rPr>
+        <w:rFonts w:ascii="Symbol" w:hAnsi="Symbol" w:hint="default"/>
+        <w:sz w:val="20"/>
+      </w:rPr>
+    </w:lvl>
+    <w:lvl w:ilvl="1" w:tentative="1">
+      <w:start w:val="1"/>
+      <w:numFmt w:val="bullet"/>
+      <w:lvlText w:val="o"/>
+      <w:lvlJc w:val="left"/>
+      <w:pPr>
+        <w:tabs>
+          <w:tab w:val="num" w:pos="1440"/>
+        </w:tabs>
+        <w:ind w:left="1440" w:hanging="360"/>
+      </w:pPr>
+      <w:rPr>
+        <w:rFonts w:ascii="Courier New" w:hAnsi="Courier New" w:hint="default"/>
+        <w:sz w:val="20"/>
+      </w:rPr>
+    </w:lvl>
+    <w:lvl w:ilvl="2" w:tentative="1">
+      <w:start w:val="1"/>
+      <w:numFmt w:val="bullet"/>
+      <w:lvlText w:val=""/>
+      <w:lvlJc w:val="left"/>
+      <w:pPr>
+        <w:tabs>
+          <w:tab w:val="num" w:pos="2160"/>
+        </w:tabs>
+        <w:ind w:left="2160" w:hanging="360"/>
+      </w:pPr>
+      <w:rPr>
+        <w:rFonts w:ascii="Wingdings" w:hAnsi="Wingdings" w:hint="default"/>
+        <w:sz w:val="20"/>
+      </w:rPr>
+    </w:lvl>
+    <w:lvl w:ilvl="3" w:tentative="1">
+      <w:start w:val="1"/>
+      <w:numFmt w:val="bullet"/>
+      <w:lvlText w:val=""/>
+      <w:lvlJc w:val="left"/>
+      <w:pPr>
+        <w:tabs>
+          <w:tab w:val="num" w:pos="2880"/>
+        </w:tabs>
+        <w:ind w:left="2880" w:hanging="360"/>
+      </w:pPr>
+      <w:rPr>
+        <w:rFonts w:ascii="Wingdings" w:hAnsi="Wingdings" w:hint="default"/>
+        <w:sz w:val="20"/>
+      </w:rPr>
+    </w:lvl>
+    <w:lvl w:ilvl="4" w:tentative="1">
+      <w:start w:val="1"/>
+      <w:numFmt w:val="bullet"/>
+      <w:lvlText w:val=""/>
+      <w:lvlJc w:val="left"/>
+      <w:pPr>
+        <w:tabs>
+          <w:tab w:val="num" w:pos="3600"/>
+        </w:tabs>
+        <w:ind w:left="3600" w:hanging="360"/>
+      </w:pPr>
+      <w:rPr>
+        <w:rFonts w:ascii="Wingdings" w:hAnsi="Wingdings" w:hint="default"/>
+        <w:sz w:val="20"/>
+      </w:rPr>
+    </w:lvl>
+    <w:lvl w:ilvl="5" w:tentative="1">
+      <w:start w:val="1"/>
+      <w:numFmt w:val="bullet"/>
+      <w:lvlText w:val=""/>
+      <w:lvlJc w:val="left"/>
+      <w:pPr>
+        <w:tabs>
+          <w:tab w:val="num" w:pos="4320"/>
+        </w:tabs>
+        <w:ind w:left="4320" w:hanging="360"/>
+      </w:pPr>
+      <w:rPr>
+        <w:rFonts w:ascii="Wingdings" w:hAnsi="Wingdings" w:hint="default"/>
+        <w:sz w:val="20"/>
+      </w:rPr>
+    </w:lvl>
+    <w:lvl w:ilvl="6" w:tentative="1">
+      <w:start w:val="1"/>
+      <w:numFmt w:val="bullet"/>
+      <w:lvlText w:val=""/>
+      <w:lvlJc w:val="left"/>
+      <w:pPr>
+        <w:tabs>
+          <w:tab w:val="num" w:pos="5040"/>
+        </w:tabs>
+        <w:ind w:left="5040" w:hanging="360"/>
+      </w:pPr>
+      <w:rPr>
+        <w:rFonts w:ascii="Wingdings" w:hAnsi="Wingdings" w:hint="default"/>
+        <w:sz w:val="20"/>
+      </w:rPr>
+    </w:lvl>
+    <w:lvl w:ilvl="7" w:tentative="1">
+      <w:start w:val="1"/>
+      <w:numFmt w:val="bullet"/>
+      <w:lvlText w:val=""/>
+      <w:lvlJc w:val="left"/>
+      <w:pPr>
+        <w:tabs>
+          <w:tab w:val="num" w:pos="5760"/>
+        </w:tabs>
+        <w:ind w:left="5760" w:hanging="360"/>
+      </w:pPr>
+      <w:rPr>
+        <w:rFonts w:ascii="Wingdings" w:hAnsi="Wingdings" w:hint="default"/>
+        <w:sz w:val="20"/>
+      </w:rPr>
+    </w:lvl>
+    <w:lvl w:ilvl="8" w:tentative="1">
+      <w:start w:val="1"/>
+      <w:numFmt w:val="bullet"/>
+      <w:lvlText w:val=""/>
+      <w:lvlJc w:val="left"/>
+      <w:pPr>
+        <w:tabs>
+          <w:tab w:val="num" w:pos="6480"/>
+        </w:tabs>
+        <w:ind w:left="6480" w:hanging="360"/>
+      </w:pPr>
+      <w:rPr>
+        <w:rFonts w:ascii="Wingdings" w:hAnsi="Wingdings" w:hint="default"/>
+        <w:sz w:val="20"/>
+      </w:rPr>
+    </w:lvl>
+  </w:abstractNum>
+  <w:abstractNum w:abstractNumId="3" w15:restartNumberingAfterBreak="0">
+    <w:nsid w:val="0A174FC4"/>
+    <w:multiLevelType w:val="multilevel"/>
+    <w:tmpl w:val="8F1A677E"/>
+    <w:lvl w:ilvl="0">
+      <w:start w:val="1"/>
+      <w:numFmt w:val="bullet"/>
+      <w:lvlText w:val=""/>
+      <w:lvlJc w:val="left"/>
+      <w:pPr>
+        <w:tabs>
+          <w:tab w:val="num" w:pos="720"/>
+        </w:tabs>
+        <w:ind w:left="720" w:hanging="360"/>
+      </w:pPr>
+      <w:rPr>
+        <w:rFonts w:ascii="Symbol" w:hAnsi="Symbol" w:hint="default"/>
+        <w:sz w:val="20"/>
+      </w:rPr>
+    </w:lvl>
+    <w:lvl w:ilvl="1" w:tentative="1">
+      <w:start w:val="1"/>
+      <w:numFmt w:val="bullet"/>
+      <w:lvlText w:val="o"/>
+      <w:lvlJc w:val="left"/>
+      <w:pPr>
+        <w:tabs>
+          <w:tab w:val="num" w:pos="1440"/>
+        </w:tabs>
+        <w:ind w:left="1440" w:hanging="360"/>
+      </w:pPr>
+      <w:rPr>
+        <w:rFonts w:ascii="Courier New" w:hAnsi="Courier New" w:hint="default"/>
+        <w:sz w:val="20"/>
+      </w:rPr>
+    </w:lvl>
+    <w:lvl w:ilvl="2" w:tentative="1">
+      <w:start w:val="1"/>
+      <w:numFmt w:val="bullet"/>
+      <w:lvlText w:val=""/>
+      <w:lvlJc w:val="left"/>
+      <w:pPr>
+        <w:tabs>
+          <w:tab w:val="num" w:pos="2160"/>
+        </w:tabs>
+        <w:ind w:left="2160" w:hanging="360"/>
+      </w:pPr>
+      <w:rPr>
+        <w:rFonts w:ascii="Wingdings" w:hAnsi="Wingdings" w:hint="default"/>
+        <w:sz w:val="20"/>
+      </w:rPr>
+    </w:lvl>
+    <w:lvl w:ilvl="3" w:tentative="1">
+      <w:start w:val="1"/>
+      <w:numFmt w:val="bullet"/>
+      <w:lvlText w:val=""/>
+      <w:lvlJc w:val="left"/>
+      <w:pPr>
+        <w:tabs>
+          <w:tab w:val="num" w:pos="2880"/>
+        </w:tabs>
+        <w:ind w:left="2880" w:hanging="360"/>
+      </w:pPr>
+      <w:rPr>
+        <w:rFonts w:ascii="Wingdings" w:hAnsi="Wingdings" w:hint="default"/>
+        <w:sz w:val="20"/>
+      </w:rPr>
+    </w:lvl>
+    <w:lvl w:ilvl="4" w:tentative="1">
+      <w:start w:val="1"/>
+      <w:numFmt w:val="bullet"/>
+      <w:lvlText w:val=""/>
+      <w:lvlJc w:val="left"/>
+      <w:pPr>
+        <w:tabs>
+          <w:tab w:val="num" w:pos="3600"/>
+        </w:tabs>
+        <w:ind w:left="3600" w:hanging="360"/>
+      </w:pPr>
+      <w:rPr>
+        <w:rFonts w:ascii="Wingdings" w:hAnsi="Wingdings" w:hint="default"/>
+        <w:sz w:val="20"/>
+      </w:rPr>
+    </w:lvl>
+    <w:lvl w:ilvl="5" w:tentative="1">
+      <w:start w:val="1"/>
+      <w:numFmt w:val="bullet"/>
+      <w:lvlText w:val=""/>
+      <w:lvlJc w:val="left"/>
+      <w:pPr>
+        <w:tabs>
+          <w:tab w:val="num" w:pos="4320"/>
+        </w:tabs>
+        <w:ind w:left="4320" w:hanging="360"/>
+      </w:pPr>
+      <w:rPr>
+        <w:rFonts w:ascii="Wingdings" w:hAnsi="Wingdings" w:hint="default"/>
+        <w:sz w:val="20"/>
+      </w:rPr>
+    </w:lvl>
+    <w:lvl w:ilvl="6" w:tentative="1">
+      <w:start w:val="1"/>
+      <w:numFmt w:val="bullet"/>
+      <w:lvlText w:val=""/>
+      <w:lvlJc w:val="left"/>
+      <w:pPr>
+        <w:tabs>
+          <w:tab w:val="num" w:pos="5040"/>
+        </w:tabs>
+        <w:ind w:left="5040" w:hanging="360"/>
+      </w:pPr>
+      <w:rPr>
+        <w:rFonts w:ascii="Wingdings" w:hAnsi="Wingdings" w:hint="default"/>
+        <w:sz w:val="20"/>
+      </w:rPr>
+    </w:lvl>
+    <w:lvl w:ilvl="7" w:tentative="1">
+      <w:start w:val="1"/>
+      <w:numFmt w:val="bullet"/>
+      <w:lvlText w:val=""/>
+      <w:lvlJc w:val="left"/>
+      <w:pPr>
+        <w:tabs>
+          <w:tab w:val="num" w:pos="5760"/>
+        </w:tabs>
+        <w:ind w:left="5760" w:hanging="360"/>
+      </w:pPr>
+      <w:rPr>
+        <w:rFonts w:ascii="Wingdings" w:hAnsi="Wingdings" w:hint="default"/>
+        <w:sz w:val="20"/>
+      </w:rPr>
+    </w:lvl>
+    <w:lvl w:ilvl="8" w:tentative="1">
+      <w:start w:val="1"/>
+      <w:numFmt w:val="bullet"/>
+      <w:lvlText w:val=""/>
+      <w:lvlJc w:val="left"/>
+      <w:pPr>
+        <w:tabs>
+          <w:tab w:val="num" w:pos="6480"/>
+        </w:tabs>
+        <w:ind w:left="6480" w:hanging="360"/>
+      </w:pPr>
+      <w:rPr>
+        <w:rFonts w:ascii="Wingdings" w:hAnsi="Wingdings" w:hint="default"/>
+        <w:sz w:val="20"/>
+      </w:rPr>
+    </w:lvl>
+  </w:abstractNum>
+  <w:abstractNum w:abstractNumId="4" w15:restartNumberingAfterBreak="0">
     <w:nsid w:val="0CEB3729"/>
     <w:multiLevelType w:val="multilevel"/>
     <w:tmpl w:val="E0468052"/>
@@ -3990,7 +5381,7 @@
       </w:rPr>
     </w:lvl>
   </w:abstractNum>
-  <w:abstractNum w:abstractNumId="3" w15:restartNumberingAfterBreak="0">
+  <w:abstractNum w:abstractNumId="5" w15:restartNumberingAfterBreak="0">
     <w:nsid w:val="0D714FA8"/>
     <w:multiLevelType w:val="multilevel"/>
     <w:tmpl w:val="4FD40DC4"/>
@@ -4139,7 +5530,7 @@
       </w:rPr>
     </w:lvl>
   </w:abstractNum>
-  <w:abstractNum w:abstractNumId="4" w15:restartNumberingAfterBreak="0">
+  <w:abstractNum w:abstractNumId="6" w15:restartNumberingAfterBreak="0">
     <w:nsid w:val="0F794E06"/>
     <w:multiLevelType w:val="multilevel"/>
     <w:tmpl w:val="13D887C8"/>
@@ -4288,7 +5679,7 @@
       </w:rPr>
     </w:lvl>
   </w:abstractNum>
-  <w:abstractNum w:abstractNumId="5" w15:restartNumberingAfterBreak="0">
+  <w:abstractNum w:abstractNumId="7" w15:restartNumberingAfterBreak="0">
     <w:nsid w:val="109143F6"/>
     <w:multiLevelType w:val="multilevel"/>
     <w:tmpl w:val="FB6AB6F4"/>
@@ -4437,7 +5828,7 @@
       </w:rPr>
     </w:lvl>
   </w:abstractNum>
-  <w:abstractNum w:abstractNumId="6" w15:restartNumberingAfterBreak="0">
+  <w:abstractNum w:abstractNumId="8" w15:restartNumberingAfterBreak="0">
     <w:nsid w:val="1A387F83"/>
     <w:multiLevelType w:val="multilevel"/>
     <w:tmpl w:val="102A9808"/>
@@ -4586,7 +5977,7 @@
       </w:rPr>
     </w:lvl>
   </w:abstractNum>
-  <w:abstractNum w:abstractNumId="7" w15:restartNumberingAfterBreak="0">
+  <w:abstractNum w:abstractNumId="9" w15:restartNumberingAfterBreak="0">
     <w:nsid w:val="1DE34262"/>
     <w:multiLevelType w:val="multilevel"/>
     <w:tmpl w:val="C7861610"/>
@@ -4735,7 +6126,156 @@
       </w:rPr>
     </w:lvl>
   </w:abstractNum>
-  <w:abstractNum w:abstractNumId="8" w15:restartNumberingAfterBreak="0">
+  <w:abstractNum w:abstractNumId="10" w15:restartNumberingAfterBreak="0">
+    <w:nsid w:val="2088347F"/>
+    <w:multiLevelType w:val="multilevel"/>
+    <w:tmpl w:val="4F061CA2"/>
+    <w:lvl w:ilvl="0">
+      <w:start w:val="1"/>
+      <w:numFmt w:val="bullet"/>
+      <w:lvlText w:val=""/>
+      <w:lvlJc w:val="left"/>
+      <w:pPr>
+        <w:tabs>
+          <w:tab w:val="num" w:pos="720"/>
+        </w:tabs>
+        <w:ind w:left="720" w:hanging="360"/>
+      </w:pPr>
+      <w:rPr>
+        <w:rFonts w:ascii="Symbol" w:hAnsi="Symbol" w:hint="default"/>
+        <w:sz w:val="20"/>
+      </w:rPr>
+    </w:lvl>
+    <w:lvl w:ilvl="1" w:tentative="1">
+      <w:start w:val="1"/>
+      <w:numFmt w:val="bullet"/>
+      <w:lvlText w:val="o"/>
+      <w:lvlJc w:val="left"/>
+      <w:pPr>
+        <w:tabs>
+          <w:tab w:val="num" w:pos="1440"/>
+        </w:tabs>
+        <w:ind w:left="1440" w:hanging="360"/>
+      </w:pPr>
+      <w:rPr>
+        <w:rFonts w:ascii="Courier New" w:hAnsi="Courier New" w:hint="default"/>
+        <w:sz w:val="20"/>
+      </w:rPr>
+    </w:lvl>
+    <w:lvl w:ilvl="2" w:tentative="1">
+      <w:start w:val="1"/>
+      <w:numFmt w:val="bullet"/>
+      <w:lvlText w:val=""/>
+      <w:lvlJc w:val="left"/>
+      <w:pPr>
+        <w:tabs>
+          <w:tab w:val="num" w:pos="2160"/>
+        </w:tabs>
+        <w:ind w:left="2160" w:hanging="360"/>
+      </w:pPr>
+      <w:rPr>
+        <w:rFonts w:ascii="Wingdings" w:hAnsi="Wingdings" w:hint="default"/>
+        <w:sz w:val="20"/>
+      </w:rPr>
+    </w:lvl>
+    <w:lvl w:ilvl="3" w:tentative="1">
+      <w:start w:val="1"/>
+      <w:numFmt w:val="bullet"/>
+      <w:lvlText w:val=""/>
+      <w:lvlJc w:val="left"/>
+      <w:pPr>
+        <w:tabs>
+          <w:tab w:val="num" w:pos="2880"/>
+        </w:tabs>
+        <w:ind w:left="2880" w:hanging="360"/>
+      </w:pPr>
+      <w:rPr>
+        <w:rFonts w:ascii="Wingdings" w:hAnsi="Wingdings" w:hint="default"/>
+        <w:sz w:val="20"/>
+      </w:rPr>
+    </w:lvl>
+    <w:lvl w:ilvl="4" w:tentative="1">
+      <w:start w:val="1"/>
+      <w:numFmt w:val="bullet"/>
+      <w:lvlText w:val=""/>
+      <w:lvlJc w:val="left"/>
+      <w:pPr>
+        <w:tabs>
+          <w:tab w:val="num" w:pos="3600"/>
+        </w:tabs>
+        <w:ind w:left="3600" w:hanging="360"/>
+      </w:pPr>
+      <w:rPr>
+        <w:rFonts w:ascii="Wingdings" w:hAnsi="Wingdings" w:hint="default"/>
+        <w:sz w:val="20"/>
+      </w:rPr>
+    </w:lvl>
+    <w:lvl w:ilvl="5" w:tentative="1">
+      <w:start w:val="1"/>
+      <w:numFmt w:val="bullet"/>
+      <w:lvlText w:val=""/>
+      <w:lvlJc w:val="left"/>
+      <w:pPr>
+        <w:tabs>
+          <w:tab w:val="num" w:pos="4320"/>
+        </w:tabs>
+        <w:ind w:left="4320" w:hanging="360"/>
+      </w:pPr>
+      <w:rPr>
+        <w:rFonts w:ascii="Wingdings" w:hAnsi="Wingdings" w:hint="default"/>
+        <w:sz w:val="20"/>
+      </w:rPr>
+    </w:lvl>
+    <w:lvl w:ilvl="6" w:tentative="1">
+      <w:start w:val="1"/>
+      <w:numFmt w:val="bullet"/>
+      <w:lvlText w:val=""/>
+      <w:lvlJc w:val="left"/>
+      <w:pPr>
+        <w:tabs>
+          <w:tab w:val="num" w:pos="5040"/>
+        </w:tabs>
+        <w:ind w:left="5040" w:hanging="360"/>
+      </w:pPr>
+      <w:rPr>
+        <w:rFonts w:ascii="Wingdings" w:hAnsi="Wingdings" w:hint="default"/>
+        <w:sz w:val="20"/>
+      </w:rPr>
+    </w:lvl>
+    <w:lvl w:ilvl="7" w:tentative="1">
+      <w:start w:val="1"/>
+      <w:numFmt w:val="bullet"/>
+      <w:lvlText w:val=""/>
+      <w:lvlJc w:val="left"/>
+      <w:pPr>
+        <w:tabs>
+          <w:tab w:val="num" w:pos="5760"/>
+        </w:tabs>
+        <w:ind w:left="5760" w:hanging="360"/>
+      </w:pPr>
+      <w:rPr>
+        <w:rFonts w:ascii="Wingdings" w:hAnsi="Wingdings" w:hint="default"/>
+        <w:sz w:val="20"/>
+      </w:rPr>
+    </w:lvl>
+    <w:lvl w:ilvl="8" w:tentative="1">
+      <w:start w:val="1"/>
+      <w:numFmt w:val="bullet"/>
+      <w:lvlText w:val=""/>
+      <w:lvlJc w:val="left"/>
+      <w:pPr>
+        <w:tabs>
+          <w:tab w:val="num" w:pos="6480"/>
+        </w:tabs>
+        <w:ind w:left="6480" w:hanging="360"/>
+      </w:pPr>
+      <w:rPr>
+        <w:rFonts w:ascii="Wingdings" w:hAnsi="Wingdings" w:hint="default"/>
+        <w:sz w:val="20"/>
+      </w:rPr>
+    </w:lvl>
+  </w:abstractNum>
+  <w:abstractNum w:abstractNumId="11" w15:restartNumberingAfterBreak="0">
     <w:nsid w:val="28335BA2"/>
     <w:multiLevelType w:val="multilevel"/>
     <w:tmpl w:val="32124FCC"/>
@@ -4884,7 +6424,156 @@
       </w:rPr>
     </w:lvl>
   </w:abstractNum>
-  <w:abstractNum w:abstractNumId="9" w15:restartNumberingAfterBreak="0">
+  <w:abstractNum w:abstractNumId="12" w15:restartNumberingAfterBreak="0">
+    <w:nsid w:val="287548CB"/>
+    <w:multiLevelType w:val="multilevel"/>
+    <w:tmpl w:val="A3849BD8"/>
+    <w:lvl w:ilvl="0">
+      <w:start w:val="1"/>
+      <w:numFmt w:val="bullet"/>
+      <w:lvlText w:val=""/>
+      <w:lvlJc w:val="left"/>
+      <w:pPr>
+        <w:tabs>
+          <w:tab w:val="num" w:pos="720"/>
+        </w:tabs>
+        <w:ind w:left="720" w:hanging="360"/>
+      </w:pPr>
+      <w:rPr>
+        <w:rFonts w:ascii="Symbol" w:hAnsi="Symbol" w:hint="default"/>
+        <w:sz w:val="20"/>
+      </w:rPr>
+    </w:lvl>
+    <w:lvl w:ilvl="1" w:tentative="1">
+      <w:start w:val="1"/>
+      <w:numFmt w:val="bullet"/>
+      <w:lvlText w:val="o"/>
+      <w:lvlJc w:val="left"/>
+      <w:pPr>
+        <w:tabs>
+          <w:tab w:val="num" w:pos="1440"/>
+        </w:tabs>
+        <w:ind w:left="1440" w:hanging="360"/>
+      </w:pPr>
+      <w:rPr>
+        <w:rFonts w:ascii="Courier New" w:hAnsi="Courier New" w:hint="default"/>
+        <w:sz w:val="20"/>
+      </w:rPr>
+    </w:lvl>
+    <w:lvl w:ilvl="2" w:tentative="1">
+      <w:start w:val="1"/>
+      <w:numFmt w:val="bullet"/>
+      <w:lvlText w:val=""/>
+      <w:lvlJc w:val="left"/>
+      <w:pPr>
+        <w:tabs>
+          <w:tab w:val="num" w:pos="2160"/>
+        </w:tabs>
+        <w:ind w:left="2160" w:hanging="360"/>
+      </w:pPr>
+      <w:rPr>
+        <w:rFonts w:ascii="Wingdings" w:hAnsi="Wingdings" w:hint="default"/>
+        <w:sz w:val="20"/>
+      </w:rPr>
+    </w:lvl>
+    <w:lvl w:ilvl="3" w:tentative="1">
+      <w:start w:val="1"/>
+      <w:numFmt w:val="bullet"/>
+      <w:lvlText w:val=""/>
+      <w:lvlJc w:val="left"/>
+      <w:pPr>
+        <w:tabs>
+          <w:tab w:val="num" w:pos="2880"/>
+        </w:tabs>
+        <w:ind w:left="2880" w:hanging="360"/>
+      </w:pPr>
+      <w:rPr>
+        <w:rFonts w:ascii="Wingdings" w:hAnsi="Wingdings" w:hint="default"/>
+        <w:sz w:val="20"/>
+      </w:rPr>
+    </w:lvl>
+    <w:lvl w:ilvl="4" w:tentative="1">
+      <w:start w:val="1"/>
+      <w:numFmt w:val="bullet"/>
+      <w:lvlText w:val=""/>
+      <w:lvlJc w:val="left"/>
+      <w:pPr>
+        <w:tabs>
+          <w:tab w:val="num" w:pos="3600"/>
+        </w:tabs>
+        <w:ind w:left="3600" w:hanging="360"/>
+      </w:pPr>
+      <w:rPr>
+        <w:rFonts w:ascii="Wingdings" w:hAnsi="Wingdings" w:hint="default"/>
+        <w:sz w:val="20"/>
+      </w:rPr>
+    </w:lvl>
+    <w:lvl w:ilvl="5" w:tentative="1">
+      <w:start w:val="1"/>
+      <w:numFmt w:val="bullet"/>
+      <w:lvlText w:val=""/>
+      <w:lvlJc w:val="left"/>
+      <w:pPr>
+        <w:tabs>
+          <w:tab w:val="num" w:pos="4320"/>
+        </w:tabs>
+        <w:ind w:left="4320" w:hanging="360"/>
+      </w:pPr>
+      <w:rPr>
+        <w:rFonts w:ascii="Wingdings" w:hAnsi="Wingdings" w:hint="default"/>
+        <w:sz w:val="20"/>
+      </w:rPr>
+    </w:lvl>
+    <w:lvl w:ilvl="6" w:tentative="1">
+      <w:start w:val="1"/>
+      <w:numFmt w:val="bullet"/>
+      <w:lvlText w:val=""/>
+      <w:lvlJc w:val="left"/>
+      <w:pPr>
+        <w:tabs>
+          <w:tab w:val="num" w:pos="5040"/>
+        </w:tabs>
+        <w:ind w:left="5040" w:hanging="360"/>
+      </w:pPr>
+      <w:rPr>
+        <w:rFonts w:ascii="Wingdings" w:hAnsi="Wingdings" w:hint="default"/>
+        <w:sz w:val="20"/>
+      </w:rPr>
+    </w:lvl>
+    <w:lvl w:ilvl="7" w:tentative="1">
+      <w:start w:val="1"/>
+      <w:numFmt w:val="bullet"/>
+      <w:lvlText w:val=""/>
+      <w:lvlJc w:val="left"/>
+      <w:pPr>
+        <w:tabs>
+          <w:tab w:val="num" w:pos="5760"/>
+        </w:tabs>
+        <w:ind w:left="5760" w:hanging="360"/>
+      </w:pPr>
+      <w:rPr>
+        <w:rFonts w:ascii="Wingdings" w:hAnsi="Wingdings" w:hint="default"/>
+        <w:sz w:val="20"/>
+      </w:rPr>
+    </w:lvl>
+    <w:lvl w:ilvl="8" w:tentative="1">
+      <w:start w:val="1"/>
+      <w:numFmt w:val="bullet"/>
+      <w:lvlText w:val=""/>
+      <w:lvlJc w:val="left"/>
+      <w:pPr>
+        <w:tabs>
+          <w:tab w:val="num" w:pos="6480"/>
+        </w:tabs>
+        <w:ind w:left="6480" w:hanging="360"/>
+      </w:pPr>
+      <w:rPr>
+        <w:rFonts w:ascii="Wingdings" w:hAnsi="Wingdings" w:hint="default"/>
+        <w:sz w:val="20"/>
+      </w:rPr>
+    </w:lvl>
+  </w:abstractNum>
+  <w:abstractNum w:abstractNumId="13" w15:restartNumberingAfterBreak="0">
     <w:nsid w:val="28F6193C"/>
     <w:multiLevelType w:val="multilevel"/>
     <w:tmpl w:val="83BE99A4"/>
@@ -5033,7 +6722,7 @@
       </w:rPr>
     </w:lvl>
   </w:abstractNum>
-  <w:abstractNum w:abstractNumId="10" w15:restartNumberingAfterBreak="0">
+  <w:abstractNum w:abstractNumId="14" w15:restartNumberingAfterBreak="0">
     <w:nsid w:val="2AD73EDF"/>
     <w:multiLevelType w:val="multilevel"/>
     <w:tmpl w:val="523419CE"/>
@@ -5182,7 +6871,7 @@
       </w:rPr>
     </w:lvl>
   </w:abstractNum>
-  <w:abstractNum w:abstractNumId="11" w15:restartNumberingAfterBreak="0">
+  <w:abstractNum w:abstractNumId="15" w15:restartNumberingAfterBreak="0">
     <w:nsid w:val="2FE92C5E"/>
     <w:multiLevelType w:val="multilevel"/>
     <w:tmpl w:val="AF665276"/>
@@ -5331,7 +7020,7 @@
       </w:rPr>
     </w:lvl>
   </w:abstractNum>
-  <w:abstractNum w:abstractNumId="12" w15:restartNumberingAfterBreak="0">
+  <w:abstractNum w:abstractNumId="16" w15:restartNumberingAfterBreak="0">
     <w:nsid w:val="3344749E"/>
     <w:multiLevelType w:val="multilevel"/>
     <w:tmpl w:val="581EE46E"/>
@@ -5480,7 +7169,156 @@
       </w:rPr>
     </w:lvl>
   </w:abstractNum>
-  <w:abstractNum w:abstractNumId="13" w15:restartNumberingAfterBreak="0">
+  <w:abstractNum w:abstractNumId="17" w15:restartNumberingAfterBreak="0">
+    <w:nsid w:val="34D75F48"/>
+    <w:multiLevelType w:val="multilevel"/>
+    <w:tmpl w:val="3A788AE6"/>
+    <w:lvl w:ilvl="0">
+      <w:start w:val="1"/>
+      <w:numFmt w:val="bullet"/>
+      <w:lvlText w:val=""/>
+      <w:lvlJc w:val="left"/>
+      <w:pPr>
+        <w:tabs>
+          <w:tab w:val="num" w:pos="720"/>
+        </w:tabs>
+        <w:ind w:left="720" w:hanging="360"/>
+      </w:pPr>
+      <w:rPr>
+        <w:rFonts w:ascii="Symbol" w:hAnsi="Symbol" w:hint="default"/>
+        <w:sz w:val="20"/>
+      </w:rPr>
+    </w:lvl>
+    <w:lvl w:ilvl="1" w:tentative="1">
+      <w:start w:val="1"/>
+      <w:numFmt w:val="bullet"/>
+      <w:lvlText w:val="o"/>
+      <w:lvlJc w:val="left"/>
+      <w:pPr>
+        <w:tabs>
+          <w:tab w:val="num" w:pos="1440"/>
+        </w:tabs>
+        <w:ind w:left="1440" w:hanging="360"/>
+      </w:pPr>
+      <w:rPr>
+        <w:rFonts w:ascii="Courier New" w:hAnsi="Courier New" w:hint="default"/>
+        <w:sz w:val="20"/>
+      </w:rPr>
+    </w:lvl>
+    <w:lvl w:ilvl="2" w:tentative="1">
+      <w:start w:val="1"/>
+      <w:numFmt w:val="bullet"/>
+      <w:lvlText w:val=""/>
+      <w:lvlJc w:val="left"/>
+      <w:pPr>
+        <w:tabs>
+          <w:tab w:val="num" w:pos="2160"/>
+        </w:tabs>
+        <w:ind w:left="2160" w:hanging="360"/>
+      </w:pPr>
+      <w:rPr>
+        <w:rFonts w:ascii="Wingdings" w:hAnsi="Wingdings" w:hint="default"/>
+        <w:sz w:val="20"/>
+      </w:rPr>
+    </w:lvl>
+    <w:lvl w:ilvl="3" w:tentative="1">
+      <w:start w:val="1"/>
+      <w:numFmt w:val="bullet"/>
+      <w:lvlText w:val=""/>
+      <w:lvlJc w:val="left"/>
+      <w:pPr>
+        <w:tabs>
+          <w:tab w:val="num" w:pos="2880"/>
+        </w:tabs>
+        <w:ind w:left="2880" w:hanging="360"/>
+      </w:pPr>
+      <w:rPr>
+        <w:rFonts w:ascii="Wingdings" w:hAnsi="Wingdings" w:hint="default"/>
+        <w:sz w:val="20"/>
+      </w:rPr>
+    </w:lvl>
+    <w:lvl w:ilvl="4" w:tentative="1">
+      <w:start w:val="1"/>
+      <w:numFmt w:val="bullet"/>
+      <w:lvlText w:val=""/>
+      <w:lvlJc w:val="left"/>
+      <w:pPr>
+        <w:tabs>
+          <w:tab w:val="num" w:pos="3600"/>
+        </w:tabs>
+        <w:ind w:left="3600" w:hanging="360"/>
+      </w:pPr>
+      <w:rPr>
+        <w:rFonts w:ascii="Wingdings" w:hAnsi="Wingdings" w:hint="default"/>
+        <w:sz w:val="20"/>
+      </w:rPr>
+    </w:lvl>
+    <w:lvl w:ilvl="5" w:tentative="1">
+      <w:start w:val="1"/>
+      <w:numFmt w:val="bullet"/>
+      <w:lvlText w:val=""/>
+      <w:lvlJc w:val="left"/>
+      <w:pPr>
+        <w:tabs>
+          <w:tab w:val="num" w:pos="4320"/>
+        </w:tabs>
+        <w:ind w:left="4320" w:hanging="360"/>
+      </w:pPr>
+      <w:rPr>
+        <w:rFonts w:ascii="Wingdings" w:hAnsi="Wingdings" w:hint="default"/>
+        <w:sz w:val="20"/>
+      </w:rPr>
+    </w:lvl>
+    <w:lvl w:ilvl="6" w:tentative="1">
+      <w:start w:val="1"/>
+      <w:numFmt w:val="bullet"/>
+      <w:lvlText w:val=""/>
+      <w:lvlJc w:val="left"/>
+      <w:pPr>
+        <w:tabs>
+          <w:tab w:val="num" w:pos="5040"/>
+        </w:tabs>
+        <w:ind w:left="5040" w:hanging="360"/>
+      </w:pPr>
+      <w:rPr>
+        <w:rFonts w:ascii="Wingdings" w:hAnsi="Wingdings" w:hint="default"/>
+        <w:sz w:val="20"/>
+      </w:rPr>
+    </w:lvl>
+    <w:lvl w:ilvl="7" w:tentative="1">
+      <w:start w:val="1"/>
+      <w:numFmt w:val="bullet"/>
+      <w:lvlText w:val=""/>
+      <w:lvlJc w:val="left"/>
+      <w:pPr>
+        <w:tabs>
+          <w:tab w:val="num" w:pos="5760"/>
+        </w:tabs>
+        <w:ind w:left="5760" w:hanging="360"/>
+      </w:pPr>
+      <w:rPr>
+        <w:rFonts w:ascii="Wingdings" w:hAnsi="Wingdings" w:hint="default"/>
+        <w:sz w:val="20"/>
+      </w:rPr>
+    </w:lvl>
+    <w:lvl w:ilvl="8" w:tentative="1">
+      <w:start w:val="1"/>
+      <w:numFmt w:val="bullet"/>
+      <w:lvlText w:val=""/>
+      <w:lvlJc w:val="left"/>
+      <w:pPr>
+        <w:tabs>
+          <w:tab w:val="num" w:pos="6480"/>
+        </w:tabs>
+        <w:ind w:left="6480" w:hanging="360"/>
+      </w:pPr>
+      <w:rPr>
+        <w:rFonts w:ascii="Wingdings" w:hAnsi="Wingdings" w:hint="default"/>
+        <w:sz w:val="20"/>
+      </w:rPr>
+    </w:lvl>
+  </w:abstractNum>
+  <w:abstractNum w:abstractNumId="18" w15:restartNumberingAfterBreak="0">
     <w:nsid w:val="38C51E7C"/>
     <w:multiLevelType w:val="multilevel"/>
     <w:tmpl w:val="75C6CF1E"/>
@@ -5629,7 +7467,7 @@
       </w:rPr>
     </w:lvl>
   </w:abstractNum>
-  <w:abstractNum w:abstractNumId="14" w15:restartNumberingAfterBreak="0">
+  <w:abstractNum w:abstractNumId="19" w15:restartNumberingAfterBreak="0">
     <w:nsid w:val="3D7A27B8"/>
     <w:multiLevelType w:val="multilevel"/>
     <w:tmpl w:val="D1983D1A"/>
@@ -5778,7 +7616,7 @@
       </w:rPr>
     </w:lvl>
   </w:abstractNum>
-  <w:abstractNum w:abstractNumId="15" w15:restartNumberingAfterBreak="0">
+  <w:abstractNum w:abstractNumId="20" w15:restartNumberingAfterBreak="0">
     <w:nsid w:val="4051330B"/>
     <w:multiLevelType w:val="multilevel"/>
     <w:tmpl w:val="BAD06B2C"/>
@@ -5927,7 +7765,7 @@
       </w:rPr>
     </w:lvl>
   </w:abstractNum>
-  <w:abstractNum w:abstractNumId="16" w15:restartNumberingAfterBreak="0">
+  <w:abstractNum w:abstractNumId="21" w15:restartNumberingAfterBreak="0">
     <w:nsid w:val="46795B27"/>
     <w:multiLevelType w:val="multilevel"/>
     <w:tmpl w:val="3D9E3768"/>
@@ -6076,7 +7914,305 @@
       </w:rPr>
     </w:lvl>
   </w:abstractNum>
-  <w:abstractNum w:abstractNumId="17" w15:restartNumberingAfterBreak="0">
+  <w:abstractNum w:abstractNumId="22" w15:restartNumberingAfterBreak="0">
+    <w:nsid w:val="469056E7"/>
+    <w:multiLevelType w:val="multilevel"/>
+    <w:tmpl w:val="67F467FA"/>
+    <w:lvl w:ilvl="0">
+      <w:start w:val="1"/>
+      <w:numFmt w:val="bullet"/>
+      <w:lvlText w:val=""/>
+      <w:lvlJc w:val="left"/>
+      <w:pPr>
+        <w:tabs>
+          <w:tab w:val="num" w:pos="720"/>
+        </w:tabs>
+        <w:ind w:left="720" w:hanging="360"/>
+      </w:pPr>
+      <w:rPr>
+        <w:rFonts w:ascii="Symbol" w:hAnsi="Symbol" w:hint="default"/>
+        <w:sz w:val="20"/>
+      </w:rPr>
+    </w:lvl>
+    <w:lvl w:ilvl="1" w:tentative="1">
+      <w:start w:val="1"/>
+      <w:numFmt w:val="bullet"/>
+      <w:lvlText w:val="o"/>
+      <w:lvlJc w:val="left"/>
+      <w:pPr>
+        <w:tabs>
+          <w:tab w:val="num" w:pos="1440"/>
+        </w:tabs>
+        <w:ind w:left="1440" w:hanging="360"/>
+      </w:pPr>
+      <w:rPr>
+        <w:rFonts w:ascii="Courier New" w:hAnsi="Courier New" w:hint="default"/>
+        <w:sz w:val="20"/>
+      </w:rPr>
+    </w:lvl>
+    <w:lvl w:ilvl="2" w:tentative="1">
+      <w:start w:val="1"/>
+      <w:numFmt w:val="bullet"/>
+      <w:lvlText w:val=""/>
+      <w:lvlJc w:val="left"/>
+      <w:pPr>
+        <w:tabs>
+          <w:tab w:val="num" w:pos="2160"/>
+        </w:tabs>
+        <w:ind w:left="2160" w:hanging="360"/>
+      </w:pPr>
+      <w:rPr>
+        <w:rFonts w:ascii="Wingdings" w:hAnsi="Wingdings" w:hint="default"/>
+        <w:sz w:val="20"/>
+      </w:rPr>
+    </w:lvl>
+    <w:lvl w:ilvl="3" w:tentative="1">
+      <w:start w:val="1"/>
+      <w:numFmt w:val="bullet"/>
+      <w:lvlText w:val=""/>
+      <w:lvlJc w:val="left"/>
+      <w:pPr>
+        <w:tabs>
+          <w:tab w:val="num" w:pos="2880"/>
+        </w:tabs>
+        <w:ind w:left="2880" w:hanging="360"/>
+      </w:pPr>
+      <w:rPr>
+        <w:rFonts w:ascii="Wingdings" w:hAnsi="Wingdings" w:hint="default"/>
+        <w:sz w:val="20"/>
+      </w:rPr>
+    </w:lvl>
+    <w:lvl w:ilvl="4" w:tentative="1">
+      <w:start w:val="1"/>
+      <w:numFmt w:val="bullet"/>
+      <w:lvlText w:val=""/>
+      <w:lvlJc w:val="left"/>
+      <w:pPr>
+        <w:tabs>
+          <w:tab w:val="num" w:pos="3600"/>
+        </w:tabs>
+        <w:ind w:left="3600" w:hanging="360"/>
+      </w:pPr>
+      <w:rPr>
+        <w:rFonts w:ascii="Wingdings" w:hAnsi="Wingdings" w:hint="default"/>
+        <w:sz w:val="20"/>
+      </w:rPr>
+    </w:lvl>
+    <w:lvl w:ilvl="5" w:tentative="1">
+      <w:start w:val="1"/>
+      <w:numFmt w:val="bullet"/>
+      <w:lvlText w:val=""/>
+      <w:lvlJc w:val="left"/>
+      <w:pPr>
+        <w:tabs>
+          <w:tab w:val="num" w:pos="4320"/>
+        </w:tabs>
+        <w:ind w:left="4320" w:hanging="360"/>
+      </w:pPr>
+      <w:rPr>
+        <w:rFonts w:ascii="Wingdings" w:hAnsi="Wingdings" w:hint="default"/>
+        <w:sz w:val="20"/>
+      </w:rPr>
+    </w:lvl>
+    <w:lvl w:ilvl="6" w:tentative="1">
+      <w:start w:val="1"/>
+      <w:numFmt w:val="bullet"/>
+      <w:lvlText w:val=""/>
+      <w:lvlJc w:val="left"/>
+      <w:pPr>
+        <w:tabs>
+          <w:tab w:val="num" w:pos="5040"/>
+        </w:tabs>
+        <w:ind w:left="5040" w:hanging="360"/>
+      </w:pPr>
+      <w:rPr>
+        <w:rFonts w:ascii="Wingdings" w:hAnsi="Wingdings" w:hint="default"/>
+        <w:sz w:val="20"/>
+      </w:rPr>
+    </w:lvl>
+    <w:lvl w:ilvl="7" w:tentative="1">
+      <w:start w:val="1"/>
+      <w:numFmt w:val="bullet"/>
+      <w:lvlText w:val=""/>
+      <w:lvlJc w:val="left"/>
+      <w:pPr>
+        <w:tabs>
+          <w:tab w:val="num" w:pos="5760"/>
+        </w:tabs>
+        <w:ind w:left="5760" w:hanging="360"/>
+      </w:pPr>
+      <w:rPr>
+        <w:rFonts w:ascii="Wingdings" w:hAnsi="Wingdings" w:hint="default"/>
+        <w:sz w:val="20"/>
+      </w:rPr>
+    </w:lvl>
+    <w:lvl w:ilvl="8" w:tentative="1">
+      <w:start w:val="1"/>
+      <w:numFmt w:val="bullet"/>
+      <w:lvlText w:val=""/>
+      <w:lvlJc w:val="left"/>
+      <w:pPr>
+        <w:tabs>
+          <w:tab w:val="num" w:pos="6480"/>
+        </w:tabs>
+        <w:ind w:left="6480" w:hanging="360"/>
+      </w:pPr>
+      <w:rPr>
+        <w:rFonts w:ascii="Wingdings" w:hAnsi="Wingdings" w:hint="default"/>
+        <w:sz w:val="20"/>
+      </w:rPr>
+    </w:lvl>
+  </w:abstractNum>
+  <w:abstractNum w:abstractNumId="23" w15:restartNumberingAfterBreak="0">
+    <w:nsid w:val="48064CCC"/>
+    <w:multiLevelType w:val="multilevel"/>
+    <w:tmpl w:val="DCB25532"/>
+    <w:lvl w:ilvl="0">
+      <w:start w:val="1"/>
+      <w:numFmt w:val="bullet"/>
+      <w:lvlText w:val=""/>
+      <w:lvlJc w:val="left"/>
+      <w:pPr>
+        <w:tabs>
+          <w:tab w:val="num" w:pos="720"/>
+        </w:tabs>
+        <w:ind w:left="720" w:hanging="360"/>
+      </w:pPr>
+      <w:rPr>
+        <w:rFonts w:ascii="Symbol" w:hAnsi="Symbol" w:hint="default"/>
+        <w:sz w:val="20"/>
+      </w:rPr>
+    </w:lvl>
+    <w:lvl w:ilvl="1" w:tentative="1">
+      <w:start w:val="1"/>
+      <w:numFmt w:val="bullet"/>
+      <w:lvlText w:val="o"/>
+      <w:lvlJc w:val="left"/>
+      <w:pPr>
+        <w:tabs>
+          <w:tab w:val="num" w:pos="1440"/>
+        </w:tabs>
+        <w:ind w:left="1440" w:hanging="360"/>
+      </w:pPr>
+      <w:rPr>
+        <w:rFonts w:ascii="Courier New" w:hAnsi="Courier New" w:hint="default"/>
+        <w:sz w:val="20"/>
+      </w:rPr>
+    </w:lvl>
+    <w:lvl w:ilvl="2" w:tentative="1">
+      <w:start w:val="1"/>
+      <w:numFmt w:val="bullet"/>
+      <w:lvlText w:val=""/>
+      <w:lvlJc w:val="left"/>
+      <w:pPr>
+        <w:tabs>
+          <w:tab w:val="num" w:pos="2160"/>
+        </w:tabs>
+        <w:ind w:left="2160" w:hanging="360"/>
+      </w:pPr>
+      <w:rPr>
+        <w:rFonts w:ascii="Wingdings" w:hAnsi="Wingdings" w:hint="default"/>
+        <w:sz w:val="20"/>
+      </w:rPr>
+    </w:lvl>
+    <w:lvl w:ilvl="3" w:tentative="1">
+      <w:start w:val="1"/>
+      <w:numFmt w:val="bullet"/>
+      <w:lvlText w:val=""/>
+      <w:lvlJc w:val="left"/>
+      <w:pPr>
+        <w:tabs>
+          <w:tab w:val="num" w:pos="2880"/>
+        </w:tabs>
+        <w:ind w:left="2880" w:hanging="360"/>
+      </w:pPr>
+      <w:rPr>
+        <w:rFonts w:ascii="Wingdings" w:hAnsi="Wingdings" w:hint="default"/>
+        <w:sz w:val="20"/>
+      </w:rPr>
+    </w:lvl>
+    <w:lvl w:ilvl="4" w:tentative="1">
+      <w:start w:val="1"/>
+      <w:numFmt w:val="bullet"/>
+      <w:lvlText w:val=""/>
+      <w:lvlJc w:val="left"/>
+      <w:pPr>
+        <w:tabs>
+          <w:tab w:val="num" w:pos="3600"/>
+        </w:tabs>
+        <w:ind w:left="3600" w:hanging="360"/>
+      </w:pPr>
+      <w:rPr>
+        <w:rFonts w:ascii="Wingdings" w:hAnsi="Wingdings" w:hint="default"/>
+        <w:sz w:val="20"/>
+      </w:rPr>
+    </w:lvl>
+    <w:lvl w:ilvl="5" w:tentative="1">
+      <w:start w:val="1"/>
+      <w:numFmt w:val="bullet"/>
+      <w:lvlText w:val=""/>
+      <w:lvlJc w:val="left"/>
+      <w:pPr>
+        <w:tabs>
+          <w:tab w:val="num" w:pos="4320"/>
+        </w:tabs>
+        <w:ind w:left="4320" w:hanging="360"/>
+      </w:pPr>
+      <w:rPr>
+        <w:rFonts w:ascii="Wingdings" w:hAnsi="Wingdings" w:hint="default"/>
+        <w:sz w:val="20"/>
+      </w:rPr>
+    </w:lvl>
+    <w:lvl w:ilvl="6" w:tentative="1">
+      <w:start w:val="1"/>
+      <w:numFmt w:val="bullet"/>
+      <w:lvlText w:val=""/>
+      <w:lvlJc w:val="left"/>
+      <w:pPr>
+        <w:tabs>
+          <w:tab w:val="num" w:pos="5040"/>
+        </w:tabs>
+        <w:ind w:left="5040" w:hanging="360"/>
+      </w:pPr>
+      <w:rPr>
+        <w:rFonts w:ascii="Wingdings" w:hAnsi="Wingdings" w:hint="default"/>
+        <w:sz w:val="20"/>
+      </w:rPr>
+    </w:lvl>
+    <w:lvl w:ilvl="7" w:tentative="1">
+      <w:start w:val="1"/>
+      <w:numFmt w:val="bullet"/>
+      <w:lvlText w:val=""/>
+      <w:lvlJc w:val="left"/>
+      <w:pPr>
+        <w:tabs>
+          <w:tab w:val="num" w:pos="5760"/>
+        </w:tabs>
+        <w:ind w:left="5760" w:hanging="360"/>
+      </w:pPr>
+      <w:rPr>
+        <w:rFonts w:ascii="Wingdings" w:hAnsi="Wingdings" w:hint="default"/>
+        <w:sz w:val="20"/>
+      </w:rPr>
+    </w:lvl>
+    <w:lvl w:ilvl="8" w:tentative="1">
+      <w:start w:val="1"/>
+      <w:numFmt w:val="bullet"/>
+      <w:lvlText w:val=""/>
+      <w:lvlJc w:val="left"/>
+      <w:pPr>
+        <w:tabs>
+          <w:tab w:val="num" w:pos="6480"/>
+        </w:tabs>
+        <w:ind w:left="6480" w:hanging="360"/>
+      </w:pPr>
+      <w:rPr>
+        <w:rFonts w:ascii="Wingdings" w:hAnsi="Wingdings" w:hint="default"/>
+        <w:sz w:val="20"/>
+      </w:rPr>
+    </w:lvl>
+  </w:abstractNum>
+  <w:abstractNum w:abstractNumId="24" w15:restartNumberingAfterBreak="0">
     <w:nsid w:val="48BE5F8C"/>
     <w:multiLevelType w:val="multilevel"/>
     <w:tmpl w:val="6E88F5BA"/>
@@ -6225,7 +8361,7 @@
       </w:rPr>
     </w:lvl>
   </w:abstractNum>
-  <w:abstractNum w:abstractNumId="18" w15:restartNumberingAfterBreak="0">
+  <w:abstractNum w:abstractNumId="25" w15:restartNumberingAfterBreak="0">
     <w:nsid w:val="4A706327"/>
     <w:multiLevelType w:val="multilevel"/>
     <w:tmpl w:val="5670686A"/>
@@ -6374,7 +8510,156 @@
       </w:rPr>
     </w:lvl>
   </w:abstractNum>
-  <w:abstractNum w:abstractNumId="19" w15:restartNumberingAfterBreak="0">
+  <w:abstractNum w:abstractNumId="26" w15:restartNumberingAfterBreak="0">
+    <w:nsid w:val="4EAA0AC6"/>
+    <w:multiLevelType w:val="multilevel"/>
+    <w:tmpl w:val="1576C166"/>
+    <w:lvl w:ilvl="0">
+      <w:start w:val="1"/>
+      <w:numFmt w:val="bullet"/>
+      <w:lvlText w:val=""/>
+      <w:lvlJc w:val="left"/>
+      <w:pPr>
+        <w:tabs>
+          <w:tab w:val="num" w:pos="720"/>
+        </w:tabs>
+        <w:ind w:left="720" w:hanging="360"/>
+      </w:pPr>
+      <w:rPr>
+        <w:rFonts w:ascii="Symbol" w:hAnsi="Symbol" w:hint="default"/>
+        <w:sz w:val="20"/>
+      </w:rPr>
+    </w:lvl>
+    <w:lvl w:ilvl="1" w:tentative="1">
+      <w:start w:val="1"/>
+      <w:numFmt w:val="bullet"/>
+      <w:lvlText w:val="o"/>
+      <w:lvlJc w:val="left"/>
+      <w:pPr>
+        <w:tabs>
+          <w:tab w:val="num" w:pos="1440"/>
+        </w:tabs>
+        <w:ind w:left="1440" w:hanging="360"/>
+      </w:pPr>
+      <w:rPr>
+        <w:rFonts w:ascii="Courier New" w:hAnsi="Courier New" w:hint="default"/>
+        <w:sz w:val="20"/>
+      </w:rPr>
+    </w:lvl>
+    <w:lvl w:ilvl="2" w:tentative="1">
+      <w:start w:val="1"/>
+      <w:numFmt w:val="bullet"/>
+      <w:lvlText w:val=""/>
+      <w:lvlJc w:val="left"/>
+      <w:pPr>
+        <w:tabs>
+          <w:tab w:val="num" w:pos="2160"/>
+        </w:tabs>
+        <w:ind w:left="2160" w:hanging="360"/>
+      </w:pPr>
+      <w:rPr>
+        <w:rFonts w:ascii="Wingdings" w:hAnsi="Wingdings" w:hint="default"/>
+        <w:sz w:val="20"/>
+      </w:rPr>
+    </w:lvl>
+    <w:lvl w:ilvl="3" w:tentative="1">
+      <w:start w:val="1"/>
+      <w:numFmt w:val="bullet"/>
+      <w:lvlText w:val=""/>
+      <w:lvlJc w:val="left"/>
+      <w:pPr>
+        <w:tabs>
+          <w:tab w:val="num" w:pos="2880"/>
+        </w:tabs>
+        <w:ind w:left="2880" w:hanging="360"/>
+      </w:pPr>
+      <w:rPr>
+        <w:rFonts w:ascii="Wingdings" w:hAnsi="Wingdings" w:hint="default"/>
+        <w:sz w:val="20"/>
+      </w:rPr>
+    </w:lvl>
+    <w:lvl w:ilvl="4" w:tentative="1">
+      <w:start w:val="1"/>
+      <w:numFmt w:val="bullet"/>
+      <w:lvlText w:val=""/>
+      <w:lvlJc w:val="left"/>
+      <w:pPr>
+        <w:tabs>
+          <w:tab w:val="num" w:pos="3600"/>
+        </w:tabs>
+        <w:ind w:left="3600" w:hanging="360"/>
+      </w:pPr>
+      <w:rPr>
+        <w:rFonts w:ascii="Wingdings" w:hAnsi="Wingdings" w:hint="default"/>
+        <w:sz w:val="20"/>
+      </w:rPr>
+    </w:lvl>
+    <w:lvl w:ilvl="5" w:tentative="1">
+      <w:start w:val="1"/>
+      <w:numFmt w:val="bullet"/>
+      <w:lvlText w:val=""/>
+      <w:lvlJc w:val="left"/>
+      <w:pPr>
+        <w:tabs>
+          <w:tab w:val="num" w:pos="4320"/>
+        </w:tabs>
+        <w:ind w:left="4320" w:hanging="360"/>
+      </w:pPr>
+      <w:rPr>
+        <w:rFonts w:ascii="Wingdings" w:hAnsi="Wingdings" w:hint="default"/>
+        <w:sz w:val="20"/>
+      </w:rPr>
+    </w:lvl>
+    <w:lvl w:ilvl="6" w:tentative="1">
+      <w:start w:val="1"/>
+      <w:numFmt w:val="bullet"/>
+      <w:lvlText w:val=""/>
+      <w:lvlJc w:val="left"/>
+      <w:pPr>
+        <w:tabs>
+          <w:tab w:val="num" w:pos="5040"/>
+        </w:tabs>
+        <w:ind w:left="5040" w:hanging="360"/>
+      </w:pPr>
+      <w:rPr>
+        <w:rFonts w:ascii="Wingdings" w:hAnsi="Wingdings" w:hint="default"/>
+        <w:sz w:val="20"/>
+      </w:rPr>
+    </w:lvl>
+    <w:lvl w:ilvl="7" w:tentative="1">
+      <w:start w:val="1"/>
+      <w:numFmt w:val="bullet"/>
+      <w:lvlText w:val=""/>
+      <w:lvlJc w:val="left"/>
+      <w:pPr>
+        <w:tabs>
+          <w:tab w:val="num" w:pos="5760"/>
+        </w:tabs>
+        <w:ind w:left="5760" w:hanging="360"/>
+      </w:pPr>
+      <w:rPr>
+        <w:rFonts w:ascii="Wingdings" w:hAnsi="Wingdings" w:hint="default"/>
+        <w:sz w:val="20"/>
+      </w:rPr>
+    </w:lvl>
+    <w:lvl w:ilvl="8" w:tentative="1">
+      <w:start w:val="1"/>
+      <w:numFmt w:val="bullet"/>
+      <w:lvlText w:val=""/>
+      <w:lvlJc w:val="left"/>
+      <w:pPr>
+        <w:tabs>
+          <w:tab w:val="num" w:pos="6480"/>
+        </w:tabs>
+        <w:ind w:left="6480" w:hanging="360"/>
+      </w:pPr>
+      <w:rPr>
+        <w:rFonts w:ascii="Wingdings" w:hAnsi="Wingdings" w:hint="default"/>
+        <w:sz w:val="20"/>
+      </w:rPr>
+    </w:lvl>
+  </w:abstractNum>
+  <w:abstractNum w:abstractNumId="27" w15:restartNumberingAfterBreak="0">
     <w:nsid w:val="51E21811"/>
     <w:multiLevelType w:val="multilevel"/>
     <w:tmpl w:val="FD4A8700"/>
@@ -6523,7 +8808,7 @@
       </w:rPr>
     </w:lvl>
   </w:abstractNum>
-  <w:abstractNum w:abstractNumId="20" w15:restartNumberingAfterBreak="0">
+  <w:abstractNum w:abstractNumId="28" w15:restartNumberingAfterBreak="0">
     <w:nsid w:val="532151B0"/>
     <w:multiLevelType w:val="multilevel"/>
     <w:tmpl w:val="0D086024"/>
@@ -6672,7 +8957,7 @@
       </w:rPr>
     </w:lvl>
   </w:abstractNum>
-  <w:abstractNum w:abstractNumId="21" w15:restartNumberingAfterBreak="0">
+  <w:abstractNum w:abstractNumId="29" w15:restartNumberingAfterBreak="0">
     <w:nsid w:val="578E3788"/>
     <w:multiLevelType w:val="multilevel"/>
     <w:tmpl w:val="21A8B608"/>
@@ -6821,7 +9106,7 @@
       </w:rPr>
     </w:lvl>
   </w:abstractNum>
-  <w:abstractNum w:abstractNumId="22" w15:restartNumberingAfterBreak="0">
+  <w:abstractNum w:abstractNumId="30" w15:restartNumberingAfterBreak="0">
     <w:nsid w:val="57FB7CA6"/>
     <w:multiLevelType w:val="multilevel"/>
     <w:tmpl w:val="961C5E4C"/>
@@ -6970,7 +9255,7 @@
       </w:rPr>
     </w:lvl>
   </w:abstractNum>
-  <w:abstractNum w:abstractNumId="23" w15:restartNumberingAfterBreak="0">
+  <w:abstractNum w:abstractNumId="31" w15:restartNumberingAfterBreak="0">
     <w:nsid w:val="5B1D2FAF"/>
     <w:multiLevelType w:val="multilevel"/>
     <w:tmpl w:val="069E37F6"/>
@@ -7119,7 +9404,7 @@
       </w:rPr>
     </w:lvl>
   </w:abstractNum>
-  <w:abstractNum w:abstractNumId="24" w15:restartNumberingAfterBreak="0">
+  <w:abstractNum w:abstractNumId="32" w15:restartNumberingAfterBreak="0">
     <w:nsid w:val="60894133"/>
     <w:multiLevelType w:val="multilevel"/>
     <w:tmpl w:val="F9025846"/>
@@ -7268,7 +9553,7 @@
       </w:rPr>
     </w:lvl>
   </w:abstractNum>
-  <w:abstractNum w:abstractNumId="25" w15:restartNumberingAfterBreak="0">
+  <w:abstractNum w:abstractNumId="33" w15:restartNumberingAfterBreak="0">
     <w:nsid w:val="64346862"/>
     <w:multiLevelType w:val="multilevel"/>
     <w:tmpl w:val="648A81A6"/>
@@ -7417,7 +9702,7 @@
       </w:rPr>
     </w:lvl>
   </w:abstractNum>
-  <w:abstractNum w:abstractNumId="26" w15:restartNumberingAfterBreak="0">
+  <w:abstractNum w:abstractNumId="34" w15:restartNumberingAfterBreak="0">
     <w:nsid w:val="64640F3C"/>
     <w:multiLevelType w:val="multilevel"/>
     <w:tmpl w:val="5AD64210"/>
@@ -7566,7 +9851,7 @@
       </w:rPr>
     </w:lvl>
   </w:abstractNum>
-  <w:abstractNum w:abstractNumId="27" w15:restartNumberingAfterBreak="0">
+  <w:abstractNum w:abstractNumId="35" w15:restartNumberingAfterBreak="0">
     <w:nsid w:val="6B376E5F"/>
     <w:multiLevelType w:val="multilevel"/>
     <w:tmpl w:val="009004C0"/>
@@ -7715,7 +10000,7 @@
       </w:rPr>
     </w:lvl>
   </w:abstractNum>
-  <w:abstractNum w:abstractNumId="28" w15:restartNumberingAfterBreak="0">
+  <w:abstractNum w:abstractNumId="36" w15:restartNumberingAfterBreak="0">
     <w:nsid w:val="6BCD6974"/>
     <w:multiLevelType w:val="multilevel"/>
     <w:tmpl w:val="9F2E3DB0"/>
@@ -7864,7 +10149,7 @@
       </w:rPr>
     </w:lvl>
   </w:abstractNum>
-  <w:abstractNum w:abstractNumId="29" w15:restartNumberingAfterBreak="0">
+  <w:abstractNum w:abstractNumId="37" w15:restartNumberingAfterBreak="0">
     <w:nsid w:val="70931114"/>
     <w:multiLevelType w:val="multilevel"/>
     <w:tmpl w:val="A314D588"/>
@@ -8013,7 +10298,7 @@
       </w:rPr>
     </w:lvl>
   </w:abstractNum>
-  <w:abstractNum w:abstractNumId="30" w15:restartNumberingAfterBreak="0">
+  <w:abstractNum w:abstractNumId="38" w15:restartNumberingAfterBreak="0">
     <w:nsid w:val="7220769C"/>
     <w:multiLevelType w:val="multilevel"/>
     <w:tmpl w:val="11427F9C"/>
@@ -8162,7 +10447,7 @@
       </w:rPr>
     </w:lvl>
   </w:abstractNum>
-  <w:abstractNum w:abstractNumId="31" w15:restartNumberingAfterBreak="0">
+  <w:abstractNum w:abstractNumId="39" w15:restartNumberingAfterBreak="0">
     <w:nsid w:val="72D82598"/>
     <w:multiLevelType w:val="multilevel"/>
     <w:tmpl w:val="F1B66624"/>
@@ -8311,7 +10596,7 @@
       </w:rPr>
     </w:lvl>
   </w:abstractNum>
-  <w:abstractNum w:abstractNumId="32" w15:restartNumberingAfterBreak="0">
+  <w:abstractNum w:abstractNumId="40" w15:restartNumberingAfterBreak="0">
     <w:nsid w:val="7308571D"/>
     <w:multiLevelType w:val="multilevel"/>
     <w:tmpl w:val="86E68DBC"/>
@@ -8460,7 +10745,7 @@
       </w:rPr>
     </w:lvl>
   </w:abstractNum>
-  <w:abstractNum w:abstractNumId="33" w15:restartNumberingAfterBreak="0">
+  <w:abstractNum w:abstractNumId="41" w15:restartNumberingAfterBreak="0">
     <w:nsid w:val="75E76A92"/>
     <w:multiLevelType w:val="multilevel"/>
     <w:tmpl w:val="854C3CC4"/>
@@ -8609,7 +10894,7 @@
       </w:rPr>
     </w:lvl>
   </w:abstractNum>
-  <w:abstractNum w:abstractNumId="34" w15:restartNumberingAfterBreak="0">
+  <w:abstractNum w:abstractNumId="42" w15:restartNumberingAfterBreak="0">
     <w:nsid w:val="76A20783"/>
     <w:multiLevelType w:val="multilevel"/>
     <w:tmpl w:val="C9928DC0"/>
@@ -8758,7 +11043,7 @@
       </w:rPr>
     </w:lvl>
   </w:abstractNum>
-  <w:abstractNum w:abstractNumId="35" w15:restartNumberingAfterBreak="0">
+  <w:abstractNum w:abstractNumId="43" w15:restartNumberingAfterBreak="0">
     <w:nsid w:val="7899679E"/>
     <w:multiLevelType w:val="multilevel"/>
     <w:tmpl w:val="E8EA175E"/>
@@ -8907,7 +11192,7 @@
       </w:rPr>
     </w:lvl>
   </w:abstractNum>
-  <w:abstractNum w:abstractNumId="36" w15:restartNumberingAfterBreak="0">
+  <w:abstractNum w:abstractNumId="44" w15:restartNumberingAfterBreak="0">
     <w:nsid w:val="7D2C60EB"/>
     <w:multiLevelType w:val="multilevel"/>
     <w:tmpl w:val="E436985A"/>
@@ -9056,7 +11341,7 @@
       </w:rPr>
     </w:lvl>
   </w:abstractNum>
-  <w:abstractNum w:abstractNumId="37" w15:restartNumberingAfterBreak="0">
+  <w:abstractNum w:abstractNumId="45" w15:restartNumberingAfterBreak="0">
     <w:nsid w:val="7E780683"/>
     <w:multiLevelType w:val="multilevel"/>
     <w:tmpl w:val="014C15CC"/>
@@ -9205,7 +11490,7 @@
       </w:rPr>
     </w:lvl>
   </w:abstractNum>
-  <w:abstractNum w:abstractNumId="38" w15:restartNumberingAfterBreak="0">
+  <w:abstractNum w:abstractNumId="46" w15:restartNumberingAfterBreak="0">
     <w:nsid w:val="7EA729D7"/>
     <w:multiLevelType w:val="multilevel"/>
     <w:tmpl w:val="9B080324"/>
@@ -9355,121 +11640,145 @@
     </w:lvl>
   </w:abstractNum>
   <w:num w:numId="1" w16cid:durableId="747076902">
-    <w:abstractNumId w:val="2"/>
+    <w:abstractNumId w:val="4"/>
   </w:num>
   <w:num w:numId="2" w16cid:durableId="1084763397">
+    <w:abstractNumId w:val="35"/>
+  </w:num>
+  <w:num w:numId="3" w16cid:durableId="1421292685">
     <w:abstractNumId w:val="27"/>
   </w:num>
-  <w:num w:numId="3" w16cid:durableId="1421292685">
-    <w:abstractNumId w:val="19"/>
-  </w:num>
   <w:num w:numId="4" w16cid:durableId="1394741547">
-    <w:abstractNumId w:val="20"/>
+    <w:abstractNumId w:val="28"/>
   </w:num>
   <w:num w:numId="5" w16cid:durableId="541285234">
-    <w:abstractNumId w:val="25"/>
+    <w:abstractNumId w:val="33"/>
   </w:num>
   <w:num w:numId="6" w16cid:durableId="112136993">
-    <w:abstractNumId w:val="30"/>
+    <w:abstractNumId w:val="38"/>
   </w:num>
   <w:num w:numId="7" w16cid:durableId="666979020">
     <w:abstractNumId w:val="0"/>
   </w:num>
   <w:num w:numId="8" w16cid:durableId="100346360">
+    <w:abstractNumId w:val="15"/>
+  </w:num>
+  <w:num w:numId="9" w16cid:durableId="849218406">
+    <w:abstractNumId w:val="18"/>
+  </w:num>
+  <w:num w:numId="10" w16cid:durableId="2059817920">
+    <w:abstractNumId w:val="39"/>
+  </w:num>
+  <w:num w:numId="11" w16cid:durableId="1458376617">
+    <w:abstractNumId w:val="13"/>
+  </w:num>
+  <w:num w:numId="12" w16cid:durableId="1746338999">
+    <w:abstractNumId w:val="43"/>
+  </w:num>
+  <w:num w:numId="13" w16cid:durableId="2051688984">
+    <w:abstractNumId w:val="20"/>
+  </w:num>
+  <w:num w:numId="14" w16cid:durableId="263999993">
+    <w:abstractNumId w:val="25"/>
+  </w:num>
+  <w:num w:numId="15" w16cid:durableId="1684285504">
+    <w:abstractNumId w:val="40"/>
+  </w:num>
+  <w:num w:numId="16" w16cid:durableId="1885755082">
+    <w:abstractNumId w:val="21"/>
+  </w:num>
+  <w:num w:numId="17" w16cid:durableId="1362440721">
+    <w:abstractNumId w:val="19"/>
+  </w:num>
+  <w:num w:numId="18" w16cid:durableId="1348141909">
+    <w:abstractNumId w:val="42"/>
+  </w:num>
+  <w:num w:numId="19" w16cid:durableId="616713830">
+    <w:abstractNumId w:val="7"/>
+  </w:num>
+  <w:num w:numId="20" w16cid:durableId="1106655989">
+    <w:abstractNumId w:val="37"/>
+  </w:num>
+  <w:num w:numId="21" w16cid:durableId="306085412">
+    <w:abstractNumId w:val="30"/>
+  </w:num>
+  <w:num w:numId="22" w16cid:durableId="982926252">
+    <w:abstractNumId w:val="45"/>
+  </w:num>
+  <w:num w:numId="23" w16cid:durableId="2003728588">
+    <w:abstractNumId w:val="34"/>
+  </w:num>
+  <w:num w:numId="24" w16cid:durableId="760882046">
+    <w:abstractNumId w:val="31"/>
+  </w:num>
+  <w:num w:numId="25" w16cid:durableId="1024211133">
+    <w:abstractNumId w:val="41"/>
+  </w:num>
+  <w:num w:numId="26" w16cid:durableId="1834494095">
+    <w:abstractNumId w:val="29"/>
+  </w:num>
+  <w:num w:numId="27" w16cid:durableId="1773548455">
+    <w:abstractNumId w:val="16"/>
+  </w:num>
+  <w:num w:numId="28" w16cid:durableId="2087878164">
+    <w:abstractNumId w:val="32"/>
+  </w:num>
+  <w:num w:numId="29" w16cid:durableId="1629168061">
+    <w:abstractNumId w:val="9"/>
+  </w:num>
+  <w:num w:numId="30" w16cid:durableId="2093311385">
+    <w:abstractNumId w:val="46"/>
+  </w:num>
+  <w:num w:numId="31" w16cid:durableId="1884711522">
+    <w:abstractNumId w:val="36"/>
+  </w:num>
+  <w:num w:numId="32" w16cid:durableId="1196046497">
+    <w:abstractNumId w:val="5"/>
+  </w:num>
+  <w:num w:numId="33" w16cid:durableId="1829054750">
     <w:abstractNumId w:val="11"/>
   </w:num>
-  <w:num w:numId="9" w16cid:durableId="849218406">
-    <w:abstractNumId w:val="13"/>
-  </w:num>
-  <w:num w:numId="10" w16cid:durableId="2059817920">
-    <w:abstractNumId w:val="31"/>
-  </w:num>
-  <w:num w:numId="11" w16cid:durableId="1458376617">
-    <w:abstractNumId w:val="9"/>
-  </w:num>
-  <w:num w:numId="12" w16cid:durableId="1746338999">
-    <w:abstractNumId w:val="35"/>
-  </w:num>
-  <w:num w:numId="13" w16cid:durableId="2051688984">
-    <w:abstractNumId w:val="15"/>
-  </w:num>
-  <w:num w:numId="14" w16cid:durableId="263999993">
-    <w:abstractNumId w:val="18"/>
-  </w:num>
-  <w:num w:numId="15" w16cid:durableId="1684285504">
-    <w:abstractNumId w:val="32"/>
-  </w:num>
-  <w:num w:numId="16" w16cid:durableId="1885755082">
-    <w:abstractNumId w:val="16"/>
-  </w:num>
-  <w:num w:numId="17" w16cid:durableId="1362440721">
-    <w:abstractNumId w:val="14"/>
-  </w:num>
-  <w:num w:numId="18" w16cid:durableId="1348141909">
-    <w:abstractNumId w:val="34"/>
-  </w:num>
-  <w:num w:numId="19" w16cid:durableId="616713830">
-    <w:abstractNumId w:val="5"/>
-  </w:num>
-  <w:num w:numId="20" w16cid:durableId="1106655989">
-    <w:abstractNumId w:val="29"/>
-  </w:num>
-  <w:num w:numId="21" w16cid:durableId="306085412">
-    <w:abstractNumId w:val="22"/>
-  </w:num>
-  <w:num w:numId="22" w16cid:durableId="982926252">
-    <w:abstractNumId w:val="37"/>
-  </w:num>
-  <w:num w:numId="23" w16cid:durableId="2003728588">
-    <w:abstractNumId w:val="26"/>
-  </w:num>
-  <w:num w:numId="24" w16cid:durableId="760882046">
-    <w:abstractNumId w:val="23"/>
-  </w:num>
-  <w:num w:numId="25" w16cid:durableId="1024211133">
-    <w:abstractNumId w:val="33"/>
-  </w:num>
-  <w:num w:numId="26" w16cid:durableId="1834494095">
-    <w:abstractNumId w:val="21"/>
-  </w:num>
-  <w:num w:numId="27" w16cid:durableId="1773548455">
-    <w:abstractNumId w:val="12"/>
-  </w:num>
-  <w:num w:numId="28" w16cid:durableId="2087878164">
-    <w:abstractNumId w:val="24"/>
-  </w:num>
-  <w:num w:numId="29" w16cid:durableId="1629168061">
-    <w:abstractNumId w:val="7"/>
-  </w:num>
-  <w:num w:numId="30" w16cid:durableId="2093311385">
-    <w:abstractNumId w:val="38"/>
-  </w:num>
-  <w:num w:numId="31" w16cid:durableId="1884711522">
-    <w:abstractNumId w:val="28"/>
-  </w:num>
-  <w:num w:numId="32" w16cid:durableId="1196046497">
-    <w:abstractNumId w:val="3"/>
-  </w:num>
-  <w:num w:numId="33" w16cid:durableId="1829054750">
+  <w:num w:numId="34" w16cid:durableId="1861431455">
     <w:abstractNumId w:val="8"/>
-  </w:num>
-  <w:num w:numId="34" w16cid:durableId="1861431455">
-    <w:abstractNumId w:val="6"/>
   </w:num>
   <w:num w:numId="35" w16cid:durableId="1977445129">
     <w:abstractNumId w:val="1"/>
   </w:num>
   <w:num w:numId="36" w16cid:durableId="699747935">
+    <w:abstractNumId w:val="14"/>
+  </w:num>
+  <w:num w:numId="37" w16cid:durableId="1193299769">
+    <w:abstractNumId w:val="24"/>
+  </w:num>
+  <w:num w:numId="38" w16cid:durableId="814759806">
+    <w:abstractNumId w:val="44"/>
+  </w:num>
+  <w:num w:numId="39" w16cid:durableId="868643701">
+    <w:abstractNumId w:val="6"/>
+  </w:num>
+  <w:num w:numId="40" w16cid:durableId="1727290300">
+    <w:abstractNumId w:val="23"/>
+  </w:num>
+  <w:num w:numId="41" w16cid:durableId="1825589490">
+    <w:abstractNumId w:val="26"/>
+  </w:num>
+  <w:num w:numId="42" w16cid:durableId="1877429457">
+    <w:abstractNumId w:val="3"/>
+  </w:num>
+  <w:num w:numId="43" w16cid:durableId="2068214803">
     <w:abstractNumId w:val="10"/>
   </w:num>
-  <w:num w:numId="37" w16cid:durableId="1193299769">
+  <w:num w:numId="44" w16cid:durableId="206574674">
+    <w:abstractNumId w:val="2"/>
+  </w:num>
+  <w:num w:numId="45" w16cid:durableId="496729806">
+    <w:abstractNumId w:val="12"/>
+  </w:num>
+  <w:num w:numId="46" w16cid:durableId="157381413">
     <w:abstractNumId w:val="17"/>
   </w:num>
-  <w:num w:numId="38" w16cid:durableId="814759806">
-    <w:abstractNumId w:val="36"/>
-  </w:num>
-  <w:num w:numId="39" w16cid:durableId="868643701">
-    <w:abstractNumId w:val="4"/>
+  <w:num w:numId="47" w16cid:durableId="955452539">
+    <w:abstractNumId w:val="22"/>
   </w:num>
 </w:numbering>
 </file>

</xml_diff>

<commit_message>
doc: atualização da documentação dos requisitos funcionais
</commit_message>
<xml_diff>
--- a/docs/ApêndiceB-Requisitos/PID_RequisitosFuncionais.docx
+++ b/docs/ApêndiceB-Requisitos/PID_RequisitosFuncionais.docx
@@ -613,25 +613,7 @@
           <w:sz w:val="24"/>
           <w:szCs w:val="24"/>
         </w:rPr>
-        <w:t xml:space="preserve"> (X) essencial </w:t>
-      </w:r>
-      <w:proofErr w:type="gramStart"/>
-      <w:r>
-        <w:rPr>
-          <w:rFonts w:ascii="Times New Roman" w:eastAsia="Times New Roman" w:hAnsi="Times New Roman" w:cs="Times New Roman"/>
-          <w:sz w:val="24"/>
-          <w:szCs w:val="24"/>
-        </w:rPr>
-        <w:t>( )</w:t>
-      </w:r>
-      <w:proofErr w:type="gramEnd"/>
-      <w:r>
-        <w:rPr>
-          <w:rFonts w:ascii="Times New Roman" w:eastAsia="Times New Roman" w:hAnsi="Times New Roman" w:cs="Times New Roman"/>
-          <w:sz w:val="24"/>
-          <w:szCs w:val="24"/>
-        </w:rPr>
-        <w:t xml:space="preserve"> importante ( ) desejável</w:t>
+        <w:t xml:space="preserve"> (X) essencial ( ) importante ( ) desejável</w:t>
       </w:r>
     </w:p>
     <w:p>
@@ -959,43 +941,25 @@
           <w:sz w:val="24"/>
           <w:szCs w:val="24"/>
         </w:rPr>
-        <w:t xml:space="preserve"> (X) essencial </w:t>
-      </w:r>
-      <w:proofErr w:type="gramStart"/>
-      <w:r>
-        <w:rPr>
-          <w:rFonts w:ascii="Times New Roman" w:eastAsia="Times New Roman" w:hAnsi="Times New Roman" w:cs="Times New Roman"/>
-          <w:sz w:val="24"/>
-          <w:szCs w:val="24"/>
-        </w:rPr>
-        <w:t>( )</w:t>
-      </w:r>
-      <w:proofErr w:type="gramEnd"/>
-      <w:r>
-        <w:rPr>
-          <w:rFonts w:ascii="Times New Roman" w:eastAsia="Times New Roman" w:hAnsi="Times New Roman" w:cs="Times New Roman"/>
-          <w:sz w:val="24"/>
-          <w:szCs w:val="24"/>
-        </w:rPr>
-        <w:t xml:space="preserve"> importante ( ) desejável</w:t>
-      </w:r>
-    </w:p>
-    <w:p>
-      <w:pPr>
-        <w:rPr>
-          <w:rFonts w:ascii="Times New Roman" w:eastAsia="Times New Roman" w:hAnsi="Times New Roman" w:cs="Times New Roman"/>
-          <w:sz w:val="24"/>
-          <w:szCs w:val="24"/>
-        </w:rPr>
-      </w:pPr>
-    </w:p>
-    <w:p>
-      <w:pPr>
-        <w:pStyle w:val="Ttulo3"/>
-        <w:keepNext w:val="0"/>
-        <w:keepLines w:val="0"/>
-        <w:rPr>
-          <w:rFonts w:ascii="Times New Roman" w:eastAsia="Times New Roman" w:hAnsi="Times New Roman" w:cs="Times New Roman"/>
+        <w:t xml:space="preserve"> (X) essencial ( ) importante ( ) desejável</w:t>
+      </w:r>
+    </w:p>
+    <w:p>
+      <w:pPr>
+        <w:rPr>
+          <w:rFonts w:ascii="Times New Roman" w:eastAsia="Times New Roman" w:hAnsi="Times New Roman" w:cs="Times New Roman"/>
+          <w:sz w:val="24"/>
+          <w:szCs w:val="24"/>
+        </w:rPr>
+      </w:pPr>
+    </w:p>
+    <w:p>
+      <w:pPr>
+        <w:spacing w:before="240" w:after="240"/>
+        <w:rPr>
+          <w:rFonts w:ascii="Times New Roman" w:eastAsia="Times New Roman" w:hAnsi="Times New Roman" w:cs="Times New Roman"/>
+          <w:b/>
+          <w:bCs/>
           <w:sz w:val="24"/>
           <w:szCs w:val="24"/>
         </w:rPr>
@@ -1005,50 +969,17 @@
       <w:r>
         <w:rPr>
           <w:rFonts w:ascii="Times New Roman" w:eastAsia="Times New Roman" w:hAnsi="Times New Roman" w:cs="Times New Roman"/>
-          <w:sz w:val="24"/>
-          <w:szCs w:val="24"/>
-        </w:rPr>
-        <w:t>RF 3 – Publicar solicitação de serviço</w:t>
-      </w:r>
-    </w:p>
-    <w:p>
-      <w:pPr>
-        <w:spacing w:before="240" w:after="240"/>
-        <w:rPr>
-          <w:rFonts w:ascii="Times New Roman" w:eastAsia="Times New Roman" w:hAnsi="Times New Roman" w:cs="Times New Roman"/>
-          <w:sz w:val="24"/>
-          <w:szCs w:val="24"/>
-        </w:rPr>
-      </w:pPr>
-      <w:r>
-        <w:rPr>
-          <w:rFonts w:ascii="Times New Roman" w:eastAsia="Times New Roman" w:hAnsi="Times New Roman" w:cs="Times New Roman"/>
           <w:b/>
           <w:bCs/>
           <w:sz w:val="24"/>
           <w:szCs w:val="24"/>
         </w:rPr>
-        <w:t>Descrição:</w:t>
-      </w:r>
-      <w:r>
-        <w:rPr>
-          <w:rFonts w:ascii="Times New Roman" w:eastAsia="Times New Roman" w:hAnsi="Times New Roman" w:cs="Times New Roman"/>
-          <w:sz w:val="24"/>
-          <w:szCs w:val="24"/>
-        </w:rPr>
-        <w:t xml:space="preserve"> O sistema deve permitir que usuários do tipo cliente publiquem solicitações de serviços contendo título, descrição, fotos, categoria do serviço e datas disponíveis para realização do trabalho.</w:t>
-      </w:r>
-    </w:p>
-    <w:p>
-      <w:pPr>
-        <w:spacing w:before="240" w:after="240"/>
-        <w:rPr>
-          <w:rFonts w:ascii="Times New Roman" w:eastAsia="Times New Roman" w:hAnsi="Times New Roman" w:cs="Times New Roman"/>
-          <w:sz w:val="24"/>
-          <w:szCs w:val="24"/>
-        </w:rPr>
-      </w:pPr>
-      <w:r>
+        <w:t>RF 3 – Publicar solicitação de serviço</w:t>
+      </w:r>
+    </w:p>
+    <w:p>
+      <w:pPr>
+        <w:spacing w:before="240" w:after="240"/>
         <w:rPr>
           <w:rFonts w:ascii="Times New Roman" w:eastAsia="Times New Roman" w:hAnsi="Times New Roman" w:cs="Times New Roman"/>
           <w:b/>
@@ -1056,14 +987,63 @@
           <w:sz w:val="24"/>
           <w:szCs w:val="24"/>
         </w:rPr>
-        <w:t>Restrições:</w:t>
+      </w:pPr>
+      <w:r>
+        <w:rPr>
+          <w:rFonts w:ascii="Times New Roman" w:eastAsia="Times New Roman" w:hAnsi="Times New Roman" w:cs="Times New Roman"/>
+          <w:b/>
+          <w:bCs/>
+          <w:sz w:val="24"/>
+          <w:szCs w:val="24"/>
+        </w:rPr>
+        <w:t>Descrição:</w:t>
+      </w:r>
+      <w:r>
+        <w:rPr>
+          <w:rFonts w:ascii="Times New Roman" w:eastAsia="Times New Roman" w:hAnsi="Times New Roman" w:cs="Times New Roman"/>
+          <w:b/>
+          <w:bCs/>
+          <w:sz w:val="24"/>
+          <w:szCs w:val="24"/>
+        </w:rPr>
+        <w:br/>
+      </w:r>
+      <w:r>
+        <w:rPr>
+          <w:rFonts w:ascii="Times New Roman" w:eastAsia="Times New Roman" w:hAnsi="Times New Roman" w:cs="Times New Roman"/>
+          <w:sz w:val="24"/>
+          <w:szCs w:val="24"/>
+        </w:rPr>
+        <w:t>O sistema deve permitir que usuários autenticados publiquem solicitações de serviço informando título, categoria, descrição detalhada, cidade, bairro, datas disponíveis, horários disponíveis, observações adicionais e fotos opcionais. O sistema deverá gerar automaticamente um identificador único para o serviço e definir seu status inicial como "ABERTO".</w:t>
+      </w:r>
+    </w:p>
+    <w:p>
+      <w:pPr>
+        <w:spacing w:before="240" w:after="240"/>
+        <w:rPr>
+          <w:rFonts w:ascii="Times New Roman" w:eastAsia="Times New Roman" w:hAnsi="Times New Roman" w:cs="Times New Roman"/>
+          <w:b/>
+          <w:bCs/>
+          <w:sz w:val="24"/>
+          <w:szCs w:val="24"/>
+        </w:rPr>
+      </w:pPr>
+      <w:r>
+        <w:rPr>
+          <w:rFonts w:ascii="Times New Roman" w:eastAsia="Times New Roman" w:hAnsi="Times New Roman" w:cs="Times New Roman"/>
+          <w:b/>
+          <w:bCs/>
+          <w:sz w:val="24"/>
+          <w:szCs w:val="24"/>
+        </w:rPr>
+        <w:t>Dados utilizados:</w:t>
       </w:r>
     </w:p>
     <w:p>
       <w:pPr>
         <w:numPr>
           <w:ilvl w:val="0"/>
-          <w:numId w:val="10"/>
+          <w:numId w:val="48"/>
         </w:numPr>
         <w:spacing w:before="240" w:after="240"/>
         <w:rPr>
@@ -1078,14 +1058,14 @@
           <w:sz w:val="24"/>
           <w:szCs w:val="24"/>
         </w:rPr>
-        <w:t xml:space="preserve">Usuário deve estar autenticado </w:t>
+        <w:t xml:space="preserve">Título </w:t>
       </w:r>
     </w:p>
     <w:p>
       <w:pPr>
         <w:numPr>
           <w:ilvl w:val="0"/>
-          <w:numId w:val="10"/>
+          <w:numId w:val="48"/>
         </w:numPr>
         <w:spacing w:before="240" w:after="240"/>
         <w:rPr>
@@ -1100,14 +1080,14 @@
           <w:sz w:val="24"/>
           <w:szCs w:val="24"/>
         </w:rPr>
-        <w:t xml:space="preserve">Campos obrigatórios devem ser preenchidos </w:t>
+        <w:t xml:space="preserve">Categoria </w:t>
       </w:r>
     </w:p>
     <w:p>
       <w:pPr>
         <w:numPr>
           <w:ilvl w:val="0"/>
-          <w:numId w:val="10"/>
+          <w:numId w:val="48"/>
         </w:numPr>
         <w:spacing w:before="240" w:after="240"/>
         <w:rPr>
@@ -1122,19 +1102,167 @@
           <w:sz w:val="24"/>
           <w:szCs w:val="24"/>
         </w:rPr>
-        <w:t xml:space="preserve">Limite de fotos por serviço </w:t>
-      </w:r>
-    </w:p>
-    <w:p>
-      <w:pPr>
-        <w:spacing w:before="240" w:after="240"/>
-        <w:rPr>
-          <w:rFonts w:ascii="Times New Roman" w:eastAsia="Times New Roman" w:hAnsi="Times New Roman" w:cs="Times New Roman"/>
-          <w:sz w:val="24"/>
-          <w:szCs w:val="24"/>
-        </w:rPr>
-      </w:pPr>
-      <w:r>
+        <w:t xml:space="preserve">Descrição </w:t>
+      </w:r>
+    </w:p>
+    <w:p>
+      <w:pPr>
+        <w:numPr>
+          <w:ilvl w:val="0"/>
+          <w:numId w:val="48"/>
+        </w:numPr>
+        <w:spacing w:before="240" w:after="240"/>
+        <w:rPr>
+          <w:rFonts w:ascii="Times New Roman" w:eastAsia="Times New Roman" w:hAnsi="Times New Roman" w:cs="Times New Roman"/>
+          <w:sz w:val="24"/>
+          <w:szCs w:val="24"/>
+        </w:rPr>
+      </w:pPr>
+      <w:r>
+        <w:rPr>
+          <w:rFonts w:ascii="Times New Roman" w:eastAsia="Times New Roman" w:hAnsi="Times New Roman" w:cs="Times New Roman"/>
+          <w:sz w:val="24"/>
+          <w:szCs w:val="24"/>
+        </w:rPr>
+        <w:t xml:space="preserve">Cidade </w:t>
+      </w:r>
+    </w:p>
+    <w:p>
+      <w:pPr>
+        <w:numPr>
+          <w:ilvl w:val="0"/>
+          <w:numId w:val="48"/>
+        </w:numPr>
+        <w:spacing w:before="240" w:after="240"/>
+        <w:rPr>
+          <w:rFonts w:ascii="Times New Roman" w:eastAsia="Times New Roman" w:hAnsi="Times New Roman" w:cs="Times New Roman"/>
+          <w:sz w:val="24"/>
+          <w:szCs w:val="24"/>
+        </w:rPr>
+      </w:pPr>
+      <w:r>
+        <w:rPr>
+          <w:rFonts w:ascii="Times New Roman" w:eastAsia="Times New Roman" w:hAnsi="Times New Roman" w:cs="Times New Roman"/>
+          <w:sz w:val="24"/>
+          <w:szCs w:val="24"/>
+        </w:rPr>
+        <w:t xml:space="preserve">Bairro </w:t>
+      </w:r>
+    </w:p>
+    <w:p>
+      <w:pPr>
+        <w:numPr>
+          <w:ilvl w:val="0"/>
+          <w:numId w:val="48"/>
+        </w:numPr>
+        <w:spacing w:before="240" w:after="240"/>
+        <w:rPr>
+          <w:rFonts w:ascii="Times New Roman" w:eastAsia="Times New Roman" w:hAnsi="Times New Roman" w:cs="Times New Roman"/>
+          <w:sz w:val="24"/>
+          <w:szCs w:val="24"/>
+        </w:rPr>
+      </w:pPr>
+      <w:r>
+        <w:rPr>
+          <w:rFonts w:ascii="Times New Roman" w:eastAsia="Times New Roman" w:hAnsi="Times New Roman" w:cs="Times New Roman"/>
+          <w:sz w:val="24"/>
+          <w:szCs w:val="24"/>
+        </w:rPr>
+        <w:t xml:space="preserve">Datas disponíveis </w:t>
+      </w:r>
+    </w:p>
+    <w:p>
+      <w:pPr>
+        <w:numPr>
+          <w:ilvl w:val="0"/>
+          <w:numId w:val="48"/>
+        </w:numPr>
+        <w:spacing w:before="240" w:after="240"/>
+        <w:rPr>
+          <w:rFonts w:ascii="Times New Roman" w:eastAsia="Times New Roman" w:hAnsi="Times New Roman" w:cs="Times New Roman"/>
+          <w:sz w:val="24"/>
+          <w:szCs w:val="24"/>
+        </w:rPr>
+      </w:pPr>
+      <w:r>
+        <w:rPr>
+          <w:rFonts w:ascii="Times New Roman" w:eastAsia="Times New Roman" w:hAnsi="Times New Roman" w:cs="Times New Roman"/>
+          <w:sz w:val="24"/>
+          <w:szCs w:val="24"/>
+        </w:rPr>
+        <w:t xml:space="preserve">Horários disponíveis </w:t>
+      </w:r>
+    </w:p>
+    <w:p>
+      <w:pPr>
+        <w:numPr>
+          <w:ilvl w:val="0"/>
+          <w:numId w:val="48"/>
+        </w:numPr>
+        <w:spacing w:before="240" w:after="240"/>
+        <w:rPr>
+          <w:rFonts w:ascii="Times New Roman" w:eastAsia="Times New Roman" w:hAnsi="Times New Roman" w:cs="Times New Roman"/>
+          <w:sz w:val="24"/>
+          <w:szCs w:val="24"/>
+        </w:rPr>
+      </w:pPr>
+      <w:r>
+        <w:rPr>
+          <w:rFonts w:ascii="Times New Roman" w:eastAsia="Times New Roman" w:hAnsi="Times New Roman" w:cs="Times New Roman"/>
+          <w:sz w:val="24"/>
+          <w:szCs w:val="24"/>
+        </w:rPr>
+        <w:t xml:space="preserve">Observações </w:t>
+      </w:r>
+    </w:p>
+    <w:p>
+      <w:pPr>
+        <w:numPr>
+          <w:ilvl w:val="0"/>
+          <w:numId w:val="48"/>
+        </w:numPr>
+        <w:spacing w:before="240" w:after="240"/>
+        <w:rPr>
+          <w:rFonts w:ascii="Times New Roman" w:eastAsia="Times New Roman" w:hAnsi="Times New Roman" w:cs="Times New Roman"/>
+          <w:sz w:val="24"/>
+          <w:szCs w:val="24"/>
+        </w:rPr>
+      </w:pPr>
+      <w:r>
+        <w:rPr>
+          <w:rFonts w:ascii="Times New Roman" w:eastAsia="Times New Roman" w:hAnsi="Times New Roman" w:cs="Times New Roman"/>
+          <w:sz w:val="24"/>
+          <w:szCs w:val="24"/>
+        </w:rPr>
+        <w:lastRenderedPageBreak/>
+        <w:t xml:space="preserve">Fotos </w:t>
+      </w:r>
+    </w:p>
+    <w:p>
+      <w:pPr>
+        <w:numPr>
+          <w:ilvl w:val="0"/>
+          <w:numId w:val="48"/>
+        </w:numPr>
+        <w:spacing w:before="240" w:after="240"/>
+        <w:rPr>
+          <w:rFonts w:ascii="Times New Roman" w:eastAsia="Times New Roman" w:hAnsi="Times New Roman" w:cs="Times New Roman"/>
+          <w:sz w:val="24"/>
+          <w:szCs w:val="24"/>
+        </w:rPr>
+      </w:pPr>
+      <w:r>
+        <w:rPr>
+          <w:rFonts w:ascii="Times New Roman" w:eastAsia="Times New Roman" w:hAnsi="Times New Roman" w:cs="Times New Roman"/>
+          <w:sz w:val="24"/>
+          <w:szCs w:val="24"/>
+        </w:rPr>
+        <w:t xml:space="preserve">Tipo de atendimento </w:t>
+      </w:r>
+    </w:p>
+    <w:p>
+      <w:pPr>
+        <w:spacing w:before="240" w:after="240"/>
         <w:rPr>
           <w:rFonts w:ascii="Times New Roman" w:eastAsia="Times New Roman" w:hAnsi="Times New Roman" w:cs="Times New Roman"/>
           <w:b/>
@@ -1142,14 +1270,23 @@
           <w:sz w:val="24"/>
           <w:szCs w:val="24"/>
         </w:rPr>
-        <w:t>Exceções:</w:t>
+      </w:pPr>
+      <w:r>
+        <w:rPr>
+          <w:rFonts w:ascii="Times New Roman" w:eastAsia="Times New Roman" w:hAnsi="Times New Roman" w:cs="Times New Roman"/>
+          <w:b/>
+          <w:bCs/>
+          <w:sz w:val="24"/>
+          <w:szCs w:val="24"/>
+        </w:rPr>
+        <w:t>Restrições:</w:t>
       </w:r>
     </w:p>
     <w:p>
       <w:pPr>
         <w:numPr>
           <w:ilvl w:val="0"/>
-          <w:numId w:val="11"/>
+          <w:numId w:val="49"/>
         </w:numPr>
         <w:spacing w:before="240" w:after="240"/>
         <w:rPr>
@@ -1164,14 +1301,14 @@
           <w:sz w:val="24"/>
           <w:szCs w:val="24"/>
         </w:rPr>
-        <w:t xml:space="preserve">Falha no upload de imagem </w:t>
+        <w:t xml:space="preserve">Usuário deve estar autenticado. </w:t>
       </w:r>
     </w:p>
     <w:p>
       <w:pPr>
         <w:numPr>
           <w:ilvl w:val="0"/>
-          <w:numId w:val="11"/>
+          <w:numId w:val="49"/>
         </w:numPr>
         <w:spacing w:before="240" w:after="240"/>
         <w:rPr>
@@ -1186,35 +1323,56 @@
           <w:sz w:val="24"/>
           <w:szCs w:val="24"/>
         </w:rPr>
-        <w:t>Campos obrigatórios não preenchido</w:t>
-      </w:r>
-      <w:r>
-        <w:rPr>
-          <w:rFonts w:ascii="Times New Roman" w:eastAsia="Times New Roman" w:hAnsi="Times New Roman" w:cs="Times New Roman"/>
-          <w:sz w:val="24"/>
-          <w:szCs w:val="24"/>
-        </w:rPr>
-        <w:t>s</w:t>
-      </w:r>
-      <w:r>
-        <w:rPr>
-          <w:rFonts w:ascii="Times New Roman" w:eastAsia="Times New Roman" w:hAnsi="Times New Roman" w:cs="Times New Roman"/>
-          <w:sz w:val="24"/>
-          <w:szCs w:val="24"/>
-        </w:rPr>
-        <w:t xml:space="preserve"> </w:t>
-      </w:r>
-    </w:p>
-    <w:p>
-      <w:pPr>
-        <w:spacing w:before="240" w:after="240"/>
-        <w:rPr>
-          <w:rFonts w:ascii="Times New Roman" w:eastAsia="Times New Roman" w:hAnsi="Times New Roman" w:cs="Times New Roman"/>
-          <w:sz w:val="24"/>
-          <w:szCs w:val="24"/>
-        </w:rPr>
-      </w:pPr>
-      <w:r>
+        <w:t xml:space="preserve">Título, categoria e descrição são obrigatórios. </w:t>
+      </w:r>
+    </w:p>
+    <w:p>
+      <w:pPr>
+        <w:numPr>
+          <w:ilvl w:val="0"/>
+          <w:numId w:val="49"/>
+        </w:numPr>
+        <w:spacing w:before="240" w:after="240"/>
+        <w:rPr>
+          <w:rFonts w:ascii="Times New Roman" w:eastAsia="Times New Roman" w:hAnsi="Times New Roman" w:cs="Times New Roman"/>
+          <w:sz w:val="24"/>
+          <w:szCs w:val="24"/>
+        </w:rPr>
+      </w:pPr>
+      <w:r>
+        <w:rPr>
+          <w:rFonts w:ascii="Times New Roman" w:eastAsia="Times New Roman" w:hAnsi="Times New Roman" w:cs="Times New Roman"/>
+          <w:sz w:val="24"/>
+          <w:szCs w:val="24"/>
+        </w:rPr>
+        <w:t xml:space="preserve">O sistema deve gerar um ID único. </w:t>
+      </w:r>
+    </w:p>
+    <w:p>
+      <w:pPr>
+        <w:numPr>
+          <w:ilvl w:val="0"/>
+          <w:numId w:val="49"/>
+        </w:numPr>
+        <w:spacing w:before="240" w:after="240"/>
+        <w:rPr>
+          <w:rFonts w:ascii="Times New Roman" w:eastAsia="Times New Roman" w:hAnsi="Times New Roman" w:cs="Times New Roman"/>
+          <w:sz w:val="24"/>
+          <w:szCs w:val="24"/>
+        </w:rPr>
+      </w:pPr>
+      <w:r>
+        <w:rPr>
+          <w:rFonts w:ascii="Times New Roman" w:eastAsia="Times New Roman" w:hAnsi="Times New Roman" w:cs="Times New Roman"/>
+          <w:sz w:val="24"/>
+          <w:szCs w:val="24"/>
+        </w:rPr>
+        <w:t xml:space="preserve">O número máximo de fotos permitidas deve ser respeitado. </w:t>
+      </w:r>
+    </w:p>
+    <w:p>
+      <w:pPr>
+        <w:spacing w:before="240" w:after="240"/>
         <w:rPr>
           <w:rFonts w:ascii="Times New Roman" w:eastAsia="Times New Roman" w:hAnsi="Times New Roman" w:cs="Times New Roman"/>
           <w:b/>
@@ -1222,14 +1380,23 @@
           <w:sz w:val="24"/>
           <w:szCs w:val="24"/>
         </w:rPr>
-        <w:t>Saída:</w:t>
+      </w:pPr>
+      <w:r>
+        <w:rPr>
+          <w:rFonts w:ascii="Times New Roman" w:eastAsia="Times New Roman" w:hAnsi="Times New Roman" w:cs="Times New Roman"/>
+          <w:b/>
+          <w:bCs/>
+          <w:sz w:val="24"/>
+          <w:szCs w:val="24"/>
+        </w:rPr>
+        <w:t>Exceções:</w:t>
       </w:r>
     </w:p>
     <w:p>
       <w:pPr>
         <w:numPr>
           <w:ilvl w:val="0"/>
-          <w:numId w:val="12"/>
+          <w:numId w:val="50"/>
         </w:numPr>
         <w:spacing w:before="240" w:after="240"/>
         <w:rPr>
@@ -1244,14 +1411,14 @@
           <w:sz w:val="24"/>
           <w:szCs w:val="24"/>
         </w:rPr>
-        <w:t xml:space="preserve">Serviço publicado com sucesso </w:t>
+        <w:t xml:space="preserve">Campos obrigatórios não preenchidos. </w:t>
       </w:r>
     </w:p>
     <w:p>
       <w:pPr>
         <w:numPr>
           <w:ilvl w:val="0"/>
-          <w:numId w:val="12"/>
+          <w:numId w:val="50"/>
         </w:numPr>
         <w:spacing w:before="240" w:after="240"/>
         <w:rPr>
@@ -1266,29 +1433,34 @@
           <w:sz w:val="24"/>
           <w:szCs w:val="24"/>
         </w:rPr>
-        <w:t>Confirmação visual do cadastro</w:t>
-      </w:r>
-    </w:p>
-    <w:p>
-      <w:pPr>
-        <w:spacing w:before="240" w:after="240"/>
-        <w:rPr>
-          <w:rFonts w:ascii="Times New Roman" w:eastAsia="Times New Roman" w:hAnsi="Times New Roman" w:cs="Times New Roman"/>
-          <w:sz w:val="24"/>
-          <w:szCs w:val="24"/>
-        </w:rPr>
-      </w:pPr>
-    </w:p>
-    <w:p>
-      <w:pPr>
-        <w:spacing w:before="240" w:after="240"/>
-        <w:rPr>
-          <w:rFonts w:ascii="Times New Roman" w:eastAsia="Times New Roman" w:hAnsi="Times New Roman" w:cs="Times New Roman"/>
-          <w:sz w:val="24"/>
-          <w:szCs w:val="24"/>
-        </w:rPr>
-      </w:pPr>
-      <w:r>
+        <w:t xml:space="preserve">Falha no envio das imagens. </w:t>
+      </w:r>
+    </w:p>
+    <w:p>
+      <w:pPr>
+        <w:numPr>
+          <w:ilvl w:val="0"/>
+          <w:numId w:val="50"/>
+        </w:numPr>
+        <w:spacing w:before="240" w:after="240"/>
+        <w:rPr>
+          <w:rFonts w:ascii="Times New Roman" w:eastAsia="Times New Roman" w:hAnsi="Times New Roman" w:cs="Times New Roman"/>
+          <w:sz w:val="24"/>
+          <w:szCs w:val="24"/>
+        </w:rPr>
+      </w:pPr>
+      <w:r>
+        <w:rPr>
+          <w:rFonts w:ascii="Times New Roman" w:eastAsia="Times New Roman" w:hAnsi="Times New Roman" w:cs="Times New Roman"/>
+          <w:sz w:val="24"/>
+          <w:szCs w:val="24"/>
+        </w:rPr>
+        <w:t xml:space="preserve">Categoria inexistente. </w:t>
+      </w:r>
+    </w:p>
+    <w:p>
+      <w:pPr>
+        <w:spacing w:before="240" w:after="240"/>
         <w:rPr>
           <w:rFonts w:ascii="Times New Roman" w:eastAsia="Times New Roman" w:hAnsi="Times New Roman" w:cs="Times New Roman"/>
           <w:b/>
@@ -1296,6 +1468,111 @@
           <w:sz w:val="24"/>
           <w:szCs w:val="24"/>
         </w:rPr>
+      </w:pPr>
+      <w:r>
+        <w:rPr>
+          <w:rFonts w:ascii="Times New Roman" w:eastAsia="Times New Roman" w:hAnsi="Times New Roman" w:cs="Times New Roman"/>
+          <w:b/>
+          <w:bCs/>
+          <w:sz w:val="24"/>
+          <w:szCs w:val="24"/>
+        </w:rPr>
+        <w:t>Saída:</w:t>
+      </w:r>
+    </w:p>
+    <w:p>
+      <w:pPr>
+        <w:numPr>
+          <w:ilvl w:val="0"/>
+          <w:numId w:val="51"/>
+        </w:numPr>
+        <w:spacing w:before="240" w:after="240"/>
+        <w:rPr>
+          <w:rFonts w:ascii="Times New Roman" w:eastAsia="Times New Roman" w:hAnsi="Times New Roman" w:cs="Times New Roman"/>
+          <w:sz w:val="24"/>
+          <w:szCs w:val="24"/>
+        </w:rPr>
+      </w:pPr>
+      <w:r>
+        <w:rPr>
+          <w:rFonts w:ascii="Times New Roman" w:eastAsia="Times New Roman" w:hAnsi="Times New Roman" w:cs="Times New Roman"/>
+          <w:sz w:val="24"/>
+          <w:szCs w:val="24"/>
+        </w:rPr>
+        <w:t xml:space="preserve">Serviço cadastrado. </w:t>
+      </w:r>
+    </w:p>
+    <w:p>
+      <w:pPr>
+        <w:numPr>
+          <w:ilvl w:val="0"/>
+          <w:numId w:val="51"/>
+        </w:numPr>
+        <w:spacing w:before="240" w:after="240"/>
+        <w:rPr>
+          <w:rFonts w:ascii="Times New Roman" w:eastAsia="Times New Roman" w:hAnsi="Times New Roman" w:cs="Times New Roman"/>
+          <w:sz w:val="24"/>
+          <w:szCs w:val="24"/>
+        </w:rPr>
+      </w:pPr>
+      <w:r>
+        <w:rPr>
+          <w:rFonts w:ascii="Times New Roman" w:eastAsia="Times New Roman" w:hAnsi="Times New Roman" w:cs="Times New Roman"/>
+          <w:sz w:val="24"/>
+          <w:szCs w:val="24"/>
+        </w:rPr>
+        <w:t xml:space="preserve">Ticket gerado. </w:t>
+      </w:r>
+    </w:p>
+    <w:p>
+      <w:pPr>
+        <w:numPr>
+          <w:ilvl w:val="0"/>
+          <w:numId w:val="51"/>
+        </w:numPr>
+        <w:spacing w:before="240" w:after="240"/>
+        <w:rPr>
+          <w:rFonts w:ascii="Times New Roman" w:eastAsia="Times New Roman" w:hAnsi="Times New Roman" w:cs="Times New Roman"/>
+          <w:sz w:val="24"/>
+          <w:szCs w:val="24"/>
+        </w:rPr>
+      </w:pPr>
+      <w:r>
+        <w:rPr>
+          <w:rFonts w:ascii="Times New Roman" w:eastAsia="Times New Roman" w:hAnsi="Times New Roman" w:cs="Times New Roman"/>
+          <w:sz w:val="24"/>
+          <w:szCs w:val="24"/>
+        </w:rPr>
+        <w:t>Status definido como "ABERTO".</w:t>
+      </w:r>
+    </w:p>
+    <w:p>
+      <w:pPr>
+        <w:spacing w:before="240" w:after="240"/>
+        <w:rPr>
+          <w:rFonts w:ascii="Times New Roman" w:eastAsia="Times New Roman" w:hAnsi="Times New Roman" w:cs="Times New Roman"/>
+          <w:sz w:val="24"/>
+          <w:szCs w:val="24"/>
+        </w:rPr>
+      </w:pPr>
+    </w:p>
+    <w:p>
+      <w:pPr>
+        <w:spacing w:before="240" w:after="240"/>
+        <w:rPr>
+          <w:rFonts w:ascii="Times New Roman" w:eastAsia="Times New Roman" w:hAnsi="Times New Roman" w:cs="Times New Roman"/>
+          <w:sz w:val="24"/>
+          <w:szCs w:val="24"/>
+        </w:rPr>
+      </w:pPr>
+      <w:r>
+        <w:rPr>
+          <w:rFonts w:ascii="Times New Roman" w:eastAsia="Times New Roman" w:hAnsi="Times New Roman" w:cs="Times New Roman"/>
+          <w:b/>
+          <w:bCs/>
+          <w:sz w:val="24"/>
+          <w:szCs w:val="24"/>
+        </w:rPr>
         <w:t>Prioridade:</w:t>
       </w:r>
       <w:r>
@@ -1304,25 +1581,7 @@
           <w:sz w:val="24"/>
           <w:szCs w:val="24"/>
         </w:rPr>
-        <w:t xml:space="preserve"> (X) essencial </w:t>
-      </w:r>
-      <w:proofErr w:type="gramStart"/>
-      <w:r>
-        <w:rPr>
-          <w:rFonts w:ascii="Times New Roman" w:eastAsia="Times New Roman" w:hAnsi="Times New Roman" w:cs="Times New Roman"/>
-          <w:sz w:val="24"/>
-          <w:szCs w:val="24"/>
-        </w:rPr>
-        <w:t>( )</w:t>
-      </w:r>
-      <w:proofErr w:type="gramEnd"/>
-      <w:r>
-        <w:rPr>
-          <w:rFonts w:ascii="Times New Roman" w:eastAsia="Times New Roman" w:hAnsi="Times New Roman" w:cs="Times New Roman"/>
-          <w:sz w:val="24"/>
-          <w:szCs w:val="24"/>
-        </w:rPr>
-        <w:t xml:space="preserve"> importante ( ) desejável</w:t>
+        <w:t xml:space="preserve"> (X) essencial ( ) importante ( ) desejável</w:t>
       </w:r>
     </w:p>
     <w:p>
@@ -1487,6 +1746,7 @@
           <w:sz w:val="24"/>
           <w:szCs w:val="24"/>
         </w:rPr>
+        <w:lastRenderedPageBreak/>
         <w:t xml:space="preserve">Serviços devem </w:t>
       </w:r>
       <w:r>
@@ -1583,25 +1843,7 @@
           <w:sz w:val="24"/>
           <w:szCs w:val="24"/>
         </w:rPr>
-        <w:t xml:space="preserve"> (X) essencial </w:t>
-      </w:r>
-      <w:proofErr w:type="gramStart"/>
-      <w:r>
-        <w:rPr>
-          <w:rFonts w:ascii="Times New Roman" w:eastAsia="Times New Roman" w:hAnsi="Times New Roman" w:cs="Times New Roman"/>
-          <w:sz w:val="24"/>
-          <w:szCs w:val="24"/>
-        </w:rPr>
-        <w:t>( )</w:t>
-      </w:r>
-      <w:proofErr w:type="gramEnd"/>
-      <w:r>
-        <w:rPr>
-          <w:rFonts w:ascii="Times New Roman" w:eastAsia="Times New Roman" w:hAnsi="Times New Roman" w:cs="Times New Roman"/>
-          <w:sz w:val="24"/>
-          <w:szCs w:val="24"/>
-        </w:rPr>
-        <w:t xml:space="preserve"> importante ( ) desejável</w:t>
+        <w:t xml:space="preserve"> (X) essencial ( ) importante ( ) desejável</w:t>
       </w:r>
     </w:p>
     <w:p>
@@ -1686,9 +1928,10 @@
     </w:p>
     <w:p>
       <w:pPr>
+        <w:pStyle w:val="PargrafodaLista"/>
         <w:numPr>
           <w:ilvl w:val="0"/>
-          <w:numId w:val="17"/>
+          <w:numId w:val="16"/>
         </w:numPr>
         <w:spacing w:before="240" w:after="240"/>
         <w:rPr>
@@ -1703,14 +1946,15 @@
           <w:sz w:val="24"/>
           <w:szCs w:val="24"/>
         </w:rPr>
-        <w:t xml:space="preserve">Valor estimado </w:t>
-      </w:r>
-    </w:p>
-    <w:p>
-      <w:pPr>
+        <w:t xml:space="preserve">ID do serviço </w:t>
+      </w:r>
+    </w:p>
+    <w:p>
+      <w:pPr>
+        <w:pStyle w:val="PargrafodaLista"/>
         <w:numPr>
           <w:ilvl w:val="0"/>
-          <w:numId w:val="17"/>
+          <w:numId w:val="16"/>
         </w:numPr>
         <w:spacing w:before="240" w:after="240"/>
         <w:rPr>
@@ -1725,14 +1969,15 @@
           <w:sz w:val="24"/>
           <w:szCs w:val="24"/>
         </w:rPr>
-        <w:t xml:space="preserve">Datas disponíveis </w:t>
-      </w:r>
-    </w:p>
-    <w:p>
-      <w:pPr>
+        <w:t xml:space="preserve">Valor estimado </w:t>
+      </w:r>
+    </w:p>
+    <w:p>
+      <w:pPr>
+        <w:pStyle w:val="PargrafodaLista"/>
         <w:numPr>
           <w:ilvl w:val="0"/>
-          <w:numId w:val="17"/>
+          <w:numId w:val="16"/>
         </w:numPr>
         <w:spacing w:before="240" w:after="240"/>
         <w:rPr>
@@ -1747,7 +1992,99 @@
           <w:sz w:val="24"/>
           <w:szCs w:val="24"/>
         </w:rPr>
-        <w:t xml:space="preserve">ID do serviço </w:t>
+        <w:t xml:space="preserve">Data disponível </w:t>
+      </w:r>
+    </w:p>
+    <w:p>
+      <w:pPr>
+        <w:pStyle w:val="PargrafodaLista"/>
+        <w:numPr>
+          <w:ilvl w:val="0"/>
+          <w:numId w:val="16"/>
+        </w:numPr>
+        <w:spacing w:before="240" w:after="240"/>
+        <w:rPr>
+          <w:rFonts w:ascii="Times New Roman" w:eastAsia="Times New Roman" w:hAnsi="Times New Roman" w:cs="Times New Roman"/>
+          <w:sz w:val="24"/>
+          <w:szCs w:val="24"/>
+        </w:rPr>
+      </w:pPr>
+      <w:r>
+        <w:rPr>
+          <w:rFonts w:ascii="Times New Roman" w:eastAsia="Times New Roman" w:hAnsi="Times New Roman" w:cs="Times New Roman"/>
+          <w:sz w:val="24"/>
+          <w:szCs w:val="24"/>
+        </w:rPr>
+        <w:t xml:space="preserve">Horário disponível </w:t>
+      </w:r>
+    </w:p>
+    <w:p>
+      <w:pPr>
+        <w:pStyle w:val="PargrafodaLista"/>
+        <w:numPr>
+          <w:ilvl w:val="0"/>
+          <w:numId w:val="16"/>
+        </w:numPr>
+        <w:spacing w:before="240" w:after="240"/>
+        <w:rPr>
+          <w:rFonts w:ascii="Times New Roman" w:eastAsia="Times New Roman" w:hAnsi="Times New Roman" w:cs="Times New Roman"/>
+          <w:sz w:val="24"/>
+          <w:szCs w:val="24"/>
+        </w:rPr>
+      </w:pPr>
+      <w:r>
+        <w:rPr>
+          <w:rFonts w:ascii="Times New Roman" w:eastAsia="Times New Roman" w:hAnsi="Times New Roman" w:cs="Times New Roman"/>
+          <w:sz w:val="24"/>
+          <w:szCs w:val="24"/>
+        </w:rPr>
+        <w:t xml:space="preserve">Prazo aproximado </w:t>
+      </w:r>
+    </w:p>
+    <w:p>
+      <w:pPr>
+        <w:pStyle w:val="PargrafodaLista"/>
+        <w:numPr>
+          <w:ilvl w:val="0"/>
+          <w:numId w:val="16"/>
+        </w:numPr>
+        <w:spacing w:before="240" w:after="240"/>
+        <w:rPr>
+          <w:rFonts w:ascii="Times New Roman" w:eastAsia="Times New Roman" w:hAnsi="Times New Roman" w:cs="Times New Roman"/>
+          <w:sz w:val="24"/>
+          <w:szCs w:val="24"/>
+        </w:rPr>
+      </w:pPr>
+      <w:r>
+        <w:rPr>
+          <w:rFonts w:ascii="Times New Roman" w:eastAsia="Times New Roman" w:hAnsi="Times New Roman" w:cs="Times New Roman"/>
+          <w:sz w:val="24"/>
+          <w:szCs w:val="24"/>
+        </w:rPr>
+        <w:t xml:space="preserve">Observações </w:t>
+      </w:r>
+    </w:p>
+    <w:p>
+      <w:pPr>
+        <w:pStyle w:val="PargrafodaLista"/>
+        <w:numPr>
+          <w:ilvl w:val="0"/>
+          <w:numId w:val="16"/>
+        </w:numPr>
+        <w:spacing w:before="240" w:after="240"/>
+        <w:rPr>
+          <w:rFonts w:ascii="Times New Roman" w:eastAsia="Times New Roman" w:hAnsi="Times New Roman" w:cs="Times New Roman"/>
+          <w:sz w:val="24"/>
+          <w:szCs w:val="24"/>
+        </w:rPr>
+      </w:pPr>
+      <w:r>
+        <w:rPr>
+          <w:rFonts w:ascii="Times New Roman" w:eastAsia="Times New Roman" w:hAnsi="Times New Roman" w:cs="Times New Roman"/>
+          <w:sz w:val="24"/>
+          <w:szCs w:val="24"/>
+        </w:rPr>
+        <w:t>Mensagem ao cliente</w:t>
       </w:r>
     </w:p>
     <w:p>
@@ -1831,7 +2168,6 @@
           <w:sz w:val="24"/>
           <w:szCs w:val="24"/>
         </w:rPr>
-        <w:lastRenderedPageBreak/>
         <w:t>Saída:</w:t>
       </w:r>
     </w:p>
@@ -1892,25 +2228,7 @@
           <w:sz w:val="24"/>
           <w:szCs w:val="24"/>
         </w:rPr>
-        <w:t xml:space="preserve"> (X) essencial </w:t>
-      </w:r>
-      <w:proofErr w:type="gramStart"/>
-      <w:r>
-        <w:rPr>
-          <w:rFonts w:ascii="Times New Roman" w:eastAsia="Times New Roman" w:hAnsi="Times New Roman" w:cs="Times New Roman"/>
-          <w:sz w:val="24"/>
-          <w:szCs w:val="24"/>
-        </w:rPr>
-        <w:t>( )</w:t>
-      </w:r>
-      <w:proofErr w:type="gramEnd"/>
-      <w:r>
-        <w:rPr>
-          <w:rFonts w:ascii="Times New Roman" w:eastAsia="Times New Roman" w:hAnsi="Times New Roman" w:cs="Times New Roman"/>
-          <w:sz w:val="24"/>
-          <w:szCs w:val="24"/>
-        </w:rPr>
-        <w:t xml:space="preserve"> importante ( ) desejável</w:t>
+        <w:t xml:space="preserve"> (X) essencial ( ) importante ( ) desejável</w:t>
       </w:r>
     </w:p>
     <w:p>
@@ -1990,6 +2308,7 @@
           <w:sz w:val="24"/>
           <w:szCs w:val="24"/>
         </w:rPr>
+        <w:lastRenderedPageBreak/>
         <w:t>Restrições:</w:t>
       </w:r>
     </w:p>
@@ -2132,25 +2451,7 @@
           <w:sz w:val="24"/>
           <w:szCs w:val="24"/>
         </w:rPr>
-        <w:t xml:space="preserve"> (X) essencial </w:t>
-      </w:r>
-      <w:proofErr w:type="gramStart"/>
-      <w:r>
-        <w:rPr>
-          <w:rFonts w:ascii="Times New Roman" w:eastAsia="Times New Roman" w:hAnsi="Times New Roman" w:cs="Times New Roman"/>
-          <w:sz w:val="24"/>
-          <w:szCs w:val="24"/>
-        </w:rPr>
-        <w:t>( )</w:t>
-      </w:r>
-      <w:proofErr w:type="gramEnd"/>
-      <w:r>
-        <w:rPr>
-          <w:rFonts w:ascii="Times New Roman" w:eastAsia="Times New Roman" w:hAnsi="Times New Roman" w:cs="Times New Roman"/>
-          <w:sz w:val="24"/>
-          <w:szCs w:val="24"/>
-        </w:rPr>
-        <w:t xml:space="preserve"> importante ( ) desejável</w:t>
+        <w:t xml:space="preserve"> (X) essencial ( ) importante ( ) desejável</w:t>
       </w:r>
     </w:p>
     <w:p>
@@ -2358,7 +2659,6 @@
           <w:sz w:val="24"/>
           <w:szCs w:val="24"/>
         </w:rPr>
-        <w:lastRenderedPageBreak/>
         <w:t>Exceções:</w:t>
       </w:r>
     </w:p>
@@ -2505,25 +2805,7 @@
           <w:sz w:val="24"/>
           <w:szCs w:val="24"/>
         </w:rPr>
-        <w:t xml:space="preserve"> (X) essencial </w:t>
-      </w:r>
-      <w:proofErr w:type="gramStart"/>
-      <w:r>
-        <w:rPr>
-          <w:rFonts w:ascii="Times New Roman" w:eastAsia="Times New Roman" w:hAnsi="Times New Roman" w:cs="Times New Roman"/>
-          <w:sz w:val="24"/>
-          <w:szCs w:val="24"/>
-        </w:rPr>
-        <w:t>( )</w:t>
-      </w:r>
-      <w:proofErr w:type="gramEnd"/>
-      <w:r>
-        <w:rPr>
-          <w:rFonts w:ascii="Times New Roman" w:eastAsia="Times New Roman" w:hAnsi="Times New Roman" w:cs="Times New Roman"/>
-          <w:sz w:val="24"/>
-          <w:szCs w:val="24"/>
-        </w:rPr>
-        <w:t xml:space="preserve"> importante ( ) desejável</w:t>
+        <w:t xml:space="preserve"> (X) essencial ( ) importante ( ) desejável</w:t>
       </w:r>
     </w:p>
     <w:p>
@@ -2545,6 +2827,7 @@
           <w:sz w:val="24"/>
           <w:szCs w:val="24"/>
         </w:rPr>
+        <w:lastRenderedPageBreak/>
         <w:t>RF 8 – Disponibilizar contato entre cliente e profissional</w:t>
       </w:r>
     </w:p>
@@ -2759,25 +3042,7 @@
           <w:sz w:val="24"/>
           <w:szCs w:val="24"/>
         </w:rPr>
-        <w:t xml:space="preserve"> (X) essencial </w:t>
-      </w:r>
-      <w:proofErr w:type="gramStart"/>
-      <w:r>
-        <w:rPr>
-          <w:rFonts w:ascii="Times New Roman" w:eastAsia="Times New Roman" w:hAnsi="Times New Roman" w:cs="Times New Roman"/>
-          <w:sz w:val="24"/>
-          <w:szCs w:val="24"/>
-        </w:rPr>
-        <w:t>( )</w:t>
-      </w:r>
-      <w:proofErr w:type="gramEnd"/>
-      <w:r>
-        <w:rPr>
-          <w:rFonts w:ascii="Times New Roman" w:eastAsia="Times New Roman" w:hAnsi="Times New Roman" w:cs="Times New Roman"/>
-          <w:sz w:val="24"/>
-          <w:szCs w:val="24"/>
-        </w:rPr>
-        <w:t xml:space="preserve"> importante ( ) desejável</w:t>
+        <w:t xml:space="preserve"> (X) essencial ( ) importante ( ) desejável</w:t>
       </w:r>
     </w:p>
     <w:p>
@@ -2879,7 +3144,6 @@
           <w:sz w:val="24"/>
           <w:szCs w:val="24"/>
         </w:rPr>
-        <w:lastRenderedPageBreak/>
         <w:t xml:space="preserve">Nota (1 a 5) </w:t>
       </w:r>
     </w:p>
@@ -3068,25 +3332,7 @@
           <w:sz w:val="24"/>
           <w:szCs w:val="24"/>
         </w:rPr>
-        <w:t xml:space="preserve"> </w:t>
-      </w:r>
-      <w:proofErr w:type="gramStart"/>
-      <w:r>
-        <w:rPr>
-          <w:rFonts w:ascii="Times New Roman" w:eastAsia="Times New Roman" w:hAnsi="Times New Roman" w:cs="Times New Roman"/>
-          <w:sz w:val="24"/>
-          <w:szCs w:val="24"/>
-        </w:rPr>
-        <w:t>( )</w:t>
-      </w:r>
-      <w:proofErr w:type="gramEnd"/>
-      <w:r>
-        <w:rPr>
-          <w:rFonts w:ascii="Times New Roman" w:eastAsia="Times New Roman" w:hAnsi="Times New Roman" w:cs="Times New Roman"/>
-          <w:sz w:val="24"/>
-          <w:szCs w:val="24"/>
-        </w:rPr>
-        <w:t xml:space="preserve"> essencial (X) importante ( ) desejável</w:t>
+        <w:t xml:space="preserve"> ( ) essencial (X) importante ( ) desejável</w:t>
       </w:r>
     </w:p>
     <w:p>
@@ -3354,25 +3600,7 @@
           <w:sz w:val="24"/>
           <w:szCs w:val="24"/>
         </w:rPr>
-        <w:t xml:space="preserve"> </w:t>
-      </w:r>
-      <w:proofErr w:type="gramStart"/>
-      <w:r>
-        <w:rPr>
-          <w:rFonts w:ascii="Times New Roman" w:eastAsia="Times New Roman" w:hAnsi="Times New Roman" w:cs="Times New Roman"/>
-          <w:sz w:val="24"/>
-          <w:szCs w:val="24"/>
-        </w:rPr>
-        <w:t>( )</w:t>
-      </w:r>
-      <w:proofErr w:type="gramEnd"/>
-      <w:r>
-        <w:rPr>
-          <w:rFonts w:ascii="Times New Roman" w:eastAsia="Times New Roman" w:hAnsi="Times New Roman" w:cs="Times New Roman"/>
-          <w:sz w:val="24"/>
-          <w:szCs w:val="24"/>
-        </w:rPr>
-        <w:t xml:space="preserve"> essencial (X) importante ( ) desejável</w:t>
+        <w:t xml:space="preserve"> ( ) essencial (X) importante ( ) desejável</w:t>
       </w:r>
     </w:p>
     <w:p>
@@ -3392,7 +3620,6 @@
           <w:sz w:val="24"/>
           <w:szCs w:val="24"/>
         </w:rPr>
-        <w:lastRenderedPageBreak/>
         <w:br/>
       </w:r>
       <w:r>
@@ -3587,6 +3814,7 @@
           <w:sz w:val="24"/>
           <w:szCs w:val="24"/>
         </w:rPr>
+        <w:lastRenderedPageBreak/>
         <w:t>Canais de notificação permitidos</w:t>
       </w:r>
     </w:p>
@@ -3814,25 +4042,7 @@
           <w:sz w:val="24"/>
           <w:szCs w:val="24"/>
         </w:rPr>
-        <w:t xml:space="preserve">Prioridade: </w:t>
-      </w:r>
-      <w:proofErr w:type="gramStart"/>
-      <w:r>
-        <w:rPr>
-          <w:rFonts w:ascii="Times New Roman" w:eastAsia="Times New Roman" w:hAnsi="Times New Roman" w:cs="Times New Roman"/>
-          <w:sz w:val="24"/>
-          <w:szCs w:val="24"/>
-        </w:rPr>
-        <w:t>( )</w:t>
-      </w:r>
-      <w:proofErr w:type="gramEnd"/>
-      <w:r>
-        <w:rPr>
-          <w:rFonts w:ascii="Times New Roman" w:eastAsia="Times New Roman" w:hAnsi="Times New Roman" w:cs="Times New Roman"/>
-          <w:sz w:val="24"/>
-          <w:szCs w:val="24"/>
-        </w:rPr>
-        <w:t xml:space="preserve"> essencial (X) importante ( ) desejável</w:t>
+        <w:t>Prioridade: ( ) essencial (X) importante ( ) desejável</w:t>
       </w:r>
     </w:p>
     <w:p>
@@ -3854,7 +4064,27 @@
           <w:sz w:val="24"/>
           <w:szCs w:val="24"/>
         </w:rPr>
-        <w:t>RF 12 – Criar ticket urgente e localizar prestadores disponíveis</w:t>
+        <w:t xml:space="preserve">RF 12 – Criar </w:t>
+      </w:r>
+      <w:r>
+        <w:rPr>
+          <w:rFonts w:ascii="Times New Roman" w:eastAsia="Times New Roman" w:hAnsi="Times New Roman" w:cs="Times New Roman"/>
+          <w:b/>
+          <w:bCs/>
+          <w:sz w:val="24"/>
+          <w:szCs w:val="24"/>
+        </w:rPr>
+        <w:t>Serviço</w:t>
+      </w:r>
+      <w:r>
+        <w:rPr>
+          <w:rFonts w:ascii="Times New Roman" w:eastAsia="Times New Roman" w:hAnsi="Times New Roman" w:cs="Times New Roman"/>
+          <w:b/>
+          <w:bCs/>
+          <w:sz w:val="24"/>
+          <w:szCs w:val="24"/>
+        </w:rPr>
+        <w:t xml:space="preserve"> urgente e localizar prestadores disponíveis</w:t>
       </w:r>
     </w:p>
     <w:p>
@@ -3880,16 +4110,7 @@
           <w:sz w:val="24"/>
           <w:szCs w:val="24"/>
         </w:rPr>
-        <w:t xml:space="preserve"> O sistema deve permitir que clientes abram um contato de emergência para serviços que necessitam de atendimento o mais breve possível, com esse tipo de contato não é </w:t>
-      </w:r>
-      <w:r>
-        <w:rPr>
-          <w:rFonts w:ascii="Times New Roman" w:eastAsia="Times New Roman" w:hAnsi="Times New Roman" w:cs="Times New Roman"/>
-          <w:sz w:val="24"/>
-          <w:szCs w:val="24"/>
-        </w:rPr>
-        <w:lastRenderedPageBreak/>
-        <w:t xml:space="preserve">necessário a criação de uma proposta, e somente é possível fazer com profissionais que aceitaram ter a </w:t>
+        <w:t xml:space="preserve"> O sistema deve permitir que clientes abram um contato de emergência para serviços que necessitam de atendimento o mais breve possível, com esse tipo de contato não é necessário a criação de uma proposta, e somente é possível fazer com profissionais que aceitaram ter a </w:t>
       </w:r>
       <w:proofErr w:type="spellStart"/>
       <w:r>
@@ -4093,6 +4314,7 @@
           <w:sz w:val="24"/>
           <w:szCs w:val="24"/>
         </w:rPr>
+        <w:lastRenderedPageBreak/>
         <w:t>Somente prestadores com Modo Urgente ativo podem ser exibidos</w:t>
       </w:r>
     </w:p>
@@ -4257,25 +4479,7 @@
           <w:sz w:val="24"/>
           <w:szCs w:val="24"/>
         </w:rPr>
-        <w:t xml:space="preserve">Prioridade: (X) essencial </w:t>
-      </w:r>
-      <w:proofErr w:type="gramStart"/>
-      <w:r>
-        <w:rPr>
-          <w:rFonts w:ascii="Times New Roman" w:eastAsia="Times New Roman" w:hAnsi="Times New Roman" w:cs="Times New Roman"/>
-          <w:sz w:val="24"/>
-          <w:szCs w:val="24"/>
-        </w:rPr>
-        <w:t>( )</w:t>
-      </w:r>
-      <w:proofErr w:type="gramEnd"/>
-      <w:r>
-        <w:rPr>
-          <w:rFonts w:ascii="Times New Roman" w:eastAsia="Times New Roman" w:hAnsi="Times New Roman" w:cs="Times New Roman"/>
-          <w:sz w:val="24"/>
-          <w:szCs w:val="24"/>
-        </w:rPr>
-        <w:t xml:space="preserve"> importante ( ) desejável</w:t>
+        <w:t>Prioridade: (X) essencial ( ) importante ( ) desejável</w:t>
       </w:r>
     </w:p>
     <w:p>
@@ -4786,6 +4990,155 @@
     </w:lvl>
   </w:abstractNum>
   <w:abstractNum w:abstractNumId="1" w15:restartNumberingAfterBreak="0">
+    <w:nsid w:val="01E55319"/>
+    <w:multiLevelType w:val="multilevel"/>
+    <w:tmpl w:val="434C144A"/>
+    <w:lvl w:ilvl="0">
+      <w:start w:val="1"/>
+      <w:numFmt w:val="bullet"/>
+      <w:lvlText w:val=""/>
+      <w:lvlJc w:val="left"/>
+      <w:pPr>
+        <w:tabs>
+          <w:tab w:val="num" w:pos="720"/>
+        </w:tabs>
+        <w:ind w:left="720" w:hanging="360"/>
+      </w:pPr>
+      <w:rPr>
+        <w:rFonts w:ascii="Symbol" w:hAnsi="Symbol" w:hint="default"/>
+        <w:sz w:val="20"/>
+      </w:rPr>
+    </w:lvl>
+    <w:lvl w:ilvl="1" w:tentative="1">
+      <w:start w:val="1"/>
+      <w:numFmt w:val="bullet"/>
+      <w:lvlText w:val="o"/>
+      <w:lvlJc w:val="left"/>
+      <w:pPr>
+        <w:tabs>
+          <w:tab w:val="num" w:pos="1440"/>
+        </w:tabs>
+        <w:ind w:left="1440" w:hanging="360"/>
+      </w:pPr>
+      <w:rPr>
+        <w:rFonts w:ascii="Courier New" w:hAnsi="Courier New" w:hint="default"/>
+        <w:sz w:val="20"/>
+      </w:rPr>
+    </w:lvl>
+    <w:lvl w:ilvl="2" w:tentative="1">
+      <w:start w:val="1"/>
+      <w:numFmt w:val="bullet"/>
+      <w:lvlText w:val=""/>
+      <w:lvlJc w:val="left"/>
+      <w:pPr>
+        <w:tabs>
+          <w:tab w:val="num" w:pos="2160"/>
+        </w:tabs>
+        <w:ind w:left="2160" w:hanging="360"/>
+      </w:pPr>
+      <w:rPr>
+        <w:rFonts w:ascii="Wingdings" w:hAnsi="Wingdings" w:hint="default"/>
+        <w:sz w:val="20"/>
+      </w:rPr>
+    </w:lvl>
+    <w:lvl w:ilvl="3" w:tentative="1">
+      <w:start w:val="1"/>
+      <w:numFmt w:val="bullet"/>
+      <w:lvlText w:val=""/>
+      <w:lvlJc w:val="left"/>
+      <w:pPr>
+        <w:tabs>
+          <w:tab w:val="num" w:pos="2880"/>
+        </w:tabs>
+        <w:ind w:left="2880" w:hanging="360"/>
+      </w:pPr>
+      <w:rPr>
+        <w:rFonts w:ascii="Wingdings" w:hAnsi="Wingdings" w:hint="default"/>
+        <w:sz w:val="20"/>
+      </w:rPr>
+    </w:lvl>
+    <w:lvl w:ilvl="4" w:tentative="1">
+      <w:start w:val="1"/>
+      <w:numFmt w:val="bullet"/>
+      <w:lvlText w:val=""/>
+      <w:lvlJc w:val="left"/>
+      <w:pPr>
+        <w:tabs>
+          <w:tab w:val="num" w:pos="3600"/>
+        </w:tabs>
+        <w:ind w:left="3600" w:hanging="360"/>
+      </w:pPr>
+      <w:rPr>
+        <w:rFonts w:ascii="Wingdings" w:hAnsi="Wingdings" w:hint="default"/>
+        <w:sz w:val="20"/>
+      </w:rPr>
+    </w:lvl>
+    <w:lvl w:ilvl="5" w:tentative="1">
+      <w:start w:val="1"/>
+      <w:numFmt w:val="bullet"/>
+      <w:lvlText w:val=""/>
+      <w:lvlJc w:val="left"/>
+      <w:pPr>
+        <w:tabs>
+          <w:tab w:val="num" w:pos="4320"/>
+        </w:tabs>
+        <w:ind w:left="4320" w:hanging="360"/>
+      </w:pPr>
+      <w:rPr>
+        <w:rFonts w:ascii="Wingdings" w:hAnsi="Wingdings" w:hint="default"/>
+        <w:sz w:val="20"/>
+      </w:rPr>
+    </w:lvl>
+    <w:lvl w:ilvl="6" w:tentative="1">
+      <w:start w:val="1"/>
+      <w:numFmt w:val="bullet"/>
+      <w:lvlText w:val=""/>
+      <w:lvlJc w:val="left"/>
+      <w:pPr>
+        <w:tabs>
+          <w:tab w:val="num" w:pos="5040"/>
+        </w:tabs>
+        <w:ind w:left="5040" w:hanging="360"/>
+      </w:pPr>
+      <w:rPr>
+        <w:rFonts w:ascii="Wingdings" w:hAnsi="Wingdings" w:hint="default"/>
+        <w:sz w:val="20"/>
+      </w:rPr>
+    </w:lvl>
+    <w:lvl w:ilvl="7" w:tentative="1">
+      <w:start w:val="1"/>
+      <w:numFmt w:val="bullet"/>
+      <w:lvlText w:val=""/>
+      <w:lvlJc w:val="left"/>
+      <w:pPr>
+        <w:tabs>
+          <w:tab w:val="num" w:pos="5760"/>
+        </w:tabs>
+        <w:ind w:left="5760" w:hanging="360"/>
+      </w:pPr>
+      <w:rPr>
+        <w:rFonts w:ascii="Wingdings" w:hAnsi="Wingdings" w:hint="default"/>
+        <w:sz w:val="20"/>
+      </w:rPr>
+    </w:lvl>
+    <w:lvl w:ilvl="8" w:tentative="1">
+      <w:start w:val="1"/>
+      <w:numFmt w:val="bullet"/>
+      <w:lvlText w:val=""/>
+      <w:lvlJc w:val="left"/>
+      <w:pPr>
+        <w:tabs>
+          <w:tab w:val="num" w:pos="6480"/>
+        </w:tabs>
+        <w:ind w:left="6480" w:hanging="360"/>
+      </w:pPr>
+      <w:rPr>
+        <w:rFonts w:ascii="Wingdings" w:hAnsi="Wingdings" w:hint="default"/>
+        <w:sz w:val="20"/>
+      </w:rPr>
+    </w:lvl>
+  </w:abstractNum>
+  <w:abstractNum w:abstractNumId="2" w15:restartNumberingAfterBreak="0">
     <w:nsid w:val="029662B4"/>
     <w:multiLevelType w:val="multilevel"/>
     <w:tmpl w:val="9CFC1BB2"/>
@@ -4934,7 +5287,120 @@
       </w:rPr>
     </w:lvl>
   </w:abstractNum>
-  <w:abstractNum w:abstractNumId="2" w15:restartNumberingAfterBreak="0">
+  <w:abstractNum w:abstractNumId="3" w15:restartNumberingAfterBreak="0">
+    <w:nsid w:val="049E3F25"/>
+    <w:multiLevelType w:val="hybridMultilevel"/>
+    <w:tmpl w:val="4950E492"/>
+    <w:lvl w:ilvl="0" w:tplc="04160001">
+      <w:start w:val="1"/>
+      <w:numFmt w:val="bullet"/>
+      <w:lvlText w:val=""/>
+      <w:lvlJc w:val="left"/>
+      <w:pPr>
+        <w:ind w:left="720" w:hanging="360"/>
+      </w:pPr>
+      <w:rPr>
+        <w:rFonts w:ascii="Symbol" w:hAnsi="Symbol" w:hint="default"/>
+      </w:rPr>
+    </w:lvl>
+    <w:lvl w:ilvl="1" w:tplc="04160003" w:tentative="1">
+      <w:start w:val="1"/>
+      <w:numFmt w:val="bullet"/>
+      <w:lvlText w:val="o"/>
+      <w:lvlJc w:val="left"/>
+      <w:pPr>
+        <w:ind w:left="1440" w:hanging="360"/>
+      </w:pPr>
+      <w:rPr>
+        <w:rFonts w:ascii="Courier New" w:hAnsi="Courier New" w:cs="Courier New" w:hint="default"/>
+      </w:rPr>
+    </w:lvl>
+    <w:lvl w:ilvl="2" w:tplc="04160005" w:tentative="1">
+      <w:start w:val="1"/>
+      <w:numFmt w:val="bullet"/>
+      <w:lvlText w:val=""/>
+      <w:lvlJc w:val="left"/>
+      <w:pPr>
+        <w:ind w:left="2160" w:hanging="360"/>
+      </w:pPr>
+      <w:rPr>
+        <w:rFonts w:ascii="Wingdings" w:hAnsi="Wingdings" w:hint="default"/>
+      </w:rPr>
+    </w:lvl>
+    <w:lvl w:ilvl="3" w:tplc="04160001" w:tentative="1">
+      <w:start w:val="1"/>
+      <w:numFmt w:val="bullet"/>
+      <w:lvlText w:val=""/>
+      <w:lvlJc w:val="left"/>
+      <w:pPr>
+        <w:ind w:left="2880" w:hanging="360"/>
+      </w:pPr>
+      <w:rPr>
+        <w:rFonts w:ascii="Symbol" w:hAnsi="Symbol" w:hint="default"/>
+      </w:rPr>
+    </w:lvl>
+    <w:lvl w:ilvl="4" w:tplc="04160003" w:tentative="1">
+      <w:start w:val="1"/>
+      <w:numFmt w:val="bullet"/>
+      <w:lvlText w:val="o"/>
+      <w:lvlJc w:val="left"/>
+      <w:pPr>
+        <w:ind w:left="3600" w:hanging="360"/>
+      </w:pPr>
+      <w:rPr>
+        <w:rFonts w:ascii="Courier New" w:hAnsi="Courier New" w:cs="Courier New" w:hint="default"/>
+      </w:rPr>
+    </w:lvl>
+    <w:lvl w:ilvl="5" w:tplc="04160005" w:tentative="1">
+      <w:start w:val="1"/>
+      <w:numFmt w:val="bullet"/>
+      <w:lvlText w:val=""/>
+      <w:lvlJc w:val="left"/>
+      <w:pPr>
+        <w:ind w:left="4320" w:hanging="360"/>
+      </w:pPr>
+      <w:rPr>
+        <w:rFonts w:ascii="Wingdings" w:hAnsi="Wingdings" w:hint="default"/>
+      </w:rPr>
+    </w:lvl>
+    <w:lvl w:ilvl="6" w:tplc="04160001" w:tentative="1">
+      <w:start w:val="1"/>
+      <w:numFmt w:val="bullet"/>
+      <w:lvlText w:val=""/>
+      <w:lvlJc w:val="left"/>
+      <w:pPr>
+        <w:ind w:left="5040" w:hanging="360"/>
+      </w:pPr>
+      <w:rPr>
+        <w:rFonts w:ascii="Symbol" w:hAnsi="Symbol" w:hint="default"/>
+      </w:rPr>
+    </w:lvl>
+    <w:lvl w:ilvl="7" w:tplc="04160003" w:tentative="1">
+      <w:start w:val="1"/>
+      <w:numFmt w:val="bullet"/>
+      <w:lvlText w:val="o"/>
+      <w:lvlJc w:val="left"/>
+      <w:pPr>
+        <w:ind w:left="5760" w:hanging="360"/>
+      </w:pPr>
+      <w:rPr>
+        <w:rFonts w:ascii="Courier New" w:hAnsi="Courier New" w:cs="Courier New" w:hint="default"/>
+      </w:rPr>
+    </w:lvl>
+    <w:lvl w:ilvl="8" w:tplc="04160005" w:tentative="1">
+      <w:start w:val="1"/>
+      <w:numFmt w:val="bullet"/>
+      <w:lvlText w:val=""/>
+      <w:lvlJc w:val="left"/>
+      <w:pPr>
+        <w:ind w:left="6480" w:hanging="360"/>
+      </w:pPr>
+      <w:rPr>
+        <w:rFonts w:ascii="Wingdings" w:hAnsi="Wingdings" w:hint="default"/>
+      </w:rPr>
+    </w:lvl>
+  </w:abstractNum>
+  <w:abstractNum w:abstractNumId="4" w15:restartNumberingAfterBreak="0">
     <w:nsid w:val="0896212F"/>
     <w:multiLevelType w:val="multilevel"/>
     <w:tmpl w:val="9C46CE7C"/>
@@ -5083,7 +5549,7 @@
       </w:rPr>
     </w:lvl>
   </w:abstractNum>
-  <w:abstractNum w:abstractNumId="3" w15:restartNumberingAfterBreak="0">
+  <w:abstractNum w:abstractNumId="5" w15:restartNumberingAfterBreak="0">
     <w:nsid w:val="0A174FC4"/>
     <w:multiLevelType w:val="multilevel"/>
     <w:tmpl w:val="8F1A677E"/>
@@ -5232,7 +5698,7 @@
       </w:rPr>
     </w:lvl>
   </w:abstractNum>
-  <w:abstractNum w:abstractNumId="4" w15:restartNumberingAfterBreak="0">
+  <w:abstractNum w:abstractNumId="6" w15:restartNumberingAfterBreak="0">
     <w:nsid w:val="0CEB3729"/>
     <w:multiLevelType w:val="multilevel"/>
     <w:tmpl w:val="E0468052"/>
@@ -5381,7 +5847,7 @@
       </w:rPr>
     </w:lvl>
   </w:abstractNum>
-  <w:abstractNum w:abstractNumId="5" w15:restartNumberingAfterBreak="0">
+  <w:abstractNum w:abstractNumId="7" w15:restartNumberingAfterBreak="0">
     <w:nsid w:val="0D714FA8"/>
     <w:multiLevelType w:val="multilevel"/>
     <w:tmpl w:val="4FD40DC4"/>
@@ -5530,7 +5996,7 @@
       </w:rPr>
     </w:lvl>
   </w:abstractNum>
-  <w:abstractNum w:abstractNumId="6" w15:restartNumberingAfterBreak="0">
+  <w:abstractNum w:abstractNumId="8" w15:restartNumberingAfterBreak="0">
     <w:nsid w:val="0F794E06"/>
     <w:multiLevelType w:val="multilevel"/>
     <w:tmpl w:val="13D887C8"/>
@@ -5679,7 +6145,156 @@
       </w:rPr>
     </w:lvl>
   </w:abstractNum>
-  <w:abstractNum w:abstractNumId="7" w15:restartNumberingAfterBreak="0">
+  <w:abstractNum w:abstractNumId="9" w15:restartNumberingAfterBreak="0">
+    <w:nsid w:val="0FF2735B"/>
+    <w:multiLevelType w:val="multilevel"/>
+    <w:tmpl w:val="68C027D6"/>
+    <w:lvl w:ilvl="0">
+      <w:start w:val="1"/>
+      <w:numFmt w:val="bullet"/>
+      <w:lvlText w:val=""/>
+      <w:lvlJc w:val="left"/>
+      <w:pPr>
+        <w:tabs>
+          <w:tab w:val="num" w:pos="720"/>
+        </w:tabs>
+        <w:ind w:left="720" w:hanging="360"/>
+      </w:pPr>
+      <w:rPr>
+        <w:rFonts w:ascii="Symbol" w:hAnsi="Symbol" w:hint="default"/>
+        <w:sz w:val="20"/>
+      </w:rPr>
+    </w:lvl>
+    <w:lvl w:ilvl="1" w:tentative="1">
+      <w:start w:val="1"/>
+      <w:numFmt w:val="bullet"/>
+      <w:lvlText w:val="o"/>
+      <w:lvlJc w:val="left"/>
+      <w:pPr>
+        <w:tabs>
+          <w:tab w:val="num" w:pos="1440"/>
+        </w:tabs>
+        <w:ind w:left="1440" w:hanging="360"/>
+      </w:pPr>
+      <w:rPr>
+        <w:rFonts w:ascii="Courier New" w:hAnsi="Courier New" w:hint="default"/>
+        <w:sz w:val="20"/>
+      </w:rPr>
+    </w:lvl>
+    <w:lvl w:ilvl="2" w:tentative="1">
+      <w:start w:val="1"/>
+      <w:numFmt w:val="bullet"/>
+      <w:lvlText w:val=""/>
+      <w:lvlJc w:val="left"/>
+      <w:pPr>
+        <w:tabs>
+          <w:tab w:val="num" w:pos="2160"/>
+        </w:tabs>
+        <w:ind w:left="2160" w:hanging="360"/>
+      </w:pPr>
+      <w:rPr>
+        <w:rFonts w:ascii="Wingdings" w:hAnsi="Wingdings" w:hint="default"/>
+        <w:sz w:val="20"/>
+      </w:rPr>
+    </w:lvl>
+    <w:lvl w:ilvl="3" w:tentative="1">
+      <w:start w:val="1"/>
+      <w:numFmt w:val="bullet"/>
+      <w:lvlText w:val=""/>
+      <w:lvlJc w:val="left"/>
+      <w:pPr>
+        <w:tabs>
+          <w:tab w:val="num" w:pos="2880"/>
+        </w:tabs>
+        <w:ind w:left="2880" w:hanging="360"/>
+      </w:pPr>
+      <w:rPr>
+        <w:rFonts w:ascii="Wingdings" w:hAnsi="Wingdings" w:hint="default"/>
+        <w:sz w:val="20"/>
+      </w:rPr>
+    </w:lvl>
+    <w:lvl w:ilvl="4" w:tentative="1">
+      <w:start w:val="1"/>
+      <w:numFmt w:val="bullet"/>
+      <w:lvlText w:val=""/>
+      <w:lvlJc w:val="left"/>
+      <w:pPr>
+        <w:tabs>
+          <w:tab w:val="num" w:pos="3600"/>
+        </w:tabs>
+        <w:ind w:left="3600" w:hanging="360"/>
+      </w:pPr>
+      <w:rPr>
+        <w:rFonts w:ascii="Wingdings" w:hAnsi="Wingdings" w:hint="default"/>
+        <w:sz w:val="20"/>
+      </w:rPr>
+    </w:lvl>
+    <w:lvl w:ilvl="5" w:tentative="1">
+      <w:start w:val="1"/>
+      <w:numFmt w:val="bullet"/>
+      <w:lvlText w:val=""/>
+      <w:lvlJc w:val="left"/>
+      <w:pPr>
+        <w:tabs>
+          <w:tab w:val="num" w:pos="4320"/>
+        </w:tabs>
+        <w:ind w:left="4320" w:hanging="360"/>
+      </w:pPr>
+      <w:rPr>
+        <w:rFonts w:ascii="Wingdings" w:hAnsi="Wingdings" w:hint="default"/>
+        <w:sz w:val="20"/>
+      </w:rPr>
+    </w:lvl>
+    <w:lvl w:ilvl="6" w:tentative="1">
+      <w:start w:val="1"/>
+      <w:numFmt w:val="bullet"/>
+      <w:lvlText w:val=""/>
+      <w:lvlJc w:val="left"/>
+      <w:pPr>
+        <w:tabs>
+          <w:tab w:val="num" w:pos="5040"/>
+        </w:tabs>
+        <w:ind w:left="5040" w:hanging="360"/>
+      </w:pPr>
+      <w:rPr>
+        <w:rFonts w:ascii="Wingdings" w:hAnsi="Wingdings" w:hint="default"/>
+        <w:sz w:val="20"/>
+      </w:rPr>
+    </w:lvl>
+    <w:lvl w:ilvl="7" w:tentative="1">
+      <w:start w:val="1"/>
+      <w:numFmt w:val="bullet"/>
+      <w:lvlText w:val=""/>
+      <w:lvlJc w:val="left"/>
+      <w:pPr>
+        <w:tabs>
+          <w:tab w:val="num" w:pos="5760"/>
+        </w:tabs>
+        <w:ind w:left="5760" w:hanging="360"/>
+      </w:pPr>
+      <w:rPr>
+        <w:rFonts w:ascii="Wingdings" w:hAnsi="Wingdings" w:hint="default"/>
+        <w:sz w:val="20"/>
+      </w:rPr>
+    </w:lvl>
+    <w:lvl w:ilvl="8" w:tentative="1">
+      <w:start w:val="1"/>
+      <w:numFmt w:val="bullet"/>
+      <w:lvlText w:val=""/>
+      <w:lvlJc w:val="left"/>
+      <w:pPr>
+        <w:tabs>
+          <w:tab w:val="num" w:pos="6480"/>
+        </w:tabs>
+        <w:ind w:left="6480" w:hanging="360"/>
+      </w:pPr>
+      <w:rPr>
+        <w:rFonts w:ascii="Wingdings" w:hAnsi="Wingdings" w:hint="default"/>
+        <w:sz w:val="20"/>
+      </w:rPr>
+    </w:lvl>
+  </w:abstractNum>
+  <w:abstractNum w:abstractNumId="10" w15:restartNumberingAfterBreak="0">
     <w:nsid w:val="109143F6"/>
     <w:multiLevelType w:val="multilevel"/>
     <w:tmpl w:val="FB6AB6F4"/>
@@ -5828,7 +6443,7 @@
       </w:rPr>
     </w:lvl>
   </w:abstractNum>
-  <w:abstractNum w:abstractNumId="8" w15:restartNumberingAfterBreak="0">
+  <w:abstractNum w:abstractNumId="11" w15:restartNumberingAfterBreak="0">
     <w:nsid w:val="1A387F83"/>
     <w:multiLevelType w:val="multilevel"/>
     <w:tmpl w:val="102A9808"/>
@@ -5977,7 +6592,7 @@
       </w:rPr>
     </w:lvl>
   </w:abstractNum>
-  <w:abstractNum w:abstractNumId="9" w15:restartNumberingAfterBreak="0">
+  <w:abstractNum w:abstractNumId="12" w15:restartNumberingAfterBreak="0">
     <w:nsid w:val="1DE34262"/>
     <w:multiLevelType w:val="multilevel"/>
     <w:tmpl w:val="C7861610"/>
@@ -6126,7 +6741,7 @@
       </w:rPr>
     </w:lvl>
   </w:abstractNum>
-  <w:abstractNum w:abstractNumId="10" w15:restartNumberingAfterBreak="0">
+  <w:abstractNum w:abstractNumId="13" w15:restartNumberingAfterBreak="0">
     <w:nsid w:val="2088347F"/>
     <w:multiLevelType w:val="multilevel"/>
     <w:tmpl w:val="4F061CA2"/>
@@ -6275,7 +6890,156 @@
       </w:rPr>
     </w:lvl>
   </w:abstractNum>
-  <w:abstractNum w:abstractNumId="11" w15:restartNumberingAfterBreak="0">
+  <w:abstractNum w:abstractNumId="14" w15:restartNumberingAfterBreak="0">
+    <w:nsid w:val="280F79E3"/>
+    <w:multiLevelType w:val="multilevel"/>
+    <w:tmpl w:val="8794A4B8"/>
+    <w:lvl w:ilvl="0">
+      <w:start w:val="1"/>
+      <w:numFmt w:val="bullet"/>
+      <w:lvlText w:val=""/>
+      <w:lvlJc w:val="left"/>
+      <w:pPr>
+        <w:tabs>
+          <w:tab w:val="num" w:pos="720"/>
+        </w:tabs>
+        <w:ind w:left="720" w:hanging="360"/>
+      </w:pPr>
+      <w:rPr>
+        <w:rFonts w:ascii="Symbol" w:hAnsi="Symbol" w:hint="default"/>
+        <w:sz w:val="20"/>
+      </w:rPr>
+    </w:lvl>
+    <w:lvl w:ilvl="1" w:tentative="1">
+      <w:start w:val="1"/>
+      <w:numFmt w:val="bullet"/>
+      <w:lvlText w:val="o"/>
+      <w:lvlJc w:val="left"/>
+      <w:pPr>
+        <w:tabs>
+          <w:tab w:val="num" w:pos="1440"/>
+        </w:tabs>
+        <w:ind w:left="1440" w:hanging="360"/>
+      </w:pPr>
+      <w:rPr>
+        <w:rFonts w:ascii="Courier New" w:hAnsi="Courier New" w:hint="default"/>
+        <w:sz w:val="20"/>
+      </w:rPr>
+    </w:lvl>
+    <w:lvl w:ilvl="2" w:tentative="1">
+      <w:start w:val="1"/>
+      <w:numFmt w:val="bullet"/>
+      <w:lvlText w:val=""/>
+      <w:lvlJc w:val="left"/>
+      <w:pPr>
+        <w:tabs>
+          <w:tab w:val="num" w:pos="2160"/>
+        </w:tabs>
+        <w:ind w:left="2160" w:hanging="360"/>
+      </w:pPr>
+      <w:rPr>
+        <w:rFonts w:ascii="Wingdings" w:hAnsi="Wingdings" w:hint="default"/>
+        <w:sz w:val="20"/>
+      </w:rPr>
+    </w:lvl>
+    <w:lvl w:ilvl="3" w:tentative="1">
+      <w:start w:val="1"/>
+      <w:numFmt w:val="bullet"/>
+      <w:lvlText w:val=""/>
+      <w:lvlJc w:val="left"/>
+      <w:pPr>
+        <w:tabs>
+          <w:tab w:val="num" w:pos="2880"/>
+        </w:tabs>
+        <w:ind w:left="2880" w:hanging="360"/>
+      </w:pPr>
+      <w:rPr>
+        <w:rFonts w:ascii="Wingdings" w:hAnsi="Wingdings" w:hint="default"/>
+        <w:sz w:val="20"/>
+      </w:rPr>
+    </w:lvl>
+    <w:lvl w:ilvl="4" w:tentative="1">
+      <w:start w:val="1"/>
+      <w:numFmt w:val="bullet"/>
+      <w:lvlText w:val=""/>
+      <w:lvlJc w:val="left"/>
+      <w:pPr>
+        <w:tabs>
+          <w:tab w:val="num" w:pos="3600"/>
+        </w:tabs>
+        <w:ind w:left="3600" w:hanging="360"/>
+      </w:pPr>
+      <w:rPr>
+        <w:rFonts w:ascii="Wingdings" w:hAnsi="Wingdings" w:hint="default"/>
+        <w:sz w:val="20"/>
+      </w:rPr>
+    </w:lvl>
+    <w:lvl w:ilvl="5" w:tentative="1">
+      <w:start w:val="1"/>
+      <w:numFmt w:val="bullet"/>
+      <w:lvlText w:val=""/>
+      <w:lvlJc w:val="left"/>
+      <w:pPr>
+        <w:tabs>
+          <w:tab w:val="num" w:pos="4320"/>
+        </w:tabs>
+        <w:ind w:left="4320" w:hanging="360"/>
+      </w:pPr>
+      <w:rPr>
+        <w:rFonts w:ascii="Wingdings" w:hAnsi="Wingdings" w:hint="default"/>
+        <w:sz w:val="20"/>
+      </w:rPr>
+    </w:lvl>
+    <w:lvl w:ilvl="6" w:tentative="1">
+      <w:start w:val="1"/>
+      <w:numFmt w:val="bullet"/>
+      <w:lvlText w:val=""/>
+      <w:lvlJc w:val="left"/>
+      <w:pPr>
+        <w:tabs>
+          <w:tab w:val="num" w:pos="5040"/>
+        </w:tabs>
+        <w:ind w:left="5040" w:hanging="360"/>
+      </w:pPr>
+      <w:rPr>
+        <w:rFonts w:ascii="Wingdings" w:hAnsi="Wingdings" w:hint="default"/>
+        <w:sz w:val="20"/>
+      </w:rPr>
+    </w:lvl>
+    <w:lvl w:ilvl="7" w:tentative="1">
+      <w:start w:val="1"/>
+      <w:numFmt w:val="bullet"/>
+      <w:lvlText w:val=""/>
+      <w:lvlJc w:val="left"/>
+      <w:pPr>
+        <w:tabs>
+          <w:tab w:val="num" w:pos="5760"/>
+        </w:tabs>
+        <w:ind w:left="5760" w:hanging="360"/>
+      </w:pPr>
+      <w:rPr>
+        <w:rFonts w:ascii="Wingdings" w:hAnsi="Wingdings" w:hint="default"/>
+        <w:sz w:val="20"/>
+      </w:rPr>
+    </w:lvl>
+    <w:lvl w:ilvl="8" w:tentative="1">
+      <w:start w:val="1"/>
+      <w:numFmt w:val="bullet"/>
+      <w:lvlText w:val=""/>
+      <w:lvlJc w:val="left"/>
+      <w:pPr>
+        <w:tabs>
+          <w:tab w:val="num" w:pos="6480"/>
+        </w:tabs>
+        <w:ind w:left="6480" w:hanging="360"/>
+      </w:pPr>
+      <w:rPr>
+        <w:rFonts w:ascii="Wingdings" w:hAnsi="Wingdings" w:hint="default"/>
+        <w:sz w:val="20"/>
+      </w:rPr>
+    </w:lvl>
+  </w:abstractNum>
+  <w:abstractNum w:abstractNumId="15" w15:restartNumberingAfterBreak="0">
     <w:nsid w:val="28335BA2"/>
     <w:multiLevelType w:val="multilevel"/>
     <w:tmpl w:val="32124FCC"/>
@@ -6424,7 +7188,7 @@
       </w:rPr>
     </w:lvl>
   </w:abstractNum>
-  <w:abstractNum w:abstractNumId="12" w15:restartNumberingAfterBreak="0">
+  <w:abstractNum w:abstractNumId="16" w15:restartNumberingAfterBreak="0">
     <w:nsid w:val="287548CB"/>
     <w:multiLevelType w:val="multilevel"/>
     <w:tmpl w:val="A3849BD8"/>
@@ -6573,7 +7337,7 @@
       </w:rPr>
     </w:lvl>
   </w:abstractNum>
-  <w:abstractNum w:abstractNumId="13" w15:restartNumberingAfterBreak="0">
+  <w:abstractNum w:abstractNumId="17" w15:restartNumberingAfterBreak="0">
     <w:nsid w:val="28F6193C"/>
     <w:multiLevelType w:val="multilevel"/>
     <w:tmpl w:val="83BE99A4"/>
@@ -6722,7 +7486,7 @@
       </w:rPr>
     </w:lvl>
   </w:abstractNum>
-  <w:abstractNum w:abstractNumId="14" w15:restartNumberingAfterBreak="0">
+  <w:abstractNum w:abstractNumId="18" w15:restartNumberingAfterBreak="0">
     <w:nsid w:val="2AD73EDF"/>
     <w:multiLevelType w:val="multilevel"/>
     <w:tmpl w:val="523419CE"/>
@@ -6871,7 +7635,7 @@
       </w:rPr>
     </w:lvl>
   </w:abstractNum>
-  <w:abstractNum w:abstractNumId="15" w15:restartNumberingAfterBreak="0">
+  <w:abstractNum w:abstractNumId="19" w15:restartNumberingAfterBreak="0">
     <w:nsid w:val="2FE92C5E"/>
     <w:multiLevelType w:val="multilevel"/>
     <w:tmpl w:val="AF665276"/>
@@ -7020,7 +7784,7 @@
       </w:rPr>
     </w:lvl>
   </w:abstractNum>
-  <w:abstractNum w:abstractNumId="16" w15:restartNumberingAfterBreak="0">
+  <w:abstractNum w:abstractNumId="20" w15:restartNumberingAfterBreak="0">
     <w:nsid w:val="3344749E"/>
     <w:multiLevelType w:val="multilevel"/>
     <w:tmpl w:val="581EE46E"/>
@@ -7169,7 +7933,7 @@
       </w:rPr>
     </w:lvl>
   </w:abstractNum>
-  <w:abstractNum w:abstractNumId="17" w15:restartNumberingAfterBreak="0">
+  <w:abstractNum w:abstractNumId="21" w15:restartNumberingAfterBreak="0">
     <w:nsid w:val="34D75F48"/>
     <w:multiLevelType w:val="multilevel"/>
     <w:tmpl w:val="3A788AE6"/>
@@ -7318,7 +8082,7 @@
       </w:rPr>
     </w:lvl>
   </w:abstractNum>
-  <w:abstractNum w:abstractNumId="18" w15:restartNumberingAfterBreak="0">
+  <w:abstractNum w:abstractNumId="22" w15:restartNumberingAfterBreak="0">
     <w:nsid w:val="38C51E7C"/>
     <w:multiLevelType w:val="multilevel"/>
     <w:tmpl w:val="75C6CF1E"/>
@@ -7467,7 +8231,7 @@
       </w:rPr>
     </w:lvl>
   </w:abstractNum>
-  <w:abstractNum w:abstractNumId="19" w15:restartNumberingAfterBreak="0">
+  <w:abstractNum w:abstractNumId="23" w15:restartNumberingAfterBreak="0">
     <w:nsid w:val="3D7A27B8"/>
     <w:multiLevelType w:val="multilevel"/>
     <w:tmpl w:val="D1983D1A"/>
@@ -7616,7 +8380,7 @@
       </w:rPr>
     </w:lvl>
   </w:abstractNum>
-  <w:abstractNum w:abstractNumId="20" w15:restartNumberingAfterBreak="0">
+  <w:abstractNum w:abstractNumId="24" w15:restartNumberingAfterBreak="0">
     <w:nsid w:val="4051330B"/>
     <w:multiLevelType w:val="multilevel"/>
     <w:tmpl w:val="BAD06B2C"/>
@@ -7765,7 +8529,7 @@
       </w:rPr>
     </w:lvl>
   </w:abstractNum>
-  <w:abstractNum w:abstractNumId="21" w15:restartNumberingAfterBreak="0">
+  <w:abstractNum w:abstractNumId="25" w15:restartNumberingAfterBreak="0">
     <w:nsid w:val="46795B27"/>
     <w:multiLevelType w:val="multilevel"/>
     <w:tmpl w:val="3D9E3768"/>
@@ -7914,7 +8678,7 @@
       </w:rPr>
     </w:lvl>
   </w:abstractNum>
-  <w:abstractNum w:abstractNumId="22" w15:restartNumberingAfterBreak="0">
+  <w:abstractNum w:abstractNumId="26" w15:restartNumberingAfterBreak="0">
     <w:nsid w:val="469056E7"/>
     <w:multiLevelType w:val="multilevel"/>
     <w:tmpl w:val="67F467FA"/>
@@ -8063,7 +8827,7 @@
       </w:rPr>
     </w:lvl>
   </w:abstractNum>
-  <w:abstractNum w:abstractNumId="23" w15:restartNumberingAfterBreak="0">
+  <w:abstractNum w:abstractNumId="27" w15:restartNumberingAfterBreak="0">
     <w:nsid w:val="48064CCC"/>
     <w:multiLevelType w:val="multilevel"/>
     <w:tmpl w:val="DCB25532"/>
@@ -8212,7 +8976,7 @@
       </w:rPr>
     </w:lvl>
   </w:abstractNum>
-  <w:abstractNum w:abstractNumId="24" w15:restartNumberingAfterBreak="0">
+  <w:abstractNum w:abstractNumId="28" w15:restartNumberingAfterBreak="0">
     <w:nsid w:val="48BE5F8C"/>
     <w:multiLevelType w:val="multilevel"/>
     <w:tmpl w:val="6E88F5BA"/>
@@ -8361,7 +9125,7 @@
       </w:rPr>
     </w:lvl>
   </w:abstractNum>
-  <w:abstractNum w:abstractNumId="25" w15:restartNumberingAfterBreak="0">
+  <w:abstractNum w:abstractNumId="29" w15:restartNumberingAfterBreak="0">
     <w:nsid w:val="4A706327"/>
     <w:multiLevelType w:val="multilevel"/>
     <w:tmpl w:val="5670686A"/>
@@ -8510,7 +9274,7 @@
       </w:rPr>
     </w:lvl>
   </w:abstractNum>
-  <w:abstractNum w:abstractNumId="26" w15:restartNumberingAfterBreak="0">
+  <w:abstractNum w:abstractNumId="30" w15:restartNumberingAfterBreak="0">
     <w:nsid w:val="4EAA0AC6"/>
     <w:multiLevelType w:val="multilevel"/>
     <w:tmpl w:val="1576C166"/>
@@ -8659,7 +9423,7 @@
       </w:rPr>
     </w:lvl>
   </w:abstractNum>
-  <w:abstractNum w:abstractNumId="27" w15:restartNumberingAfterBreak="0">
+  <w:abstractNum w:abstractNumId="31" w15:restartNumberingAfterBreak="0">
     <w:nsid w:val="51E21811"/>
     <w:multiLevelType w:val="multilevel"/>
     <w:tmpl w:val="FD4A8700"/>
@@ -8808,7 +9572,7 @@
       </w:rPr>
     </w:lvl>
   </w:abstractNum>
-  <w:abstractNum w:abstractNumId="28" w15:restartNumberingAfterBreak="0">
+  <w:abstractNum w:abstractNumId="32" w15:restartNumberingAfterBreak="0">
     <w:nsid w:val="532151B0"/>
     <w:multiLevelType w:val="multilevel"/>
     <w:tmpl w:val="0D086024"/>
@@ -8957,7 +9721,7 @@
       </w:rPr>
     </w:lvl>
   </w:abstractNum>
-  <w:abstractNum w:abstractNumId="29" w15:restartNumberingAfterBreak="0">
+  <w:abstractNum w:abstractNumId="33" w15:restartNumberingAfterBreak="0">
     <w:nsid w:val="578E3788"/>
     <w:multiLevelType w:val="multilevel"/>
     <w:tmpl w:val="21A8B608"/>
@@ -9106,7 +9870,7 @@
       </w:rPr>
     </w:lvl>
   </w:abstractNum>
-  <w:abstractNum w:abstractNumId="30" w15:restartNumberingAfterBreak="0">
+  <w:abstractNum w:abstractNumId="34" w15:restartNumberingAfterBreak="0">
     <w:nsid w:val="57FB7CA6"/>
     <w:multiLevelType w:val="multilevel"/>
     <w:tmpl w:val="961C5E4C"/>
@@ -9255,7 +10019,7 @@
       </w:rPr>
     </w:lvl>
   </w:abstractNum>
-  <w:abstractNum w:abstractNumId="31" w15:restartNumberingAfterBreak="0">
+  <w:abstractNum w:abstractNumId="35" w15:restartNumberingAfterBreak="0">
     <w:nsid w:val="5B1D2FAF"/>
     <w:multiLevelType w:val="multilevel"/>
     <w:tmpl w:val="069E37F6"/>
@@ -9404,7 +10168,7 @@
       </w:rPr>
     </w:lvl>
   </w:abstractNum>
-  <w:abstractNum w:abstractNumId="32" w15:restartNumberingAfterBreak="0">
+  <w:abstractNum w:abstractNumId="36" w15:restartNumberingAfterBreak="0">
     <w:nsid w:val="60894133"/>
     <w:multiLevelType w:val="multilevel"/>
     <w:tmpl w:val="F9025846"/>
@@ -9553,7 +10317,7 @@
       </w:rPr>
     </w:lvl>
   </w:abstractNum>
-  <w:abstractNum w:abstractNumId="33" w15:restartNumberingAfterBreak="0">
+  <w:abstractNum w:abstractNumId="37" w15:restartNumberingAfterBreak="0">
     <w:nsid w:val="64346862"/>
     <w:multiLevelType w:val="multilevel"/>
     <w:tmpl w:val="648A81A6"/>
@@ -9702,7 +10466,7 @@
       </w:rPr>
     </w:lvl>
   </w:abstractNum>
-  <w:abstractNum w:abstractNumId="34" w15:restartNumberingAfterBreak="0">
+  <w:abstractNum w:abstractNumId="38" w15:restartNumberingAfterBreak="0">
     <w:nsid w:val="64640F3C"/>
     <w:multiLevelType w:val="multilevel"/>
     <w:tmpl w:val="5AD64210"/>
@@ -9851,7 +10615,7 @@
       </w:rPr>
     </w:lvl>
   </w:abstractNum>
-  <w:abstractNum w:abstractNumId="35" w15:restartNumberingAfterBreak="0">
+  <w:abstractNum w:abstractNumId="39" w15:restartNumberingAfterBreak="0">
     <w:nsid w:val="6B376E5F"/>
     <w:multiLevelType w:val="multilevel"/>
     <w:tmpl w:val="009004C0"/>
@@ -10000,7 +10764,7 @@
       </w:rPr>
     </w:lvl>
   </w:abstractNum>
-  <w:abstractNum w:abstractNumId="36" w15:restartNumberingAfterBreak="0">
+  <w:abstractNum w:abstractNumId="40" w15:restartNumberingAfterBreak="0">
     <w:nsid w:val="6BCD6974"/>
     <w:multiLevelType w:val="multilevel"/>
     <w:tmpl w:val="9F2E3DB0"/>
@@ -10149,7 +10913,7 @@
       </w:rPr>
     </w:lvl>
   </w:abstractNum>
-  <w:abstractNum w:abstractNumId="37" w15:restartNumberingAfterBreak="0">
+  <w:abstractNum w:abstractNumId="41" w15:restartNumberingAfterBreak="0">
     <w:nsid w:val="70931114"/>
     <w:multiLevelType w:val="multilevel"/>
     <w:tmpl w:val="A314D588"/>
@@ -10298,7 +11062,7 @@
       </w:rPr>
     </w:lvl>
   </w:abstractNum>
-  <w:abstractNum w:abstractNumId="38" w15:restartNumberingAfterBreak="0">
+  <w:abstractNum w:abstractNumId="42" w15:restartNumberingAfterBreak="0">
     <w:nsid w:val="7220769C"/>
     <w:multiLevelType w:val="multilevel"/>
     <w:tmpl w:val="11427F9C"/>
@@ -10447,7 +11211,7 @@
       </w:rPr>
     </w:lvl>
   </w:abstractNum>
-  <w:abstractNum w:abstractNumId="39" w15:restartNumberingAfterBreak="0">
+  <w:abstractNum w:abstractNumId="43" w15:restartNumberingAfterBreak="0">
     <w:nsid w:val="72D82598"/>
     <w:multiLevelType w:val="multilevel"/>
     <w:tmpl w:val="F1B66624"/>
@@ -10596,7 +11360,7 @@
       </w:rPr>
     </w:lvl>
   </w:abstractNum>
-  <w:abstractNum w:abstractNumId="40" w15:restartNumberingAfterBreak="0">
+  <w:abstractNum w:abstractNumId="44" w15:restartNumberingAfterBreak="0">
     <w:nsid w:val="7308571D"/>
     <w:multiLevelType w:val="multilevel"/>
     <w:tmpl w:val="86E68DBC"/>
@@ -10745,7 +11509,7 @@
       </w:rPr>
     </w:lvl>
   </w:abstractNum>
-  <w:abstractNum w:abstractNumId="41" w15:restartNumberingAfterBreak="0">
+  <w:abstractNum w:abstractNumId="45" w15:restartNumberingAfterBreak="0">
     <w:nsid w:val="75E76A92"/>
     <w:multiLevelType w:val="multilevel"/>
     <w:tmpl w:val="854C3CC4"/>
@@ -10894,7 +11658,7 @@
       </w:rPr>
     </w:lvl>
   </w:abstractNum>
-  <w:abstractNum w:abstractNumId="42" w15:restartNumberingAfterBreak="0">
+  <w:abstractNum w:abstractNumId="46" w15:restartNumberingAfterBreak="0">
     <w:nsid w:val="76A20783"/>
     <w:multiLevelType w:val="multilevel"/>
     <w:tmpl w:val="C9928DC0"/>
@@ -11043,7 +11807,7 @@
       </w:rPr>
     </w:lvl>
   </w:abstractNum>
-  <w:abstractNum w:abstractNumId="43" w15:restartNumberingAfterBreak="0">
+  <w:abstractNum w:abstractNumId="47" w15:restartNumberingAfterBreak="0">
     <w:nsid w:val="7899679E"/>
     <w:multiLevelType w:val="multilevel"/>
     <w:tmpl w:val="E8EA175E"/>
@@ -11192,7 +11956,156 @@
       </w:rPr>
     </w:lvl>
   </w:abstractNum>
-  <w:abstractNum w:abstractNumId="44" w15:restartNumberingAfterBreak="0">
+  <w:abstractNum w:abstractNumId="48" w15:restartNumberingAfterBreak="0">
+    <w:nsid w:val="7A5F5582"/>
+    <w:multiLevelType w:val="multilevel"/>
+    <w:tmpl w:val="366E7A2C"/>
+    <w:lvl w:ilvl="0">
+      <w:start w:val="1"/>
+      <w:numFmt w:val="bullet"/>
+      <w:lvlText w:val=""/>
+      <w:lvlJc w:val="left"/>
+      <w:pPr>
+        <w:tabs>
+          <w:tab w:val="num" w:pos="720"/>
+        </w:tabs>
+        <w:ind w:left="720" w:hanging="360"/>
+      </w:pPr>
+      <w:rPr>
+        <w:rFonts w:ascii="Symbol" w:hAnsi="Symbol" w:hint="default"/>
+        <w:sz w:val="20"/>
+      </w:rPr>
+    </w:lvl>
+    <w:lvl w:ilvl="1" w:tentative="1">
+      <w:start w:val="1"/>
+      <w:numFmt w:val="bullet"/>
+      <w:lvlText w:val="o"/>
+      <w:lvlJc w:val="left"/>
+      <w:pPr>
+        <w:tabs>
+          <w:tab w:val="num" w:pos="1440"/>
+        </w:tabs>
+        <w:ind w:left="1440" w:hanging="360"/>
+      </w:pPr>
+      <w:rPr>
+        <w:rFonts w:ascii="Courier New" w:hAnsi="Courier New" w:hint="default"/>
+        <w:sz w:val="20"/>
+      </w:rPr>
+    </w:lvl>
+    <w:lvl w:ilvl="2" w:tentative="1">
+      <w:start w:val="1"/>
+      <w:numFmt w:val="bullet"/>
+      <w:lvlText w:val=""/>
+      <w:lvlJc w:val="left"/>
+      <w:pPr>
+        <w:tabs>
+          <w:tab w:val="num" w:pos="2160"/>
+        </w:tabs>
+        <w:ind w:left="2160" w:hanging="360"/>
+      </w:pPr>
+      <w:rPr>
+        <w:rFonts w:ascii="Wingdings" w:hAnsi="Wingdings" w:hint="default"/>
+        <w:sz w:val="20"/>
+      </w:rPr>
+    </w:lvl>
+    <w:lvl w:ilvl="3" w:tentative="1">
+      <w:start w:val="1"/>
+      <w:numFmt w:val="bullet"/>
+      <w:lvlText w:val=""/>
+      <w:lvlJc w:val="left"/>
+      <w:pPr>
+        <w:tabs>
+          <w:tab w:val="num" w:pos="2880"/>
+        </w:tabs>
+        <w:ind w:left="2880" w:hanging="360"/>
+      </w:pPr>
+      <w:rPr>
+        <w:rFonts w:ascii="Wingdings" w:hAnsi="Wingdings" w:hint="default"/>
+        <w:sz w:val="20"/>
+      </w:rPr>
+    </w:lvl>
+    <w:lvl w:ilvl="4" w:tentative="1">
+      <w:start w:val="1"/>
+      <w:numFmt w:val="bullet"/>
+      <w:lvlText w:val=""/>
+      <w:lvlJc w:val="left"/>
+      <w:pPr>
+        <w:tabs>
+          <w:tab w:val="num" w:pos="3600"/>
+        </w:tabs>
+        <w:ind w:left="3600" w:hanging="360"/>
+      </w:pPr>
+      <w:rPr>
+        <w:rFonts w:ascii="Wingdings" w:hAnsi="Wingdings" w:hint="default"/>
+        <w:sz w:val="20"/>
+      </w:rPr>
+    </w:lvl>
+    <w:lvl w:ilvl="5" w:tentative="1">
+      <w:start w:val="1"/>
+      <w:numFmt w:val="bullet"/>
+      <w:lvlText w:val=""/>
+      <w:lvlJc w:val="left"/>
+      <w:pPr>
+        <w:tabs>
+          <w:tab w:val="num" w:pos="4320"/>
+        </w:tabs>
+        <w:ind w:left="4320" w:hanging="360"/>
+      </w:pPr>
+      <w:rPr>
+        <w:rFonts w:ascii="Wingdings" w:hAnsi="Wingdings" w:hint="default"/>
+        <w:sz w:val="20"/>
+      </w:rPr>
+    </w:lvl>
+    <w:lvl w:ilvl="6" w:tentative="1">
+      <w:start w:val="1"/>
+      <w:numFmt w:val="bullet"/>
+      <w:lvlText w:val=""/>
+      <w:lvlJc w:val="left"/>
+      <w:pPr>
+        <w:tabs>
+          <w:tab w:val="num" w:pos="5040"/>
+        </w:tabs>
+        <w:ind w:left="5040" w:hanging="360"/>
+      </w:pPr>
+      <w:rPr>
+        <w:rFonts w:ascii="Wingdings" w:hAnsi="Wingdings" w:hint="default"/>
+        <w:sz w:val="20"/>
+      </w:rPr>
+    </w:lvl>
+    <w:lvl w:ilvl="7" w:tentative="1">
+      <w:start w:val="1"/>
+      <w:numFmt w:val="bullet"/>
+      <w:lvlText w:val=""/>
+      <w:lvlJc w:val="left"/>
+      <w:pPr>
+        <w:tabs>
+          <w:tab w:val="num" w:pos="5760"/>
+        </w:tabs>
+        <w:ind w:left="5760" w:hanging="360"/>
+      </w:pPr>
+      <w:rPr>
+        <w:rFonts w:ascii="Wingdings" w:hAnsi="Wingdings" w:hint="default"/>
+        <w:sz w:val="20"/>
+      </w:rPr>
+    </w:lvl>
+    <w:lvl w:ilvl="8" w:tentative="1">
+      <w:start w:val="1"/>
+      <w:numFmt w:val="bullet"/>
+      <w:lvlText w:val=""/>
+      <w:lvlJc w:val="left"/>
+      <w:pPr>
+        <w:tabs>
+          <w:tab w:val="num" w:pos="6480"/>
+        </w:tabs>
+        <w:ind w:left="6480" w:hanging="360"/>
+      </w:pPr>
+      <w:rPr>
+        <w:rFonts w:ascii="Wingdings" w:hAnsi="Wingdings" w:hint="default"/>
+        <w:sz w:val="20"/>
+      </w:rPr>
+    </w:lvl>
+  </w:abstractNum>
+  <w:abstractNum w:abstractNumId="49" w15:restartNumberingAfterBreak="0">
     <w:nsid w:val="7D2C60EB"/>
     <w:multiLevelType w:val="multilevel"/>
     <w:tmpl w:val="E436985A"/>
@@ -11341,7 +12254,7 @@
       </w:rPr>
     </w:lvl>
   </w:abstractNum>
-  <w:abstractNum w:abstractNumId="45" w15:restartNumberingAfterBreak="0">
+  <w:abstractNum w:abstractNumId="50" w15:restartNumberingAfterBreak="0">
     <w:nsid w:val="7E780683"/>
     <w:multiLevelType w:val="multilevel"/>
     <w:tmpl w:val="014C15CC"/>
@@ -11490,7 +12403,7 @@
       </w:rPr>
     </w:lvl>
   </w:abstractNum>
-  <w:abstractNum w:abstractNumId="46" w15:restartNumberingAfterBreak="0">
+  <w:abstractNum w:abstractNumId="51" w15:restartNumberingAfterBreak="0">
     <w:nsid w:val="7EA729D7"/>
     <w:multiLevelType w:val="multilevel"/>
     <w:tmpl w:val="9B080324"/>
@@ -11640,145 +12553,160 @@
     </w:lvl>
   </w:abstractNum>
   <w:num w:numId="1" w16cid:durableId="747076902">
-    <w:abstractNumId w:val="4"/>
+    <w:abstractNumId w:val="6"/>
   </w:num>
   <w:num w:numId="2" w16cid:durableId="1084763397">
-    <w:abstractNumId w:val="35"/>
+    <w:abstractNumId w:val="39"/>
   </w:num>
   <w:num w:numId="3" w16cid:durableId="1421292685">
-    <w:abstractNumId w:val="27"/>
+    <w:abstractNumId w:val="31"/>
   </w:num>
   <w:num w:numId="4" w16cid:durableId="1394741547">
-    <w:abstractNumId w:val="28"/>
+    <w:abstractNumId w:val="32"/>
   </w:num>
   <w:num w:numId="5" w16cid:durableId="541285234">
-    <w:abstractNumId w:val="33"/>
+    <w:abstractNumId w:val="37"/>
   </w:num>
   <w:num w:numId="6" w16cid:durableId="112136993">
-    <w:abstractNumId w:val="38"/>
+    <w:abstractNumId w:val="42"/>
   </w:num>
   <w:num w:numId="7" w16cid:durableId="666979020">
     <w:abstractNumId w:val="0"/>
   </w:num>
   <w:num w:numId="8" w16cid:durableId="100346360">
+    <w:abstractNumId w:val="19"/>
+  </w:num>
+  <w:num w:numId="9" w16cid:durableId="849218406">
+    <w:abstractNumId w:val="22"/>
+  </w:num>
+  <w:num w:numId="10" w16cid:durableId="2059817920">
+    <w:abstractNumId w:val="43"/>
+  </w:num>
+  <w:num w:numId="11" w16cid:durableId="1458376617">
+    <w:abstractNumId w:val="17"/>
+  </w:num>
+  <w:num w:numId="12" w16cid:durableId="1746338999">
+    <w:abstractNumId w:val="47"/>
+  </w:num>
+  <w:num w:numId="13" w16cid:durableId="2051688984">
+    <w:abstractNumId w:val="24"/>
+  </w:num>
+  <w:num w:numId="14" w16cid:durableId="263999993">
+    <w:abstractNumId w:val="29"/>
+  </w:num>
+  <w:num w:numId="15" w16cid:durableId="1684285504">
+    <w:abstractNumId w:val="44"/>
+  </w:num>
+  <w:num w:numId="16" w16cid:durableId="1885755082">
+    <w:abstractNumId w:val="25"/>
+  </w:num>
+  <w:num w:numId="17" w16cid:durableId="1362440721">
+    <w:abstractNumId w:val="23"/>
+  </w:num>
+  <w:num w:numId="18" w16cid:durableId="1348141909">
+    <w:abstractNumId w:val="46"/>
+  </w:num>
+  <w:num w:numId="19" w16cid:durableId="616713830">
+    <w:abstractNumId w:val="10"/>
+  </w:num>
+  <w:num w:numId="20" w16cid:durableId="1106655989">
+    <w:abstractNumId w:val="41"/>
+  </w:num>
+  <w:num w:numId="21" w16cid:durableId="306085412">
+    <w:abstractNumId w:val="34"/>
+  </w:num>
+  <w:num w:numId="22" w16cid:durableId="982926252">
+    <w:abstractNumId w:val="50"/>
+  </w:num>
+  <w:num w:numId="23" w16cid:durableId="2003728588">
+    <w:abstractNumId w:val="38"/>
+  </w:num>
+  <w:num w:numId="24" w16cid:durableId="760882046">
+    <w:abstractNumId w:val="35"/>
+  </w:num>
+  <w:num w:numId="25" w16cid:durableId="1024211133">
+    <w:abstractNumId w:val="45"/>
+  </w:num>
+  <w:num w:numId="26" w16cid:durableId="1834494095">
+    <w:abstractNumId w:val="33"/>
+  </w:num>
+  <w:num w:numId="27" w16cid:durableId="1773548455">
+    <w:abstractNumId w:val="20"/>
+  </w:num>
+  <w:num w:numId="28" w16cid:durableId="2087878164">
+    <w:abstractNumId w:val="36"/>
+  </w:num>
+  <w:num w:numId="29" w16cid:durableId="1629168061">
+    <w:abstractNumId w:val="12"/>
+  </w:num>
+  <w:num w:numId="30" w16cid:durableId="2093311385">
+    <w:abstractNumId w:val="51"/>
+  </w:num>
+  <w:num w:numId="31" w16cid:durableId="1884711522">
+    <w:abstractNumId w:val="40"/>
+  </w:num>
+  <w:num w:numId="32" w16cid:durableId="1196046497">
+    <w:abstractNumId w:val="7"/>
+  </w:num>
+  <w:num w:numId="33" w16cid:durableId="1829054750">
     <w:abstractNumId w:val="15"/>
   </w:num>
-  <w:num w:numId="9" w16cid:durableId="849218406">
+  <w:num w:numId="34" w16cid:durableId="1861431455">
+    <w:abstractNumId w:val="11"/>
+  </w:num>
+  <w:num w:numId="35" w16cid:durableId="1977445129">
+    <w:abstractNumId w:val="2"/>
+  </w:num>
+  <w:num w:numId="36" w16cid:durableId="699747935">
     <w:abstractNumId w:val="18"/>
   </w:num>
-  <w:num w:numId="10" w16cid:durableId="2059817920">
-    <w:abstractNumId w:val="39"/>
+  <w:num w:numId="37" w16cid:durableId="1193299769">
+    <w:abstractNumId w:val="28"/>
   </w:num>
-  <w:num w:numId="11" w16cid:durableId="1458376617">
+  <w:num w:numId="38" w16cid:durableId="814759806">
+    <w:abstractNumId w:val="49"/>
+  </w:num>
+  <w:num w:numId="39" w16cid:durableId="868643701">
+    <w:abstractNumId w:val="8"/>
+  </w:num>
+  <w:num w:numId="40" w16cid:durableId="1727290300">
+    <w:abstractNumId w:val="27"/>
+  </w:num>
+  <w:num w:numId="41" w16cid:durableId="1825589490">
+    <w:abstractNumId w:val="30"/>
+  </w:num>
+  <w:num w:numId="42" w16cid:durableId="1877429457">
+    <w:abstractNumId w:val="5"/>
+  </w:num>
+  <w:num w:numId="43" w16cid:durableId="2068214803">
     <w:abstractNumId w:val="13"/>
   </w:num>
-  <w:num w:numId="12" w16cid:durableId="1746338999">
-    <w:abstractNumId w:val="43"/>
+  <w:num w:numId="44" w16cid:durableId="206574674">
+    <w:abstractNumId w:val="4"/>
   </w:num>
-  <w:num w:numId="13" w16cid:durableId="2051688984">
-    <w:abstractNumId w:val="20"/>
+  <w:num w:numId="45" w16cid:durableId="496729806">
+    <w:abstractNumId w:val="16"/>
   </w:num>
-  <w:num w:numId="14" w16cid:durableId="263999993">
-    <w:abstractNumId w:val="25"/>
-  </w:num>
-  <w:num w:numId="15" w16cid:durableId="1684285504">
-    <w:abstractNumId w:val="40"/>
-  </w:num>
-  <w:num w:numId="16" w16cid:durableId="1885755082">
+  <w:num w:numId="46" w16cid:durableId="157381413">
     <w:abstractNumId w:val="21"/>
   </w:num>
-  <w:num w:numId="17" w16cid:durableId="1362440721">
-    <w:abstractNumId w:val="19"/>
+  <w:num w:numId="47" w16cid:durableId="955452539">
+    <w:abstractNumId w:val="26"/>
   </w:num>
-  <w:num w:numId="18" w16cid:durableId="1348141909">
-    <w:abstractNumId w:val="42"/>
+  <w:num w:numId="48" w16cid:durableId="1436515940">
+    <w:abstractNumId w:val="1"/>
   </w:num>
-  <w:num w:numId="19" w16cid:durableId="616713830">
-    <w:abstractNumId w:val="7"/>
+  <w:num w:numId="49" w16cid:durableId="1282304960">
+    <w:abstractNumId w:val="14"/>
   </w:num>
-  <w:num w:numId="20" w16cid:durableId="1106655989">
-    <w:abstractNumId w:val="37"/>
+  <w:num w:numId="50" w16cid:durableId="918249685">
+    <w:abstractNumId w:val="48"/>
   </w:num>
-  <w:num w:numId="21" w16cid:durableId="306085412">
-    <w:abstractNumId w:val="30"/>
-  </w:num>
-  <w:num w:numId="22" w16cid:durableId="982926252">
-    <w:abstractNumId w:val="45"/>
-  </w:num>
-  <w:num w:numId="23" w16cid:durableId="2003728588">
-    <w:abstractNumId w:val="34"/>
-  </w:num>
-  <w:num w:numId="24" w16cid:durableId="760882046">
-    <w:abstractNumId w:val="31"/>
-  </w:num>
-  <w:num w:numId="25" w16cid:durableId="1024211133">
-    <w:abstractNumId w:val="41"/>
-  </w:num>
-  <w:num w:numId="26" w16cid:durableId="1834494095">
-    <w:abstractNumId w:val="29"/>
-  </w:num>
-  <w:num w:numId="27" w16cid:durableId="1773548455">
-    <w:abstractNumId w:val="16"/>
-  </w:num>
-  <w:num w:numId="28" w16cid:durableId="2087878164">
-    <w:abstractNumId w:val="32"/>
-  </w:num>
-  <w:num w:numId="29" w16cid:durableId="1629168061">
+  <w:num w:numId="51" w16cid:durableId="1330527074">
     <w:abstractNumId w:val="9"/>
   </w:num>
-  <w:num w:numId="30" w16cid:durableId="2093311385">
-    <w:abstractNumId w:val="46"/>
-  </w:num>
-  <w:num w:numId="31" w16cid:durableId="1884711522">
-    <w:abstractNumId w:val="36"/>
-  </w:num>
-  <w:num w:numId="32" w16cid:durableId="1196046497">
-    <w:abstractNumId w:val="5"/>
-  </w:num>
-  <w:num w:numId="33" w16cid:durableId="1829054750">
-    <w:abstractNumId w:val="11"/>
-  </w:num>
-  <w:num w:numId="34" w16cid:durableId="1861431455">
-    <w:abstractNumId w:val="8"/>
-  </w:num>
-  <w:num w:numId="35" w16cid:durableId="1977445129">
-    <w:abstractNumId w:val="1"/>
-  </w:num>
-  <w:num w:numId="36" w16cid:durableId="699747935">
-    <w:abstractNumId w:val="14"/>
-  </w:num>
-  <w:num w:numId="37" w16cid:durableId="1193299769">
-    <w:abstractNumId w:val="24"/>
-  </w:num>
-  <w:num w:numId="38" w16cid:durableId="814759806">
-    <w:abstractNumId w:val="44"/>
-  </w:num>
-  <w:num w:numId="39" w16cid:durableId="868643701">
-    <w:abstractNumId w:val="6"/>
-  </w:num>
-  <w:num w:numId="40" w16cid:durableId="1727290300">
-    <w:abstractNumId w:val="23"/>
-  </w:num>
-  <w:num w:numId="41" w16cid:durableId="1825589490">
-    <w:abstractNumId w:val="26"/>
-  </w:num>
-  <w:num w:numId="42" w16cid:durableId="1877429457">
+  <w:num w:numId="52" w16cid:durableId="473257072">
     <w:abstractNumId w:val="3"/>
-  </w:num>
-  <w:num w:numId="43" w16cid:durableId="2068214803">
-    <w:abstractNumId w:val="10"/>
-  </w:num>
-  <w:num w:numId="44" w16cid:durableId="206574674">
-    <w:abstractNumId w:val="2"/>
-  </w:num>
-  <w:num w:numId="45" w16cid:durableId="496729806">
-    <w:abstractNumId w:val="12"/>
-  </w:num>
-  <w:num w:numId="46" w16cid:durableId="157381413">
-    <w:abstractNumId w:val="17"/>
-  </w:num>
-  <w:num w:numId="47" w16cid:durableId="955452539">
-    <w:abstractNumId w:val="22"/>
   </w:num>
 </w:numbering>
 </file>
@@ -12306,7 +13234,6 @@
   <w:style w:type="character" w:default="1" w:styleId="Fontepargpadro">
     <w:name w:val="Default Paragraph Font"/>
     <w:uiPriority w:val="1"/>
-    <w:semiHidden/>
     <w:unhideWhenUsed/>
   </w:style>
   <w:style w:type="table" w:default="1" w:styleId="Tabelanormal">

</xml_diff>